<commit_message>
CLPT v11 report: PD demand/pool tables, chart and discussion continue to FY2040E as demand context; revenue/EBITDA forecast still ends FY2031E (David, 2026-10-26)
</commit_message>
<xml_diff>
--- a/forecasts/CLPT/report.docx
+++ b/forecasts/CLPT/report.docx
@@ -92,7 +92,7 @@
         <w:t>One-time Parkinson's cell/gene therapy procedures (the class, all on ClearPoint's platform) ramp over three years from the FY2029E launch to class demand: about 3,900 in FY2029E, 7,600 in FY2030E and 11,100 in FY2031E [S31][S62][S63][S64][C40] ★.</w:t>
       </w:r>
       <w:r>
-        <w:t xml:space="preserve"> We size demand for the whole class of one-time Parkinson's cell and gene therapies from published prevalence, label-style eligibility (levodopa-responsive, at least four years since diagnosis, motor complications, no dementia, fit for surgery) and a stock-and-flow pool (Appendix C) [A30][C42]. About 180,000 US patients are medically eligible in FY2026E, 16% of PD [C42]. DBS and one-time therapy are not treated as mutually exclusive: trials exclude patients who have had DBS, but that is an entry rule and we found no biological or safety reason for it, so these patients stay in the pool [S44][A41]–[A43] ★. About 3,990 eligible patients receive DBS each year, 2.2% of the pool [A10][C49]. We assume 6% of the pool a year would receive a one-time, potentially disease-modifying therapy from FY2029E, about 2.7 times the DBS rate. DBS continues alongside and is not deducted [S45] ★. Class demand is about 11,800 in the launch year and eases to about 11,100 in FY2031E as the backlog is drawn down [C40]. Volume reaches demand in FY2031E. The three-year ramp is David's judgment that it also gives time for other Parkinson's therapies to be approved [S64] ★. Running 11,100 Parkinson's procedures a year needs about 74 centres at 3 cases a week, far beyond the 20–30 centres management talks about, an aggressive judgment [S43][G7] ★. We treat all one-time PD cell/gene procedures as one class on ClearPoint's platform (100% share, David's view) [S62][S63] ★. The bull treats 8% of the pool a year on the same ramp, giving 14,300 procedures in FY2031E [S59][C46] ★. The bear excludes patients who have had DBS, as trials do (pool about 138,000), and is limited by a capacity ramp after a 2030 approval, reaching 2,500 procedures in FY2031E [S22][S43][C55]. AMT-130 is unchanged at 3,000 a year from FY2030E [S30].</w:t>
+        <w:t xml:space="preserve"> We size demand for the whole class of one-time Parkinson's cell and gene therapies from published prevalence, label-style eligibility (levodopa-responsive, at least four years since diagnosis, motor complications, no dementia, fit for surgery) and a stock-and-flow pool (Appendix C) [A30][C42]. About 180,000 US patients are medically eligible in FY2026E, 16% of PD [C42]. DBS and one-time therapy are not treated as mutually exclusive: trials exclude patients who have had DBS, but that is an entry rule and we found no biological or safety reason for it, so these patients stay in the pool [S44][A41]–[A43] ★. About 3,990 eligible patients receive DBS each year, 2.2% of the pool [A10][C49]. We assume 6% of the pool a year would receive a one-time, potentially disease-modifying therapy from FY2029E, about 2.7 times the DBS rate. DBS continues alongside and is not deducted [S45] ★. Class demand is about 11,800 in the launch year, eases to about 10,800 in FY2033E–35E as the backlog is drawn down, then rises with the pool to 11,500 in FY2040E [C40]; the post-FY2031E path is demand context only, as the valuation fades revenue growth from FY2032E [P3]. Volume reaches demand in FY2031E. The three-year ramp is David's judgment that it also gives time for other Parkinson's therapies to be approved [S64] ★. Running 11,100 Parkinson's procedures a year needs about 74 centres at 3 cases a week, far beyond the 20–30 centres management talks about, an aggressive judgment [S43][G7] ★. We treat all one-time PD cell/gene procedures as one class on ClearPoint's platform (100% share, David's view) [S62][S63] ★. The bull treats 8% of the pool a year on the same ramp, giving 14,300 procedures in FY2031E [S59][C46] ★. The bear excludes patients who have had DBS, as trials do (pool about 138,000), and is limited by a capacity ramp after a 2030 approval, reaching 2,500 procedures in FY2031E [S22][S43][C55]. AMT-130 is unchanged at 3,000 a year from FY2030E [S30].</w:t>
       </w:r>
     </w:p>
     <w:p>
@@ -2346,10 +2346,14 @@
         <w:tblLook w:firstColumn="1" w:firstRow="1" w:lastColumn="0" w:lastRow="0" w:noHBand="0" w:noVBand="1" w:val="04A0"/>
       </w:tblPr>
       <w:tblGrid>
-        <w:gridCol w:w="2635"/>
-        <w:gridCol w:w="2635"/>
-        <w:gridCol w:w="2635"/>
-        <w:gridCol w:w="2635"/>
+        <w:gridCol w:w="1317"/>
+        <w:gridCol w:w="1317"/>
+        <w:gridCol w:w="1317"/>
+        <w:gridCol w:w="1317"/>
+        <w:gridCol w:w="1317"/>
+        <w:gridCol w:w="1317"/>
+        <w:gridCol w:w="1317"/>
+        <w:gridCol w:w="1317"/>
       </w:tblGrid>
       <w:tr>
         <w:trPr>
@@ -2358,7 +2362,7 @@
         </w:trPr>
         <w:tc>
           <w:tcPr>
-            <w:tcW w:type="dxa" w:w="2635"/>
+            <w:tcW w:type="dxa" w:w="1317"/>
           </w:tcPr>
           <w:p>
             <w:pPr>
@@ -2376,7 +2380,7 @@
         </w:tc>
         <w:tc>
           <w:tcPr>
-            <w:tcW w:type="dxa" w:w="2635"/>
+            <w:tcW w:type="dxa" w:w="1317"/>
           </w:tcPr>
           <w:p>
             <w:pPr>
@@ -2394,7 +2398,7 @@
         </w:tc>
         <w:tc>
           <w:tcPr>
-            <w:tcW w:type="dxa" w:w="2635"/>
+            <w:tcW w:type="dxa" w:w="1317"/>
           </w:tcPr>
           <w:p>
             <w:pPr>
@@ -2412,7 +2416,7 @@
         </w:tc>
         <w:tc>
           <w:tcPr>
-            <w:tcW w:type="dxa" w:w="2635"/>
+            <w:tcW w:type="dxa" w:w="1317"/>
           </w:tcPr>
           <w:p>
             <w:pPr>
@@ -2425,6 +2429,78 @@
                 <w:sz w:val="16"/>
               </w:rPr>
               <w:t>FY2031E</w:t>
+            </w:r>
+          </w:p>
+        </w:tc>
+        <w:tc>
+          <w:tcPr>
+            <w:tcW w:type="dxa" w:w="1317"/>
+          </w:tcPr>
+          <w:p>
+            <w:pPr>
+              <w:keepNext/>
+              <w:keepLines/>
+            </w:pPr>
+            <w:r>
+              <w:rPr>
+                <w:b/>
+                <w:sz w:val="16"/>
+              </w:rPr>
+              <w:t>FY2032E</w:t>
+            </w:r>
+          </w:p>
+        </w:tc>
+        <w:tc>
+          <w:tcPr>
+            <w:tcW w:type="dxa" w:w="1317"/>
+          </w:tcPr>
+          <w:p>
+            <w:pPr>
+              <w:keepNext/>
+              <w:keepLines/>
+            </w:pPr>
+            <w:r>
+              <w:rPr>
+                <w:b/>
+                <w:sz w:val="16"/>
+              </w:rPr>
+              <w:t>FY2033E</w:t>
+            </w:r>
+          </w:p>
+        </w:tc>
+        <w:tc>
+          <w:tcPr>
+            <w:tcW w:type="dxa" w:w="1317"/>
+          </w:tcPr>
+          <w:p>
+            <w:pPr>
+              <w:keepNext/>
+              <w:keepLines/>
+            </w:pPr>
+            <w:r>
+              <w:rPr>
+                <w:b/>
+                <w:sz w:val="16"/>
+              </w:rPr>
+              <w:t>FY2035E</w:t>
+            </w:r>
+          </w:p>
+        </w:tc>
+        <w:tc>
+          <w:tcPr>
+            <w:tcW w:type="dxa" w:w="1317"/>
+          </w:tcPr>
+          <w:p>
+            <w:pPr>
+              <w:keepNext/>
+              <w:keepLines/>
+            </w:pPr>
+            <w:r>
+              <w:rPr>
+                <w:b/>
+                <w:sz w:val="16"/>
+              </w:rPr>
+              <w:t>FY2040E</w:t>
             </w:r>
           </w:p>
         </w:tc>
@@ -2435,7 +2511,7 @@
         </w:trPr>
         <w:tc>
           <w:tcPr>
-            <w:tcW w:type="dxa" w:w="2635"/>
+            <w:tcW w:type="dxa" w:w="1317"/>
           </w:tcPr>
           <w:p>
             <w:pPr>
@@ -2452,7 +2528,7 @@
         </w:tc>
         <w:tc>
           <w:tcPr>
-            <w:tcW w:type="dxa" w:w="2635"/>
+            <w:tcW w:type="dxa" w:w="1317"/>
           </w:tcPr>
           <w:p>
             <w:pPr>
@@ -2469,7 +2545,7 @@
         </w:tc>
         <w:tc>
           <w:tcPr>
-            <w:tcW w:type="dxa" w:w="2635"/>
+            <w:tcW w:type="dxa" w:w="1317"/>
           </w:tcPr>
           <w:p>
             <w:pPr>
@@ -2486,7 +2562,7 @@
         </w:tc>
         <w:tc>
           <w:tcPr>
-            <w:tcW w:type="dxa" w:w="2635"/>
+            <w:tcW w:type="dxa" w:w="1317"/>
           </w:tcPr>
           <w:p>
             <w:pPr>
@@ -2498,6 +2574,74 @@
                 <w:sz w:val="16"/>
               </w:rPr>
               <w:t>185,000</w:t>
+            </w:r>
+          </w:p>
+        </w:tc>
+        <w:tc>
+          <w:tcPr>
+            <w:tcW w:type="dxa" w:w="1317"/>
+          </w:tcPr>
+          <w:p>
+            <w:pPr>
+              <w:keepNext/>
+              <w:keepLines/>
+            </w:pPr>
+            <w:r>
+              <w:rPr>
+                <w:sz w:val="16"/>
+              </w:rPr>
+              <w:t>182,000</w:t>
+            </w:r>
+          </w:p>
+        </w:tc>
+        <w:tc>
+          <w:tcPr>
+            <w:tcW w:type="dxa" w:w="1317"/>
+          </w:tcPr>
+          <w:p>
+            <w:pPr>
+              <w:keepNext/>
+              <w:keepLines/>
+            </w:pPr>
+            <w:r>
+              <w:rPr>
+                <w:sz w:val="16"/>
+              </w:rPr>
+              <w:t>181,000</w:t>
+            </w:r>
+          </w:p>
+        </w:tc>
+        <w:tc>
+          <w:tcPr>
+            <w:tcW w:type="dxa" w:w="1317"/>
+          </w:tcPr>
+          <w:p>
+            <w:pPr>
+              <w:keepNext/>
+              <w:keepLines/>
+            </w:pPr>
+            <w:r>
+              <w:rPr>
+                <w:sz w:val="16"/>
+              </w:rPr>
+              <w:t>180,000</w:t>
+            </w:r>
+          </w:p>
+        </w:tc>
+        <w:tc>
+          <w:tcPr>
+            <w:tcW w:type="dxa" w:w="1317"/>
+          </w:tcPr>
+          <w:p>
+            <w:pPr>
+              <w:keepNext/>
+              <w:keepLines/>
+            </w:pPr>
+            <w:r>
+              <w:rPr>
+                <w:sz w:val="16"/>
+              </w:rPr>
+              <w:t>191,000</w:t>
             </w:r>
           </w:p>
         </w:tc>
@@ -2508,7 +2652,7 @@
         </w:trPr>
         <w:tc>
           <w:tcPr>
-            <w:tcW w:type="dxa" w:w="2635"/>
+            <w:tcW w:type="dxa" w:w="1317"/>
           </w:tcPr>
           <w:p>
             <w:pPr>
@@ -2526,7 +2670,7 @@
         </w:tc>
         <w:tc>
           <w:tcPr>
-            <w:tcW w:type="dxa" w:w="2635"/>
+            <w:tcW w:type="dxa" w:w="1317"/>
           </w:tcPr>
           <w:p>
             <w:pPr>
@@ -2544,7 +2688,7 @@
         </w:tc>
         <w:tc>
           <w:tcPr>
-            <w:tcW w:type="dxa" w:w="2635"/>
+            <w:tcW w:type="dxa" w:w="1317"/>
           </w:tcPr>
           <w:p>
             <w:pPr>
@@ -2562,7 +2706,7 @@
         </w:tc>
         <w:tc>
           <w:tcPr>
-            <w:tcW w:type="dxa" w:w="2635"/>
+            <w:tcW w:type="dxa" w:w="1317"/>
           </w:tcPr>
           <w:p>
             <w:pPr>
@@ -2575,6 +2719,78 @@
                 <w:sz w:val="16"/>
               </w:rPr>
               <w:t>11,126</w:t>
+            </w:r>
+          </w:p>
+        </w:tc>
+        <w:tc>
+          <w:tcPr>
+            <w:tcW w:type="dxa" w:w="1317"/>
+          </w:tcPr>
+          <w:p>
+            <w:pPr>
+              <w:keepNext/>
+              <w:keepLines/>
+            </w:pPr>
+            <w:r>
+              <w:rPr>
+                <w:b/>
+                <w:sz w:val="16"/>
+              </w:rPr>
+              <w:t>10,945</w:t>
+            </w:r>
+          </w:p>
+        </w:tc>
+        <w:tc>
+          <w:tcPr>
+            <w:tcW w:type="dxa" w:w="1317"/>
+          </w:tcPr>
+          <w:p>
+            <w:pPr>
+              <w:keepNext/>
+              <w:keepLines/>
+            </w:pPr>
+            <w:r>
+              <w:rPr>
+                <w:b/>
+                <w:sz w:val="16"/>
+              </w:rPr>
+              <w:t>10,837</w:t>
+            </w:r>
+          </w:p>
+        </w:tc>
+        <w:tc>
+          <w:tcPr>
+            <w:tcW w:type="dxa" w:w="1317"/>
+          </w:tcPr>
+          <w:p>
+            <w:pPr>
+              <w:keepNext/>
+              <w:keepLines/>
+            </w:pPr>
+            <w:r>
+              <w:rPr>
+                <w:b/>
+                <w:sz w:val="16"/>
+              </w:rPr>
+              <w:t>10,801</w:t>
+            </w:r>
+          </w:p>
+        </w:tc>
+        <w:tc>
+          <w:tcPr>
+            <w:tcW w:type="dxa" w:w="1317"/>
+          </w:tcPr>
+          <w:p>
+            <w:pPr>
+              <w:keepNext/>
+              <w:keepLines/>
+            </w:pPr>
+            <w:r>
+              <w:rPr>
+                <w:b/>
+                <w:sz w:val="16"/>
+              </w:rPr>
+              <w:t>11,454</w:t>
             </w:r>
           </w:p>
         </w:tc>
@@ -2585,7 +2801,7 @@
         </w:trPr>
         <w:tc>
           <w:tcPr>
-            <w:tcW w:type="dxa" w:w="2635"/>
+            <w:tcW w:type="dxa" w:w="1317"/>
           </w:tcPr>
           <w:p>
             <w:pPr>
@@ -2602,7 +2818,7 @@
         </w:tc>
         <w:tc>
           <w:tcPr>
-            <w:tcW w:type="dxa" w:w="2635"/>
+            <w:tcW w:type="dxa" w:w="1317"/>
           </w:tcPr>
           <w:p>
             <w:pPr>
@@ -2619,7 +2835,7 @@
         </w:tc>
         <w:tc>
           <w:tcPr>
-            <w:tcW w:type="dxa" w:w="2635"/>
+            <w:tcW w:type="dxa" w:w="1317"/>
           </w:tcPr>
           <w:p>
             <w:pPr>
@@ -2636,7 +2852,75 @@
         </w:tc>
         <w:tc>
           <w:tcPr>
-            <w:tcW w:type="dxa" w:w="2635"/>
+            <w:tcW w:type="dxa" w:w="1317"/>
+          </w:tcPr>
+          <w:p>
+            <w:pPr>
+              <w:keepNext/>
+              <w:keepLines/>
+            </w:pPr>
+            <w:r>
+              <w:rPr>
+                <w:sz w:val="16"/>
+              </w:rPr>
+              <w:t>3,990</w:t>
+            </w:r>
+          </w:p>
+        </w:tc>
+        <w:tc>
+          <w:tcPr>
+            <w:tcW w:type="dxa" w:w="1317"/>
+          </w:tcPr>
+          <w:p>
+            <w:pPr>
+              <w:keepNext/>
+              <w:keepLines/>
+            </w:pPr>
+            <w:r>
+              <w:rPr>
+                <w:sz w:val="16"/>
+              </w:rPr>
+              <w:t>3,990</w:t>
+            </w:r>
+          </w:p>
+        </w:tc>
+        <w:tc>
+          <w:tcPr>
+            <w:tcW w:type="dxa" w:w="1317"/>
+          </w:tcPr>
+          <w:p>
+            <w:pPr>
+              <w:keepNext/>
+              <w:keepLines/>
+            </w:pPr>
+            <w:r>
+              <w:rPr>
+                <w:sz w:val="16"/>
+              </w:rPr>
+              <w:t>3,990</w:t>
+            </w:r>
+          </w:p>
+        </w:tc>
+        <w:tc>
+          <w:tcPr>
+            <w:tcW w:type="dxa" w:w="1317"/>
+          </w:tcPr>
+          <w:p>
+            <w:pPr>
+              <w:keepNext/>
+              <w:keepLines/>
+            </w:pPr>
+            <w:r>
+              <w:rPr>
+                <w:sz w:val="16"/>
+              </w:rPr>
+              <w:t>3,990</w:t>
+            </w:r>
+          </w:p>
+        </w:tc>
+        <w:tc>
+          <w:tcPr>
+            <w:tcW w:type="dxa" w:w="1317"/>
           </w:tcPr>
           <w:p>
             <w:pPr>
@@ -2658,7 +2942,7 @@
         </w:trPr>
         <w:tc>
           <w:tcPr>
-            <w:tcW w:type="dxa" w:w="2635"/>
+            <w:tcW w:type="dxa" w:w="1317"/>
           </w:tcPr>
           <w:p>
             <w:pPr>
@@ -2675,7 +2959,7 @@
         </w:tc>
         <w:tc>
           <w:tcPr>
-            <w:tcW w:type="dxa" w:w="2635"/>
+            <w:tcW w:type="dxa" w:w="1317"/>
           </w:tcPr>
           <w:p>
             <w:pPr>
@@ -2692,7 +2976,7 @@
         </w:tc>
         <w:tc>
           <w:tcPr>
-            <w:tcW w:type="dxa" w:w="2635"/>
+            <w:tcW w:type="dxa" w:w="1317"/>
           </w:tcPr>
           <w:p>
             <w:pPr>
@@ -2709,7 +2993,75 @@
         </w:tc>
         <w:tc>
           <w:tcPr>
-            <w:tcW w:type="dxa" w:w="2635"/>
+            <w:tcW w:type="dxa" w:w="1317"/>
+          </w:tcPr>
+          <w:p>
+            <w:pPr>
+              <w:keepNext/>
+              <w:keepLines/>
+            </w:pPr>
+            <w:r>
+              <w:rPr>
+                <w:sz w:val="16"/>
+              </w:rPr>
+              <w:t>100%</w:t>
+            </w:r>
+          </w:p>
+        </w:tc>
+        <w:tc>
+          <w:tcPr>
+            <w:tcW w:type="dxa" w:w="1317"/>
+          </w:tcPr>
+          <w:p>
+            <w:pPr>
+              <w:keepNext/>
+              <w:keepLines/>
+            </w:pPr>
+            <w:r>
+              <w:rPr>
+                <w:sz w:val="16"/>
+              </w:rPr>
+              <w:t>100%</w:t>
+            </w:r>
+          </w:p>
+        </w:tc>
+        <w:tc>
+          <w:tcPr>
+            <w:tcW w:type="dxa" w:w="1317"/>
+          </w:tcPr>
+          <w:p>
+            <w:pPr>
+              <w:keepNext/>
+              <w:keepLines/>
+            </w:pPr>
+            <w:r>
+              <w:rPr>
+                <w:sz w:val="16"/>
+              </w:rPr>
+              <w:t>100%</w:t>
+            </w:r>
+          </w:p>
+        </w:tc>
+        <w:tc>
+          <w:tcPr>
+            <w:tcW w:type="dxa" w:w="1317"/>
+          </w:tcPr>
+          <w:p>
+            <w:pPr>
+              <w:keepNext/>
+              <w:keepLines/>
+            </w:pPr>
+            <w:r>
+              <w:rPr>
+                <w:sz w:val="16"/>
+              </w:rPr>
+              <w:t>100%</w:t>
+            </w:r>
+          </w:p>
+        </w:tc>
+        <w:tc>
+          <w:tcPr>
+            <w:tcW w:type="dxa" w:w="1317"/>
           </w:tcPr>
           <w:p>
             <w:pPr>
@@ -2731,7 +3083,7 @@
         </w:trPr>
         <w:tc>
           <w:tcPr>
-            <w:tcW w:type="dxa" w:w="2635"/>
+            <w:tcW w:type="dxa" w:w="1317"/>
           </w:tcPr>
           <w:p>
             <w:pPr>
@@ -2748,7 +3100,7 @@
         </w:tc>
         <w:tc>
           <w:tcPr>
-            <w:tcW w:type="dxa" w:w="2635"/>
+            <w:tcW w:type="dxa" w:w="1317"/>
           </w:tcPr>
           <w:p>
             <w:pPr>
@@ -2765,7 +3117,7 @@
         </w:tc>
         <w:tc>
           <w:tcPr>
-            <w:tcW w:type="dxa" w:w="2635"/>
+            <w:tcW w:type="dxa" w:w="1317"/>
           </w:tcPr>
           <w:p>
             <w:pPr>
@@ -2782,7 +3134,7 @@
         </w:tc>
         <w:tc>
           <w:tcPr>
-            <w:tcW w:type="dxa" w:w="2635"/>
+            <w:tcW w:type="dxa" w:w="1317"/>
           </w:tcPr>
           <w:p>
             <w:pPr>
@@ -2794,6 +3146,74 @@
                 <w:sz w:val="16"/>
               </w:rPr>
               <w:t>11,126</w:t>
+            </w:r>
+          </w:p>
+        </w:tc>
+        <w:tc>
+          <w:tcPr>
+            <w:tcW w:type="dxa" w:w="1317"/>
+          </w:tcPr>
+          <w:p>
+            <w:pPr>
+              <w:keepNext/>
+              <w:keepLines/>
+            </w:pPr>
+            <w:r>
+              <w:rPr>
+                <w:sz w:val="16"/>
+              </w:rPr>
+              <w:t>10,945</w:t>
+            </w:r>
+          </w:p>
+        </w:tc>
+        <w:tc>
+          <w:tcPr>
+            <w:tcW w:type="dxa" w:w="1317"/>
+          </w:tcPr>
+          <w:p>
+            <w:pPr>
+              <w:keepNext/>
+              <w:keepLines/>
+            </w:pPr>
+            <w:r>
+              <w:rPr>
+                <w:sz w:val="16"/>
+              </w:rPr>
+              <w:t>10,837</w:t>
+            </w:r>
+          </w:p>
+        </w:tc>
+        <w:tc>
+          <w:tcPr>
+            <w:tcW w:type="dxa" w:w="1317"/>
+          </w:tcPr>
+          <w:p>
+            <w:pPr>
+              <w:keepNext/>
+              <w:keepLines/>
+            </w:pPr>
+            <w:r>
+              <w:rPr>
+                <w:sz w:val="16"/>
+              </w:rPr>
+              <w:t>10,801</w:t>
+            </w:r>
+          </w:p>
+        </w:tc>
+        <w:tc>
+          <w:tcPr>
+            <w:tcW w:type="dxa" w:w="1317"/>
+          </w:tcPr>
+          <w:p>
+            <w:pPr>
+              <w:keepNext/>
+              <w:keepLines/>
+            </w:pPr>
+            <w:r>
+              <w:rPr>
+                <w:sz w:val="16"/>
+              </w:rPr>
+              <w:t>11,454</w:t>
             </w:r>
           </w:p>
         </w:tc>
@@ -2804,7 +3224,7 @@
         </w:trPr>
         <w:tc>
           <w:tcPr>
-            <w:tcW w:type="dxa" w:w="2635"/>
+            <w:tcW w:type="dxa" w:w="1317"/>
           </w:tcPr>
           <w:p>
             <w:r>
@@ -2817,7 +3237,7 @@
         </w:tc>
         <w:tc>
           <w:tcPr>
-            <w:tcW w:type="dxa" w:w="2635"/>
+            <w:tcW w:type="dxa" w:w="1317"/>
           </w:tcPr>
           <w:p>
             <w:r>
@@ -2830,7 +3250,7 @@
         </w:tc>
         <w:tc>
           <w:tcPr>
-            <w:tcW w:type="dxa" w:w="2635"/>
+            <w:tcW w:type="dxa" w:w="1317"/>
           </w:tcPr>
           <w:p>
             <w:r>
@@ -2843,7 +3263,7 @@
         </w:tc>
         <w:tc>
           <w:tcPr>
-            <w:tcW w:type="dxa" w:w="2635"/>
+            <w:tcW w:type="dxa" w:w="1317"/>
           </w:tcPr>
           <w:p>
             <w:r>
@@ -2851,6 +3271,58 @@
                 <w:sz w:val="16"/>
               </w:rPr>
               <w:t>74</w:t>
+            </w:r>
+          </w:p>
+        </w:tc>
+        <w:tc>
+          <w:tcPr>
+            <w:tcW w:type="dxa" w:w="1317"/>
+          </w:tcPr>
+          <w:p>
+            <w:r>
+              <w:rPr>
+                <w:sz w:val="16"/>
+              </w:rPr>
+              <w:t>73</w:t>
+            </w:r>
+          </w:p>
+        </w:tc>
+        <w:tc>
+          <w:tcPr>
+            <w:tcW w:type="dxa" w:w="1317"/>
+          </w:tcPr>
+          <w:p>
+            <w:r>
+              <w:rPr>
+                <w:sz w:val="16"/>
+              </w:rPr>
+              <w:t>72</w:t>
+            </w:r>
+          </w:p>
+        </w:tc>
+        <w:tc>
+          <w:tcPr>
+            <w:tcW w:type="dxa" w:w="1317"/>
+          </w:tcPr>
+          <w:p>
+            <w:r>
+              <w:rPr>
+                <w:sz w:val="16"/>
+              </w:rPr>
+              <w:t>72</w:t>
+            </w:r>
+          </w:p>
+        </w:tc>
+        <w:tc>
+          <w:tcPr>
+            <w:tcW w:type="dxa" w:w="1317"/>
+          </w:tcPr>
+          <w:p>
+            <w:r>
+              <w:rPr>
+                <w:sz w:val="16"/>
+              </w:rPr>
+              <w:t>76</w:t>
             </w:r>
           </w:p>
         </w:tc>
@@ -2862,7 +3334,7 @@
         <w:rPr>
           <w:i/>
         </w:rPr>
-        <w:t>Source: A10, A30–A35, A39, S31, S43–S45, S62–S64, C40, C42, C45; Appendix C. The explicit forecast ends at FY2031E; Finagle extends revenue after FY2031E by its growth fade (Section 7), not by this path. Pool rounded to the nearest thousand. Centres derived.</w:t>
+        <w:t>Source: A10, A30–A35, A39, S31, S43–S45, S62–S64, C40, C42, C45; Appendix C. FY2032E–FY2040E columns are demand and pool context only: the revenue forecast ends at FY2031E, and Finagle extends revenue after FY2031E by its growth fade (Section 7), not by this path. Pool rounded to the nearest thousand. Centres derived.</w:t>
       </w:r>
     </w:p>
     <w:p>
@@ -2873,7 +3345,7 @@
         <w:t>What this implies.</w:t>
       </w:r>
       <w:r>
-        <w:t xml:space="preserve"> In the base, demand, not capacity, sets volume from FY2031E. Class demand peaks in the launch year, because 6% is applied to a pool that has grown untouched to FY2028E. It then eases as that backlog is drawn down, to 11,126 in FY2031E (derived) [C40]. Under the three-year ramp the launch-year peak is never reached in volume: FY2029E–30E volume is below demand, and from FY2031E volume equals demand. David's reason for three years is that this also gives time for other Parkinson's therapies to be approved [S64] ★. That rationale is a judgment, not a timeline match: bemdaneprocel launches in FY2029E, but the other quantified Parkinson's therapies are not expected until after FY2031E, in 2033–34 (Appendix D), after the ramp has ended. For FY2031E the model therefore has the first product, or the platform generally, meeting all class demand. Because the line is the whole class, no product split is needed (Appendix D shows an illustrative split). </w:t>
+        <w:t xml:space="preserve"> In the base, demand, not capacity, sets volume from FY2031E. Class demand peaks in the launch year, because 6% is applied to a pool that has grown untouched to FY2028E. It then eases by about 8% to FY2034E as that backlog is drawn down, and grows again with prevalence, about 0.8% a year over FY2033E–40E (derived; demand context) [C40]. Under the three-year ramp the launch-year peak is never reached in volume: FY2029E–30E volume is below demand, and from FY2031E volume equals demand. David's reason for three years is that this also gives time for other Parkinson's therapies to be approved [S64] ★. That rationale is a judgment, not a timeline match: bemdaneprocel launches in FY2029E, but the other quantified Parkinson's therapies are not expected until after FY2031E, in 2033–34 (Appendix D), after the ramp has ended. For FY2031E the model therefore has the first product, or the platform generally, meeting all class demand. Because the line is the whole class, no product split is needed (Appendix D shows an illustrative split). </w:t>
       </w:r>
       <w:r>
         <w:rPr>
@@ -2882,7 +3354,7 @@
         <w:t>Bull and bear.</w:t>
       </w:r>
       <w:r>
-        <w:t xml:space="preserve"> The bull keeps the base pool and the three-year ramp and raises the share treated to 8% a year [S59] ★ (Figure 4c). The bear applies the trial-style exclusion: patients who have had DBS (about 42,000, i.e. 3,990 a year ÷ the 0.095 leave rate) are removed, leaving about 138,000, and 6% of that gives class demand of about 8,500 in FY2031E [C55]. Approval slips to 2030, and a capacity ramp gives 330 procedures in FY2030E and 2,500 in FY2031E, below demand in both years [S22][S43].</w:t>
+        <w:t xml:space="preserve"> The bull keeps the base pool and the three-year ramp and raises the share treated to 8% a year [S59] ★ (Figure 4c). The bear applies the trial-style exclusion: patients who have had DBS (about 42,000, i.e. 3,990 a year ÷ the 0.095 leave rate) are removed, leaving about 138,000, and 6% of that gives class demand of about 8,500 in FY2031E and about 8,400 in FY2032E (demand context) [C55]. Approval slips to 2030, and a capacity ramp gives 330 procedures in FY2030E and 2,500 in FY2031E, below demand in both years [S22][S43].</w:t>
       </w:r>
     </w:p>
     <w:p>
@@ -2904,10 +3376,14 @@
         <w:tblLook w:firstColumn="1" w:firstRow="1" w:lastColumn="0" w:lastRow="0" w:noHBand="0" w:noVBand="1" w:val="04A0"/>
       </w:tblPr>
       <w:tblGrid>
-        <w:gridCol w:w="2635"/>
-        <w:gridCol w:w="2635"/>
-        <w:gridCol w:w="2635"/>
-        <w:gridCol w:w="2635"/>
+        <w:gridCol w:w="1317"/>
+        <w:gridCol w:w="1317"/>
+        <w:gridCol w:w="1317"/>
+        <w:gridCol w:w="1317"/>
+        <w:gridCol w:w="1317"/>
+        <w:gridCol w:w="1317"/>
+        <w:gridCol w:w="1317"/>
+        <w:gridCol w:w="1317"/>
       </w:tblGrid>
       <w:tr>
         <w:trPr>
@@ -2916,7 +3392,7 @@
         </w:trPr>
         <w:tc>
           <w:tcPr>
-            <w:tcW w:type="dxa" w:w="2635"/>
+            <w:tcW w:type="dxa" w:w="1317"/>
           </w:tcPr>
           <w:p>
             <w:pPr>
@@ -2934,7 +3410,7 @@
         </w:tc>
         <w:tc>
           <w:tcPr>
-            <w:tcW w:type="dxa" w:w="2635"/>
+            <w:tcW w:type="dxa" w:w="1317"/>
           </w:tcPr>
           <w:p>
             <w:pPr>
@@ -2952,7 +3428,7 @@
         </w:tc>
         <w:tc>
           <w:tcPr>
-            <w:tcW w:type="dxa" w:w="2635"/>
+            <w:tcW w:type="dxa" w:w="1317"/>
           </w:tcPr>
           <w:p>
             <w:pPr>
@@ -2970,7 +3446,7 @@
         </w:tc>
         <w:tc>
           <w:tcPr>
-            <w:tcW w:type="dxa" w:w="2635"/>
+            <w:tcW w:type="dxa" w:w="1317"/>
           </w:tcPr>
           <w:p>
             <w:pPr>
@@ -2983,6 +3459,78 @@
                 <w:sz w:val="16"/>
               </w:rPr>
               <w:t>FY2031E</w:t>
+            </w:r>
+          </w:p>
+        </w:tc>
+        <w:tc>
+          <w:tcPr>
+            <w:tcW w:type="dxa" w:w="1317"/>
+          </w:tcPr>
+          <w:p>
+            <w:pPr>
+              <w:keepNext/>
+              <w:keepLines/>
+            </w:pPr>
+            <w:r>
+              <w:rPr>
+                <w:b/>
+                <w:sz w:val="16"/>
+              </w:rPr>
+              <w:t>FY2032E</w:t>
+            </w:r>
+          </w:p>
+        </w:tc>
+        <w:tc>
+          <w:tcPr>
+            <w:tcW w:type="dxa" w:w="1317"/>
+          </w:tcPr>
+          <w:p>
+            <w:pPr>
+              <w:keepNext/>
+              <w:keepLines/>
+            </w:pPr>
+            <w:r>
+              <w:rPr>
+                <w:b/>
+                <w:sz w:val="16"/>
+              </w:rPr>
+              <w:t>FY2033E</w:t>
+            </w:r>
+          </w:p>
+        </w:tc>
+        <w:tc>
+          <w:tcPr>
+            <w:tcW w:type="dxa" w:w="1317"/>
+          </w:tcPr>
+          <w:p>
+            <w:pPr>
+              <w:keepNext/>
+              <w:keepLines/>
+            </w:pPr>
+            <w:r>
+              <w:rPr>
+                <w:b/>
+                <w:sz w:val="16"/>
+              </w:rPr>
+              <w:t>FY2035E</w:t>
+            </w:r>
+          </w:p>
+        </w:tc>
+        <w:tc>
+          <w:tcPr>
+            <w:tcW w:type="dxa" w:w="1317"/>
+          </w:tcPr>
+          <w:p>
+            <w:pPr>
+              <w:keepNext/>
+              <w:keepLines/>
+            </w:pPr>
+            <w:r>
+              <w:rPr>
+                <w:b/>
+                <w:sz w:val="16"/>
+              </w:rPr>
+              <w:t>FY2040E</w:t>
             </w:r>
           </w:p>
         </w:tc>
@@ -2993,7 +3541,7 @@
         </w:trPr>
         <w:tc>
           <w:tcPr>
-            <w:tcW w:type="dxa" w:w="2635"/>
+            <w:tcW w:type="dxa" w:w="1317"/>
           </w:tcPr>
           <w:p>
             <w:pPr>
@@ -3010,7 +3558,7 @@
         </w:tc>
         <w:tc>
           <w:tcPr>
-            <w:tcW w:type="dxa" w:w="2635"/>
+            <w:tcW w:type="dxa" w:w="1317"/>
           </w:tcPr>
           <w:p>
             <w:pPr>
@@ -3027,7 +3575,7 @@
         </w:tc>
         <w:tc>
           <w:tcPr>
-            <w:tcW w:type="dxa" w:w="2635"/>
+            <w:tcW w:type="dxa" w:w="1317"/>
           </w:tcPr>
           <w:p>
             <w:pPr>
@@ -3044,7 +3592,7 @@
         </w:tc>
         <w:tc>
           <w:tcPr>
-            <w:tcW w:type="dxa" w:w="2635"/>
+            <w:tcW w:type="dxa" w:w="1317"/>
           </w:tcPr>
           <w:p>
             <w:pPr>
@@ -3056,6 +3604,74 @@
                 <w:sz w:val="16"/>
               </w:rPr>
               <w:t>178,000</w:t>
+            </w:r>
+          </w:p>
+        </w:tc>
+        <w:tc>
+          <w:tcPr>
+            <w:tcW w:type="dxa" w:w="1317"/>
+          </w:tcPr>
+          <w:p>
+            <w:pPr>
+              <w:keepNext/>
+              <w:keepLines/>
+            </w:pPr>
+            <w:r>
+              <w:rPr>
+                <w:sz w:val="16"/>
+              </w:rPr>
+              <w:t>173,000</w:t>
+            </w:r>
+          </w:p>
+        </w:tc>
+        <w:tc>
+          <w:tcPr>
+            <w:tcW w:type="dxa" w:w="1317"/>
+          </w:tcPr>
+          <w:p>
+            <w:pPr>
+              <w:keepNext/>
+              <w:keepLines/>
+            </w:pPr>
+            <w:r>
+              <w:rPr>
+                <w:sz w:val="16"/>
+              </w:rPr>
+              <w:t>169,000</w:t>
+            </w:r>
+          </w:p>
+        </w:tc>
+        <w:tc>
+          <w:tcPr>
+            <w:tcW w:type="dxa" w:w="1317"/>
+          </w:tcPr>
+          <w:p>
+            <w:pPr>
+              <w:keepNext/>
+              <w:keepLines/>
+            </w:pPr>
+            <w:r>
+              <w:rPr>
+                <w:sz w:val="16"/>
+              </w:rPr>
+              <w:t>166,000</w:t>
+            </w:r>
+          </w:p>
+        </w:tc>
+        <w:tc>
+          <w:tcPr>
+            <w:tcW w:type="dxa" w:w="1317"/>
+          </w:tcPr>
+          <w:p>
+            <w:pPr>
+              <w:keepNext/>
+              <w:keepLines/>
+            </w:pPr>
+            <w:r>
+              <w:rPr>
+                <w:sz w:val="16"/>
+              </w:rPr>
+              <w:t>172,000</w:t>
             </w:r>
           </w:p>
         </w:tc>
@@ -3066,7 +3682,7 @@
         </w:trPr>
         <w:tc>
           <w:tcPr>
-            <w:tcW w:type="dxa" w:w="2635"/>
+            <w:tcW w:type="dxa" w:w="1317"/>
           </w:tcPr>
           <w:p>
             <w:pPr>
@@ -3084,7 +3700,7 @@
         </w:tc>
         <w:tc>
           <w:tcPr>
-            <w:tcW w:type="dxa" w:w="2635"/>
+            <w:tcW w:type="dxa" w:w="1317"/>
           </w:tcPr>
           <w:p>
             <w:pPr>
@@ -3102,7 +3718,7 @@
         </w:tc>
         <w:tc>
           <w:tcPr>
-            <w:tcW w:type="dxa" w:w="2635"/>
+            <w:tcW w:type="dxa" w:w="1317"/>
           </w:tcPr>
           <w:p>
             <w:pPr>
@@ -3120,7 +3736,7 @@
         </w:tc>
         <w:tc>
           <w:tcPr>
-            <w:tcW w:type="dxa" w:w="2635"/>
+            <w:tcW w:type="dxa" w:w="1317"/>
           </w:tcPr>
           <w:p>
             <w:pPr>
@@ -3133,6 +3749,78 @@
                 <w:sz w:val="16"/>
               </w:rPr>
               <w:t>14,272</w:t>
+            </w:r>
+          </w:p>
+        </w:tc>
+        <w:tc>
+          <w:tcPr>
+            <w:tcW w:type="dxa" w:w="1317"/>
+          </w:tcPr>
+          <w:p>
+            <w:pPr>
+              <w:keepNext/>
+              <w:keepLines/>
+            </w:pPr>
+            <w:r>
+              <w:rPr>
+                <w:b/>
+                <w:sz w:val="16"/>
+              </w:rPr>
+              <w:t>13,833</w:t>
+            </w:r>
+          </w:p>
+        </w:tc>
+        <w:tc>
+          <w:tcPr>
+            <w:tcW w:type="dxa" w:w="1317"/>
+          </w:tcPr>
+          <w:p>
+            <w:pPr>
+              <w:keepNext/>
+              <w:keepLines/>
+            </w:pPr>
+            <w:r>
+              <w:rPr>
+                <w:b/>
+                <w:sz w:val="16"/>
+              </w:rPr>
+              <w:t>13,530</w:t>
+            </w:r>
+          </w:p>
+        </w:tc>
+        <w:tc>
+          <w:tcPr>
+            <w:tcW w:type="dxa" w:w="1317"/>
+          </w:tcPr>
+          <w:p>
+            <w:pPr>
+              <w:keepNext/>
+              <w:keepLines/>
+            </w:pPr>
+            <w:r>
+              <w:rPr>
+                <w:b/>
+                <w:sz w:val="16"/>
+              </w:rPr>
+              <w:t>13,250</w:t>
+            </w:r>
+          </w:p>
+        </w:tc>
+        <w:tc>
+          <w:tcPr>
+            <w:tcW w:type="dxa" w:w="1317"/>
+          </w:tcPr>
+          <w:p>
+            <w:pPr>
+              <w:keepNext/>
+              <w:keepLines/>
+            </w:pPr>
+            <w:r>
+              <w:rPr>
+                <w:b/>
+                <w:sz w:val="16"/>
+              </w:rPr>
+              <w:t>13,792</w:t>
             </w:r>
           </w:p>
         </w:tc>
@@ -3143,7 +3831,7 @@
         </w:trPr>
         <w:tc>
           <w:tcPr>
-            <w:tcW w:type="dxa" w:w="2635"/>
+            <w:tcW w:type="dxa" w:w="1317"/>
           </w:tcPr>
           <w:p>
             <w:pPr>
@@ -3160,7 +3848,7 @@
         </w:tc>
         <w:tc>
           <w:tcPr>
-            <w:tcW w:type="dxa" w:w="2635"/>
+            <w:tcW w:type="dxa" w:w="1317"/>
           </w:tcPr>
           <w:p>
             <w:pPr>
@@ -3177,7 +3865,7 @@
         </w:tc>
         <w:tc>
           <w:tcPr>
-            <w:tcW w:type="dxa" w:w="2635"/>
+            <w:tcW w:type="dxa" w:w="1317"/>
           </w:tcPr>
           <w:p>
             <w:pPr>
@@ -3194,7 +3882,7 @@
         </w:tc>
         <w:tc>
           <w:tcPr>
-            <w:tcW w:type="dxa" w:w="2635"/>
+            <w:tcW w:type="dxa" w:w="1317"/>
           </w:tcPr>
           <w:p>
             <w:pPr>
@@ -3206,6 +3894,74 @@
                 <w:sz w:val="16"/>
               </w:rPr>
               <w:t>14,272</w:t>
+            </w:r>
+          </w:p>
+        </w:tc>
+        <w:tc>
+          <w:tcPr>
+            <w:tcW w:type="dxa" w:w="1317"/>
+          </w:tcPr>
+          <w:p>
+            <w:pPr>
+              <w:keepNext/>
+              <w:keepLines/>
+            </w:pPr>
+            <w:r>
+              <w:rPr>
+                <w:sz w:val="16"/>
+              </w:rPr>
+              <w:t>13,833</w:t>
+            </w:r>
+          </w:p>
+        </w:tc>
+        <w:tc>
+          <w:tcPr>
+            <w:tcW w:type="dxa" w:w="1317"/>
+          </w:tcPr>
+          <w:p>
+            <w:pPr>
+              <w:keepNext/>
+              <w:keepLines/>
+            </w:pPr>
+            <w:r>
+              <w:rPr>
+                <w:sz w:val="16"/>
+              </w:rPr>
+              <w:t>13,530</w:t>
+            </w:r>
+          </w:p>
+        </w:tc>
+        <w:tc>
+          <w:tcPr>
+            <w:tcW w:type="dxa" w:w="1317"/>
+          </w:tcPr>
+          <w:p>
+            <w:pPr>
+              <w:keepNext/>
+              <w:keepLines/>
+            </w:pPr>
+            <w:r>
+              <w:rPr>
+                <w:sz w:val="16"/>
+              </w:rPr>
+              <w:t>13,250</w:t>
+            </w:r>
+          </w:p>
+        </w:tc>
+        <w:tc>
+          <w:tcPr>
+            <w:tcW w:type="dxa" w:w="1317"/>
+          </w:tcPr>
+          <w:p>
+            <w:pPr>
+              <w:keepNext/>
+              <w:keepLines/>
+            </w:pPr>
+            <w:r>
+              <w:rPr>
+                <w:sz w:val="16"/>
+              </w:rPr>
+              <w:t>13,792</w:t>
             </w:r>
           </w:p>
         </w:tc>
@@ -3216,7 +3972,7 @@
         </w:trPr>
         <w:tc>
           <w:tcPr>
-            <w:tcW w:type="dxa" w:w="2635"/>
+            <w:tcW w:type="dxa" w:w="1317"/>
           </w:tcPr>
           <w:p>
             <w:pPr>
@@ -3233,7 +3989,7 @@
         </w:tc>
         <w:tc>
           <w:tcPr>
-            <w:tcW w:type="dxa" w:w="2635"/>
+            <w:tcW w:type="dxa" w:w="1317"/>
           </w:tcPr>
           <w:p>
             <w:pPr>
@@ -3250,7 +4006,7 @@
         </w:tc>
         <w:tc>
           <w:tcPr>
-            <w:tcW w:type="dxa" w:w="2635"/>
+            <w:tcW w:type="dxa" w:w="1317"/>
           </w:tcPr>
           <w:p>
             <w:pPr>
@@ -3267,7 +4023,7 @@
         </w:tc>
         <w:tc>
           <w:tcPr>
-            <w:tcW w:type="dxa" w:w="2635"/>
+            <w:tcW w:type="dxa" w:w="1317"/>
           </w:tcPr>
           <w:p>
             <w:pPr>
@@ -3279,6 +4035,74 @@
                 <w:sz w:val="16"/>
               </w:rPr>
               <w:t>95</w:t>
+            </w:r>
+          </w:p>
+        </w:tc>
+        <w:tc>
+          <w:tcPr>
+            <w:tcW w:type="dxa" w:w="1317"/>
+          </w:tcPr>
+          <w:p>
+            <w:pPr>
+              <w:keepNext/>
+              <w:keepLines/>
+            </w:pPr>
+            <w:r>
+              <w:rPr>
+                <w:sz w:val="16"/>
+              </w:rPr>
+              <w:t>92</w:t>
+            </w:r>
+          </w:p>
+        </w:tc>
+        <w:tc>
+          <w:tcPr>
+            <w:tcW w:type="dxa" w:w="1317"/>
+          </w:tcPr>
+          <w:p>
+            <w:pPr>
+              <w:keepNext/>
+              <w:keepLines/>
+            </w:pPr>
+            <w:r>
+              <w:rPr>
+                <w:sz w:val="16"/>
+              </w:rPr>
+              <w:t>90</w:t>
+            </w:r>
+          </w:p>
+        </w:tc>
+        <w:tc>
+          <w:tcPr>
+            <w:tcW w:type="dxa" w:w="1317"/>
+          </w:tcPr>
+          <w:p>
+            <w:pPr>
+              <w:keepNext/>
+              <w:keepLines/>
+            </w:pPr>
+            <w:r>
+              <w:rPr>
+                <w:sz w:val="16"/>
+              </w:rPr>
+              <w:t>88</w:t>
+            </w:r>
+          </w:p>
+        </w:tc>
+        <w:tc>
+          <w:tcPr>
+            <w:tcW w:type="dxa" w:w="1317"/>
+          </w:tcPr>
+          <w:p>
+            <w:pPr>
+              <w:keepNext/>
+              <w:keepLines/>
+            </w:pPr>
+            <w:r>
+              <w:rPr>
+                <w:sz w:val="16"/>
+              </w:rPr>
+              <w:t>92</w:t>
             </w:r>
           </w:p>
         </w:tc>
@@ -3289,7 +4113,7 @@
         </w:trPr>
         <w:tc>
           <w:tcPr>
-            <w:tcW w:type="dxa" w:w="2635"/>
+            <w:tcW w:type="dxa" w:w="1317"/>
           </w:tcPr>
           <w:p>
             <w:r>
@@ -3302,7 +4126,7 @@
         </w:tc>
         <w:tc>
           <w:tcPr>
-            <w:tcW w:type="dxa" w:w="2635"/>
+            <w:tcW w:type="dxa" w:w="1317"/>
           </w:tcPr>
           <w:p>
             <w:r>
@@ -3315,7 +4139,7 @@
         </w:tc>
         <w:tc>
           <w:tcPr>
-            <w:tcW w:type="dxa" w:w="2635"/>
+            <w:tcW w:type="dxa" w:w="1317"/>
           </w:tcPr>
           <w:p>
             <w:r>
@@ -3328,7 +4152,7 @@
         </w:tc>
         <w:tc>
           <w:tcPr>
-            <w:tcW w:type="dxa" w:w="2635"/>
+            <w:tcW w:type="dxa" w:w="1317"/>
           </w:tcPr>
           <w:p>
             <w:r>
@@ -3336,6 +4160,58 @@
                 <w:sz w:val="16"/>
               </w:rPr>
               <w:t>11,126</w:t>
+            </w:r>
+          </w:p>
+        </w:tc>
+        <w:tc>
+          <w:tcPr>
+            <w:tcW w:type="dxa" w:w="1317"/>
+          </w:tcPr>
+          <w:p>
+            <w:r>
+              <w:rPr>
+                <w:sz w:val="16"/>
+              </w:rPr>
+              <w:t>10,945</w:t>
+            </w:r>
+          </w:p>
+        </w:tc>
+        <w:tc>
+          <w:tcPr>
+            <w:tcW w:type="dxa" w:w="1317"/>
+          </w:tcPr>
+          <w:p>
+            <w:r>
+              <w:rPr>
+                <w:sz w:val="16"/>
+              </w:rPr>
+              <w:t>10,837</w:t>
+            </w:r>
+          </w:p>
+        </w:tc>
+        <w:tc>
+          <w:tcPr>
+            <w:tcW w:type="dxa" w:w="1317"/>
+          </w:tcPr>
+          <w:p>
+            <w:r>
+              <w:rPr>
+                <w:sz w:val="16"/>
+              </w:rPr>
+              <w:t>10,801</w:t>
+            </w:r>
+          </w:p>
+        </w:tc>
+        <w:tc>
+          <w:tcPr>
+            <w:tcW w:type="dxa" w:w="1317"/>
+          </w:tcPr>
+          <w:p>
+            <w:r>
+              <w:rPr>
+                <w:sz w:val="16"/>
+              </w:rPr>
+              <w:t>11,454</w:t>
             </w:r>
           </w:p>
         </w:tc>
@@ -3352,7 +4228,7 @@
     </w:p>
     <w:p>
       <w:r>
-        <w:t>With 8% treated, the pool settles at a steady 39% of each year's entrants treated, against 33% at 6% (derived) [C46]. 8% is a third above the base rate and about 3.6 times the 2.2% DBS rate [C49]. We chose the smallest change that keeps the bull clearly above the base in every year: a bull defined by a capacity build to 10,000 a year would now sit below the base, which exceeds 10,000 from FY2031E. With the base already on a three-year ramp, the bull differs from it only in the treated share [S59] ★. Bull volume is 14,300 in FY2031E, against 11,100 in the base. David earlier asked for a bull growing to 10,000 a year; this bull exceeds that, which needs his confirmation [S59].</w:t>
+        <w:t>With 8% treated, the pool settles at a steady 39% of each year's entrants treated, against 33% at 6% (derived) [C46]. 8% is a third above the base rate and about 3.6 times the 2.2% DBS rate [C49]. We chose the smallest change that keeps the bull clearly above the base in every year: a bull defined by a capacity build to 10,000 a year would now sit below the base, which exceeds 10,000 from FY2031E. With the base already on a three-year ramp, the bull differs from it only in the treated share [S59] ★. Bull volume is 14,300 in FY2031E, against 11,100 in the base. Bull class demand is about 13,800 in FY2032E and in FY2040E, against 10,900 and 11,500 in the base (demand context) [C46][C40]. David earlier asked for a bull growing to 10,000 a year; this bull exceeds that, which needs his confirmation [S59].</w:t>
       </w:r>
     </w:p>
     <w:p>
@@ -4183,7 +5059,7 @@
         <w:t>Shared centres.</w:t>
       </w:r>
       <w:r>
-        <w:t xml:space="preserve"> AMT-130 and the Parkinson's class would compete for the same neurosurgeons and MRI suites; base FY2031E volume of about 14,100 procedures needs about 94 centres at 3 cases a week (derived) [S43].</w:t>
+        <w:t xml:space="preserve"> AMT-130 and the Parkinson's class would compete for the same neurosurgeons and MRI suites; base FY2031E volume of about 14,100 procedures needs about 94 centres at 3 cases a week (derived) [S43]. Base class demand stays about the same after FY2031E (about 10,800–11,500 a year to FY2040E, Figure 4b), so the centre need does not fall (demand context) [C40].</w:t>
       </w:r>
     </w:p>
     <w:p>
@@ -27437,7 +28313,7 @@
               <w:rPr>
                 <w:sz w:val="16"/>
               </w:rPr>
-              <w:t>Eligible pool FY2026E / patients who have had DBS</w:t>
+              <w:t>One-time PD class demand FY2032E / FY2033E (demand context)</w:t>
             </w:r>
           </w:p>
         </w:tc>
@@ -27454,7 +28330,7 @@
               <w:rPr>
                 <w:sz w:val="16"/>
               </w:rPr>
-              <w:t>137,813 / excluded</w:t>
+              <w:t>8,389 / 8,306</w:t>
             </w:r>
           </w:p>
         </w:tc>
@@ -27471,7 +28347,7 @@
               <w:rPr>
                 <w:sz w:val="16"/>
               </w:rPr>
-              <w:t>179,813 / included</w:t>
+              <w:t>10,945 / 10,837</w:t>
             </w:r>
           </w:p>
         </w:tc>
@@ -27488,7 +28364,7 @@
               <w:rPr>
                 <w:sz w:val="16"/>
               </w:rPr>
-              <w:t>179,813 / included</w:t>
+              <w:t>13,833 / 13,530</w:t>
             </w:r>
           </w:p>
         </w:tc>
@@ -27510,7 +28386,7 @@
               <w:rPr>
                 <w:sz w:val="16"/>
               </w:rPr>
-              <w:t>PD treated share of pool (DBS not deducted)</w:t>
+              <w:t>Eligible pool FY2026E / patients who have had DBS</w:t>
             </w:r>
           </w:p>
         </w:tc>
@@ -27527,7 +28403,7 @@
               <w:rPr>
                 <w:sz w:val="16"/>
               </w:rPr>
-              <w:t>6%</w:t>
+              <w:t>137,813 / excluded</w:t>
             </w:r>
           </w:p>
         </w:tc>
@@ -27544,7 +28420,7 @@
               <w:rPr>
                 <w:sz w:val="16"/>
               </w:rPr>
-              <w:t>6%</w:t>
+              <w:t>179,813 / included</w:t>
             </w:r>
           </w:p>
         </w:tc>
@@ -27561,7 +28437,7 @@
               <w:rPr>
                 <w:sz w:val="16"/>
               </w:rPr>
-              <w:t>8%</w:t>
+              <w:t>179,813 / included</w:t>
             </w:r>
           </w:p>
         </w:tc>
@@ -27583,7 +28459,7 @@
               <w:rPr>
                 <w:sz w:val="16"/>
               </w:rPr>
-              <w:t>PD volume rule</w:t>
+              <w:t>PD treated share of pool (DBS not deducted)</w:t>
             </w:r>
           </w:p>
         </w:tc>
@@ -27600,7 +28476,7 @@
               <w:rPr>
                 <w:sz w:val="16"/>
               </w:rPr>
-              <w:t>Capacity ramp (330 / 2,500 FY2030E–31E) toward 4,500; capacity binds</w:t>
+              <w:t>6%</w:t>
             </w:r>
           </w:p>
         </w:tc>
@@ -27617,7 +28493,7 @@
               <w:rPr>
                 <w:sz w:val="16"/>
               </w:rPr>
-              <w:t>Three-year ramp to class demand</w:t>
+              <w:t>6%</w:t>
             </w:r>
           </w:p>
         </w:tc>
@@ -27634,7 +28510,7 @@
               <w:rPr>
                 <w:sz w:val="16"/>
               </w:rPr>
-              <w:t>Three-year ramp to class demand</w:t>
+              <w:t>8%</w:t>
             </w:r>
           </w:p>
         </w:tc>
@@ -27656,7 +28532,7 @@
               <w:rPr>
                 <w:sz w:val="16"/>
               </w:rPr>
-              <w:t>ClearPoint share of one-time PD procedures</w:t>
+              <w:t>PD volume rule</w:t>
             </w:r>
           </w:p>
         </w:tc>
@@ -27673,7 +28549,7 @@
               <w:rPr>
                 <w:sz w:val="16"/>
               </w:rPr>
-              <w:t>100%</w:t>
+              <w:t>Capacity ramp (330 / 2,500 FY2030E–31E) toward 4,500; capacity binds</w:t>
             </w:r>
           </w:p>
         </w:tc>
@@ -27690,7 +28566,7 @@
               <w:rPr>
                 <w:sz w:val="16"/>
               </w:rPr>
-              <w:t>100%</w:t>
+              <w:t>Three-year ramp to class demand</w:t>
             </w:r>
           </w:p>
         </w:tc>
@@ -27707,7 +28583,7 @@
               <w:rPr>
                 <w:sz w:val="16"/>
               </w:rPr>
-              <w:t>100%</w:t>
+              <w:t>Three-year ramp to class demand</w:t>
             </w:r>
           </w:p>
         </w:tc>
@@ -27729,7 +28605,7 @@
               <w:rPr>
                 <w:sz w:val="16"/>
               </w:rPr>
-              <w:t>First PD class approval (bemdaneprocel)</w:t>
+              <w:t>ClearPoint share of one-time PD procedures</w:t>
             </w:r>
           </w:p>
         </w:tc>
@@ -27746,7 +28622,7 @@
               <w:rPr>
                 <w:sz w:val="16"/>
               </w:rPr>
-              <w:t>2030</w:t>
+              <w:t>100%</w:t>
             </w:r>
           </w:p>
         </w:tc>
@@ -27763,7 +28639,7 @@
               <w:rPr>
                 <w:sz w:val="16"/>
               </w:rPr>
-              <w:t>H2 2029</w:t>
+              <w:t>100%</w:t>
             </w:r>
           </w:p>
         </w:tc>
@@ -27780,7 +28656,7 @@
               <w:rPr>
                 <w:sz w:val="16"/>
               </w:rPr>
-              <w:t>H2 2029</w:t>
+              <w:t>100%</w:t>
             </w:r>
           </w:p>
         </w:tc>
@@ -27802,7 +28678,7 @@
               <w:rPr>
                 <w:sz w:val="16"/>
               </w:rPr>
-              <w:t>CAL uplift FY2027E–31E (US$M)</w:t>
+              <w:t>First PD class approval (bemdaneprocel)</w:t>
             </w:r>
           </w:p>
         </w:tc>
@@ -27819,7 +28695,7 @@
               <w:rPr>
                 <w:sz w:val="16"/>
               </w:rPr>
-              <w:t>0.0 / 2.0 / 4.0 / 6.0 / 8.0</w:t>
+              <w:t>2030</w:t>
             </w:r>
           </w:p>
         </w:tc>
@@ -27836,7 +28712,7 @@
               <w:rPr>
                 <w:sz w:val="16"/>
               </w:rPr>
-              <w:t>0.0 / 7.0 / 14.0 / 22.0 / 29.0</w:t>
+              <w:t>H2 2029</w:t>
             </w:r>
           </w:p>
         </w:tc>
@@ -27853,7 +28729,7 @@
               <w:rPr>
                 <w:sz w:val="16"/>
               </w:rPr>
-              <w:t>3.0 / 10.0 / 18.0 / 27.0 / 36.0</w:t>
+              <w:t>H2 2029</w:t>
             </w:r>
           </w:p>
         </w:tc>
@@ -27875,7 +28751,7 @@
               <w:rPr>
                 <w:sz w:val="16"/>
               </w:rPr>
-              <w:t>Core FY2026E / FY2027E (consensus)</w:t>
+              <w:t>CAL uplift FY2027E–31E (US$M)</w:t>
             </w:r>
           </w:p>
         </w:tc>
@@ -27892,7 +28768,7 @@
               <w:rPr>
                 <w:sz w:val="16"/>
               </w:rPr>
-              <w:t>48.0 / 56.0</w:t>
+              <w:t>0.0 / 2.0 / 4.0 / 6.0 / 8.0</w:t>
             </w:r>
           </w:p>
         </w:tc>
@@ -27909,7 +28785,7 @@
               <w:rPr>
                 <w:sz w:val="16"/>
               </w:rPr>
-              <w:t>49.0 / 56.6</w:t>
+              <w:t>0.0 / 7.0 / 14.0 / 22.0 / 29.0</w:t>
             </w:r>
           </w:p>
         </w:tc>
@@ -27926,7 +28802,7 @@
               <w:rPr>
                 <w:sz w:val="16"/>
               </w:rPr>
-              <w:t>50.0 / 57.1</w:t>
+              <w:t>3.0 / 10.0 / 18.0 / 27.0 / 36.0</w:t>
             </w:r>
           </w:p>
         </w:tc>
@@ -27948,7 +28824,7 @@
               <w:rPr>
                 <w:sz w:val="16"/>
               </w:rPr>
-              <w:t>Core growth FY2028E–31E</w:t>
+              <w:t>Core FY2026E / FY2027E (consensus)</w:t>
             </w:r>
           </w:p>
         </w:tc>
@@ -27965,7 +28841,7 @@
               <w:rPr>
                 <w:sz w:val="16"/>
               </w:rPr>
-              <w:t>8%</w:t>
+              <w:t>48.0 / 56.0</w:t>
             </w:r>
           </w:p>
         </w:tc>
@@ -27982,7 +28858,7 @@
               <w:rPr>
                 <w:sz w:val="16"/>
               </w:rPr>
-              <w:t>15%</w:t>
+              <w:t>49.0 / 56.6</w:t>
             </w:r>
           </w:p>
         </w:tc>
@@ -27999,7 +28875,7 @@
               <w:rPr>
                 <w:sz w:val="16"/>
               </w:rPr>
-              <w:t>18%</w:t>
+              <w:t>50.0 / 57.1</w:t>
             </w:r>
           </w:p>
         </w:tc>
@@ -28021,7 +28897,7 @@
               <w:rPr>
                 <w:sz w:val="16"/>
               </w:rPr>
-              <w:t>Core opex growth FY2027E / after</w:t>
+              <w:t>Core growth FY2028E–31E</w:t>
             </w:r>
           </w:p>
         </w:tc>
@@ -28038,7 +28914,7 @@
               <w:rPr>
                 <w:sz w:val="16"/>
               </w:rPr>
-              <w:t>10% / 7%</w:t>
+              <w:t>8%</w:t>
             </w:r>
           </w:p>
         </w:tc>
@@ -28055,7 +28931,7 @@
               <w:rPr>
                 <w:sz w:val="16"/>
               </w:rPr>
-              <w:t>6% / 5%</w:t>
+              <w:t>15%</w:t>
             </w:r>
           </w:p>
         </w:tc>
@@ -28072,7 +28948,7 @@
               <w:rPr>
                 <w:sz w:val="16"/>
               </w:rPr>
-              <w:t>6% / 5%</w:t>
+              <w:t>18%</w:t>
             </w:r>
           </w:p>
         </w:tc>
@@ -28094,7 +28970,7 @@
               <w:rPr>
                 <w:sz w:val="16"/>
               </w:rPr>
-              <w:t>Revenue FY2026E</w:t>
+              <w:t>Core opex growth FY2027E / after</w:t>
             </w:r>
           </w:p>
         </w:tc>
@@ -28111,7 +28987,7 @@
               <w:rPr>
                 <w:sz w:val="16"/>
               </w:rPr>
-              <w:t>48.0</w:t>
+              <w:t>10% / 7%</w:t>
             </w:r>
           </w:p>
         </w:tc>
@@ -28128,7 +29004,7 @@
               <w:rPr>
                 <w:sz w:val="16"/>
               </w:rPr>
-              <w:t>49.0</w:t>
+              <w:t>6% / 5%</w:t>
             </w:r>
           </w:p>
         </w:tc>
@@ -28145,7 +29021,7 @@
               <w:rPr>
                 <w:sz w:val="16"/>
               </w:rPr>
-              <w:t>50.0</w:t>
+              <w:t>6% / 5%</w:t>
             </w:r>
           </w:p>
         </w:tc>
@@ -28167,7 +29043,7 @@
               <w:rPr>
                 <w:sz w:val="16"/>
               </w:rPr>
-              <w:t>Revenue FY2027E</w:t>
+              <w:t>Revenue FY2026E</w:t>
             </w:r>
           </w:p>
         </w:tc>
@@ -28184,7 +29060,7 @@
               <w:rPr>
                 <w:sz w:val="16"/>
               </w:rPr>
-              <w:t>56.0</w:t>
+              <w:t>48.0</w:t>
             </w:r>
           </w:p>
         </w:tc>
@@ -28201,7 +29077,7 @@
               <w:rPr>
                 <w:sz w:val="16"/>
               </w:rPr>
-              <w:t>63.1</w:t>
+              <w:t>49.0</w:t>
             </w:r>
           </w:p>
         </w:tc>
@@ -28218,7 +29094,7 @@
               <w:rPr>
                 <w:sz w:val="16"/>
               </w:rPr>
-              <w:t>77.7</w:t>
+              <w:t>50.0</w:t>
             </w:r>
           </w:p>
         </w:tc>
@@ -28240,7 +29116,7 @@
               <w:rPr>
                 <w:sz w:val="16"/>
               </w:rPr>
-              <w:t>Revenue FY2028E</w:t>
+              <w:t>Revenue FY2027E</w:t>
             </w:r>
           </w:p>
         </w:tc>
@@ -28257,7 +29133,7 @@
               <w:rPr>
                 <w:sz w:val="16"/>
               </w:rPr>
-              <w:t>67.9</w:t>
+              <w:t>56.0</w:t>
             </w:r>
           </w:p>
         </w:tc>
@@ -28274,7 +29150,7 @@
               <w:rPr>
                 <w:sz w:val="16"/>
               </w:rPr>
-              <w:t>122.0</w:t>
+              <w:t>63.1</w:t>
             </w:r>
           </w:p>
         </w:tc>
@@ -28291,7 +29167,7 @@
               <w:rPr>
                 <w:sz w:val="16"/>
               </w:rPr>
-              <w:t>167.4</w:t>
+              <w:t>77.7</w:t>
             </w:r>
           </w:p>
         </w:tc>
@@ -28313,7 +29189,7 @@
               <w:rPr>
                 <w:sz w:val="16"/>
               </w:rPr>
-              <w:t>Revenue FY2029E</w:t>
+              <w:t>Revenue FY2028E</w:t>
             </w:r>
           </w:p>
         </w:tc>
@@ -28330,7 +29206,7 @@
               <w:rPr>
                 <w:sz w:val="16"/>
               </w:rPr>
-              <w:t>89.3</w:t>
+              <w:t>67.9</w:t>
             </w:r>
           </w:p>
         </w:tc>
@@ -28347,7 +29223,7 @@
               <w:rPr>
                 <w:sz w:val="16"/>
               </w:rPr>
-              <w:t>230.6</w:t>
+              <w:t>122.0</w:t>
             </w:r>
           </w:p>
         </w:tc>
@@ -28364,7 +29240,7 @@
               <w:rPr>
                 <w:sz w:val="16"/>
               </w:rPr>
-              <w:t>284.4</w:t>
+              <w:t>167.4</w:t>
             </w:r>
           </w:p>
         </w:tc>
@@ -28386,7 +29262,7 @@
               <w:rPr>
                 <w:sz w:val="16"/>
               </w:rPr>
-              <w:t>Revenue FY2030E</w:t>
+              <w:t>Revenue FY2029E</w:t>
             </w:r>
           </w:p>
         </w:tc>
@@ -28403,7 +29279,7 @@
               <w:rPr>
                 <w:sz w:val="16"/>
               </w:rPr>
-              <w:t>119.1</w:t>
+              <w:t>89.3</w:t>
             </w:r>
           </w:p>
         </w:tc>
@@ -28420,7 +29296,7 @@
               <w:rPr>
                 <w:sz w:val="16"/>
               </w:rPr>
-              <w:t>319.9</w:t>
+              <w:t>230.6</w:t>
             </w:r>
           </w:p>
         </w:tc>
@@ -28437,7 +29313,7 @@
               <w:rPr>
                 <w:sz w:val="16"/>
               </w:rPr>
-              <w:t>389.2</w:t>
+              <w:t>284.4</w:t>
             </w:r>
           </w:p>
         </w:tc>
@@ -28459,7 +29335,7 @@
               <w:rPr>
                 <w:sz w:val="16"/>
               </w:rPr>
-              <w:t>Revenue FY2031E</w:t>
+              <w:t>Revenue FY2030E</w:t>
             </w:r>
           </w:p>
         </w:tc>
@@ -28476,7 +29352,7 @@
               <w:rPr>
                 <w:sz w:val="16"/>
               </w:rPr>
-              <w:t>180.2</w:t>
+              <w:t>119.1</w:t>
             </w:r>
           </w:p>
         </w:tc>
@@ -28493,7 +29369,7 @@
               <w:rPr>
                 <w:sz w:val="16"/>
               </w:rPr>
-              <w:t>410.4</w:t>
+              <w:t>319.9</w:t>
             </w:r>
           </w:p>
         </w:tc>
@@ -28510,7 +29386,7 @@
               <w:rPr>
                 <w:sz w:val="16"/>
               </w:rPr>
-              <w:t>502.1</w:t>
+              <w:t>389.2</w:t>
             </w:r>
           </w:p>
         </w:tc>
@@ -28532,7 +29408,7 @@
               <w:rPr>
                 <w:sz w:val="16"/>
               </w:rPr>
-              <w:t>EBITDA FY2026E</w:t>
+              <w:t>Revenue FY2031E</w:t>
             </w:r>
           </w:p>
         </w:tc>
@@ -28549,7 +29425,7 @@
               <w:rPr>
                 <w:sz w:val="16"/>
               </w:rPr>
-              <w:t>−24.7</w:t>
+              <w:t>180.2</w:t>
             </w:r>
           </w:p>
         </w:tc>
@@ -28566,7 +29442,7 @@
               <w:rPr>
                 <w:sz w:val="16"/>
               </w:rPr>
-              <w:t>−23.6</w:t>
+              <w:t>410.4</w:t>
             </w:r>
           </w:p>
         </w:tc>
@@ -28583,7 +29459,7 @@
               <w:rPr>
                 <w:sz w:val="16"/>
               </w:rPr>
-              <w:t>−22.9</w:t>
+              <w:t>502.1</w:t>
             </w:r>
           </w:p>
         </w:tc>
@@ -28605,7 +29481,7 @@
               <w:rPr>
                 <w:sz w:val="16"/>
               </w:rPr>
-              <w:t>EBITDA FY2027E</w:t>
+              <w:t>EBITDA FY2026E</w:t>
             </w:r>
           </w:p>
         </w:tc>
@@ -28622,7 +29498,7 @@
               <w:rPr>
                 <w:sz w:val="16"/>
               </w:rPr>
-              <w:t>−25.2</w:t>
+              <w:t>−24.7</w:t>
             </w:r>
           </w:p>
         </w:tc>
@@ -28639,7 +29515,7 @@
               <w:rPr>
                 <w:sz w:val="16"/>
               </w:rPr>
-              <w:t>−19.5</w:t>
+              <w:t>−23.6</w:t>
             </w:r>
           </w:p>
         </w:tc>
@@ -28656,7 +29532,7 @@
               <w:rPr>
                 <w:sz w:val="16"/>
               </w:rPr>
-              <w:t>−11.3</w:t>
+              <w:t>−22.9</w:t>
             </w:r>
           </w:p>
         </w:tc>
@@ -28678,7 +29554,7 @@
               <w:rPr>
                 <w:sz w:val="16"/>
               </w:rPr>
-              <w:t>EBITDA FY2028E</w:t>
+              <w:t>EBITDA FY2027E</w:t>
             </w:r>
           </w:p>
         </w:tc>
@@ -28695,7 +29571,7 @@
               <w:rPr>
                 <w:sz w:val="16"/>
               </w:rPr>
-              <w:t>−24.5</w:t>
+              <w:t>−25.2</w:t>
             </w:r>
           </w:p>
         </w:tc>
@@ -28712,7 +29588,7 @@
               <w:rPr>
                 <w:sz w:val="16"/>
               </w:rPr>
-              <w:t>12.0</w:t>
+              <w:t>−19.5</w:t>
             </w:r>
           </w:p>
         </w:tc>
@@ -28729,7 +29605,7 @@
               <w:rPr>
                 <w:sz w:val="16"/>
               </w:rPr>
-              <w:t>38.8</w:t>
+              <w:t>−11.3</w:t>
             </w:r>
           </w:p>
         </w:tc>
@@ -28751,7 +29627,7 @@
               <w:rPr>
                 <w:sz w:val="16"/>
               </w:rPr>
-              <w:t>EBITDA FY2029E</w:t>
+              <w:t>EBITDA FY2028E</w:t>
             </w:r>
           </w:p>
         </w:tc>
@@ -28768,7 +29644,7 @@
               <w:rPr>
                 <w:sz w:val="16"/>
               </w:rPr>
-              <w:t>−16.4</w:t>
+              <w:t>−24.5</w:t>
             </w:r>
           </w:p>
         </w:tc>
@@ -28785,7 +29661,7 @@
               <w:rPr>
                 <w:sz w:val="16"/>
               </w:rPr>
-              <w:t>71.2</w:t>
+              <w:t>12.0</w:t>
             </w:r>
           </w:p>
         </w:tc>
@@ -28802,7 +29678,7 @@
               <w:rPr>
                 <w:sz w:val="16"/>
               </w:rPr>
-              <w:t>103.0</w:t>
+              <w:t>38.8</w:t>
             </w:r>
           </w:p>
         </w:tc>
@@ -28824,7 +29700,7 @@
               <w:rPr>
                 <w:sz w:val="16"/>
               </w:rPr>
-              <w:t>EBITDA FY2030E</w:t>
+              <w:t>EBITDA FY2029E</w:t>
             </w:r>
           </w:p>
         </w:tc>
@@ -28841,7 +29717,7 @@
               <w:rPr>
                 <w:sz w:val="16"/>
               </w:rPr>
-              <w:t>−5.5</w:t>
+              <w:t>−16.4</w:t>
             </w:r>
           </w:p>
         </w:tc>
@@ -28858,7 +29734,7 @@
               <w:rPr>
                 <w:sz w:val="16"/>
               </w:rPr>
-              <w:t>120.6</w:t>
+              <w:t>71.2</w:t>
             </w:r>
           </w:p>
         </w:tc>
@@ -28875,7 +29751,7 @@
               <w:rPr>
                 <w:sz w:val="16"/>
               </w:rPr>
-              <w:t>161.5</w:t>
+              <w:t>103.0</w:t>
             </w:r>
           </w:p>
         </w:tc>
@@ -28897,7 +29773,7 @@
               <w:rPr>
                 <w:sz w:val="16"/>
               </w:rPr>
-              <w:t>EBITDA FY2031E</w:t>
+              <w:t>EBITDA FY2030E</w:t>
             </w:r>
           </w:p>
         </w:tc>
@@ -28914,7 +29790,7 @@
               <w:rPr>
                 <w:sz w:val="16"/>
               </w:rPr>
-              <w:t>25.8</w:t>
+              <w:t>−5.5</w:t>
             </w:r>
           </w:p>
         </w:tc>
@@ -28931,7 +29807,7 @@
               <w:rPr>
                 <w:sz w:val="16"/>
               </w:rPr>
-              <w:t>170.8</w:t>
+              <w:t>120.6</w:t>
             </w:r>
           </w:p>
         </w:tc>
@@ -28948,7 +29824,7 @@
               <w:rPr>
                 <w:sz w:val="16"/>
               </w:rPr>
-              <w:t>225.0</w:t>
+              <w:t>161.5</w:t>
             </w:r>
           </w:p>
         </w:tc>
@@ -28962,6 +29838,79 @@
             <w:tcW w:type="dxa" w:w="2635"/>
           </w:tcPr>
           <w:p>
+            <w:pPr>
+              <w:keepNext/>
+              <w:keepLines/>
+            </w:pPr>
+            <w:r>
+              <w:rPr>
+                <w:sz w:val="16"/>
+              </w:rPr>
+              <w:t>EBITDA FY2031E</w:t>
+            </w:r>
+          </w:p>
+        </w:tc>
+        <w:tc>
+          <w:tcPr>
+            <w:tcW w:type="dxa" w:w="2635"/>
+          </w:tcPr>
+          <w:p>
+            <w:pPr>
+              <w:keepNext/>
+              <w:keepLines/>
+            </w:pPr>
+            <w:r>
+              <w:rPr>
+                <w:sz w:val="16"/>
+              </w:rPr>
+              <w:t>25.8</w:t>
+            </w:r>
+          </w:p>
+        </w:tc>
+        <w:tc>
+          <w:tcPr>
+            <w:tcW w:type="dxa" w:w="2635"/>
+          </w:tcPr>
+          <w:p>
+            <w:pPr>
+              <w:keepNext/>
+              <w:keepLines/>
+            </w:pPr>
+            <w:r>
+              <w:rPr>
+                <w:sz w:val="16"/>
+              </w:rPr>
+              <w:t>170.8</w:t>
+            </w:r>
+          </w:p>
+        </w:tc>
+        <w:tc>
+          <w:tcPr>
+            <w:tcW w:type="dxa" w:w="2635"/>
+          </w:tcPr>
+          <w:p>
+            <w:pPr>
+              <w:keepNext/>
+              <w:keepLines/>
+            </w:pPr>
+            <w:r>
+              <w:rPr>
+                <w:sz w:val="16"/>
+              </w:rPr>
+              <w:t>225.0</w:t>
+            </w:r>
+          </w:p>
+        </w:tc>
+      </w:tr>
+      <w:tr>
+        <w:trPr>
+          <w:cantSplit/>
+        </w:trPr>
+        <w:tc>
+          <w:tcPr>
+            <w:tcW w:type="dxa" w:w="2635"/>
+          </w:tcPr>
+          <w:p>
             <w:r>
               <w:rPr>
                 <w:sz w:val="16"/>
@@ -29040,7 +29989,7 @@
         <w:t>bear</w:t>
       </w:r>
       <w:r>
-        <w:t xml:space="preserve"> case is a slow launch in line with gene-therapy precedents [D22][D23]: no AMT-130 revenue in FY2027E, then 270, 1,000, 1,800 and 2,300 procedures in FY2028E–31E. The first Parkinson's class approval slips to 2030, a year after the base, and class volume follows a capacity ramp (330 / 2,500 in FY2030E–31E) toward the bear capacity of 4,500 [S22][S43]. The bear also applies the trial-style exclusion of patients who have had DBS, so the pool is about 138,000 and class demand about 8,500 in FY2031E; capacity, not demand, binds in every year to FY2031E [C55]. CAL reaches only $10M, and core costs grow faster. Bear EBITDA turns positive in FY2031E [S22][S37].</w:t>
+        <w:t xml:space="preserve"> case is a slow launch in line with gene-therapy precedents [D22][D23]: no AMT-130 revenue in FY2027E, then 270, 1,000, 1,800 and 2,300 procedures in FY2028E–31E. The first Parkinson's class approval slips to 2030, a year after the base, and class volume follows a capacity ramp (330 / 2,500 in FY2030E–31E) toward the bear capacity of 4,500 [S22][S43]. The bear also applies the trial-style exclusion of patients who have had DBS, so the pool is about 138,000 and class demand about 8,500 in FY2031E and about 8,300–8,400 a year in FY2032E–33E (demand context); capacity, not demand, binds in every year to FY2031E [C55]. CAL reaches only $10M, and core costs grow faster. Bear EBITDA turns positive in FY2031E [S22][S37].</w:t>
       </w:r>
     </w:p>
     <w:p>
@@ -31823,7 +32772,7 @@
         <w:t>C40</w:t>
       </w:r>
       <w:r>
-        <w:t xml:space="preserve"> One-time PD class demand = one-time treated in the eligible-pool model (6% of the opening pool from FY2029E, S45; DBS not deducted, S44): 11,756 / 11,391 / 11,126 (FY2029E–31E). Appendix C.</w:t>
+        <w:t xml:space="preserve"> One-time PD class demand = one-time treated in the eligible-pool model (6% of the opening pool from FY2029E, S45; DBS not deducted, S44): 11,756 / 11,391 / 11,126 / 10,945 (FY2029E–32E); 10,837 (FY2033E); 10,792 (FY2034E); 10,801 (FY2035E); 11,454 (FY2040E); 12,780 (FY2045E). Growth FY2033E–40E 0.8% a year. Appendix C. FY2032E onward is demand context; the valuation does not use it (P3).</w:t>
       </w:r>
     </w:p>
     <w:p>
@@ -31837,7 +32786,7 @@
         <w:t>C46</w:t>
       </w:r>
       <w:r>
-        <w:t xml:space="preserve"> Bull class demand = pool model (C45 inputs) re-run with 8% treated from FY2029E (S59): 15,674 / 14,875 / 14,272 (FY2029E–31E). Steady-state treated share of entrants 0.08 / (0.095 + 0.08 + 0.029) = 39%.</w:t>
+        <w:t xml:space="preserve"> Bull class demand = pool model (C45 inputs) re-run with 8% treated from FY2029E (S59): 15,674 / 14,875 / 14,272 / 13,833 (FY2029E–32E); 13,530 (FY2033E); 13,250 (FY2035E); 13,792 (FY2040E). Steady-state treated share of entrants 0.08 / (0.095 + 0.08 + 0.029) = 39%.</w:t>
       </w:r>
     </w:p>
     <w:p>
@@ -31995,7 +32944,7 @@
         <w:t>C55</w:t>
       </w:r>
       <w:r>
-        <w:t xml:space="preserve"> Bear class demand = pool model with patients who have had DBS excluded (3,990 ÷ 0.095 ≈ 42,000; pool 137,813, trial-style, A41), 6% treated: 9,010 / 8,731 / 8,527 (FY2029E–31E). Above bear volume in every year (S43).</w:t>
+        <w:t xml:space="preserve"> Bear class demand = pool model with patients who have had DBS excluded (3,990 ÷ 0.095 ≈ 42,000; pool 137,813, trial-style, A41), 6% treated: 9,010 / 8,731 / 8,527 / 8,389 (FY2029E–32E); 8,306 (FY2033E). Above bear volume through FY2031E (S43); FY2032E–33E are demand context.</w:t>
       </w:r>
     </w:p>
     <w:p>
@@ -33050,11 +33999,14 @@
         <w:tblLook w:firstColumn="1" w:firstRow="1" w:lastColumn="0" w:lastRow="0" w:noHBand="0" w:noVBand="1" w:val="04A0"/>
       </w:tblPr>
       <w:tblGrid>
-        <w:gridCol w:w="2108"/>
-        <w:gridCol w:w="2108"/>
-        <w:gridCol w:w="2108"/>
-        <w:gridCol w:w="2108"/>
-        <w:gridCol w:w="2108"/>
+        <w:gridCol w:w="1317"/>
+        <w:gridCol w:w="1317"/>
+        <w:gridCol w:w="1317"/>
+        <w:gridCol w:w="1317"/>
+        <w:gridCol w:w="1317"/>
+        <w:gridCol w:w="1317"/>
+        <w:gridCol w:w="1317"/>
+        <w:gridCol w:w="1317"/>
       </w:tblGrid>
       <w:tr>
         <w:trPr>
@@ -33063,7 +34015,7 @@
         </w:trPr>
         <w:tc>
           <w:tcPr>
-            <w:tcW w:type="dxa" w:w="2108"/>
+            <w:tcW w:type="dxa" w:w="1317"/>
           </w:tcPr>
           <w:p>
             <w:pPr>
@@ -33081,7 +34033,7 @@
         </w:tc>
         <w:tc>
           <w:tcPr>
-            <w:tcW w:type="dxa" w:w="2108"/>
+            <w:tcW w:type="dxa" w:w="1317"/>
           </w:tcPr>
           <w:p>
             <w:pPr>
@@ -33099,7 +34051,7 @@
         </w:tc>
         <w:tc>
           <w:tcPr>
-            <w:tcW w:type="dxa" w:w="2108"/>
+            <w:tcW w:type="dxa" w:w="1317"/>
           </w:tcPr>
           <w:p>
             <w:pPr>
@@ -33117,7 +34069,7 @@
         </w:tc>
         <w:tc>
           <w:tcPr>
-            <w:tcW w:type="dxa" w:w="2108"/>
+            <w:tcW w:type="dxa" w:w="1317"/>
           </w:tcPr>
           <w:p>
             <w:pPr>
@@ -33135,7 +34087,7 @@
         </w:tc>
         <w:tc>
           <w:tcPr>
-            <w:tcW w:type="dxa" w:w="2108"/>
+            <w:tcW w:type="dxa" w:w="1317"/>
           </w:tcPr>
           <w:p>
             <w:pPr>
@@ -33148,6 +34100,60 @@
                 <w:sz w:val="16"/>
               </w:rPr>
               <w:t>2031E</w:t>
+            </w:r>
+          </w:p>
+        </w:tc>
+        <w:tc>
+          <w:tcPr>
+            <w:tcW w:type="dxa" w:w="1317"/>
+          </w:tcPr>
+          <w:p>
+            <w:pPr>
+              <w:keepNext/>
+              <w:keepLines/>
+            </w:pPr>
+            <w:r>
+              <w:rPr>
+                <w:b/>
+                <w:sz w:val="16"/>
+              </w:rPr>
+              <w:t>2032E</w:t>
+            </w:r>
+          </w:p>
+        </w:tc>
+        <w:tc>
+          <w:tcPr>
+            <w:tcW w:type="dxa" w:w="1317"/>
+          </w:tcPr>
+          <w:p>
+            <w:pPr>
+              <w:keepNext/>
+              <w:keepLines/>
+            </w:pPr>
+            <w:r>
+              <w:rPr>
+                <w:b/>
+                <w:sz w:val="16"/>
+              </w:rPr>
+              <w:t>2035E</w:t>
+            </w:r>
+          </w:p>
+        </w:tc>
+        <w:tc>
+          <w:tcPr>
+            <w:tcW w:type="dxa" w:w="1317"/>
+          </w:tcPr>
+          <w:p>
+            <w:pPr>
+              <w:keepNext/>
+              <w:keepLines/>
+            </w:pPr>
+            <w:r>
+              <w:rPr>
+                <w:b/>
+                <w:sz w:val="16"/>
+              </w:rPr>
+              <w:t>2040E</w:t>
             </w:r>
           </w:p>
         </w:tc>
@@ -33158,7 +34164,7 @@
         </w:trPr>
         <w:tc>
           <w:tcPr>
-            <w:tcW w:type="dxa" w:w="2108"/>
+            <w:tcW w:type="dxa" w:w="1317"/>
           </w:tcPr>
           <w:p>
             <w:pPr>
@@ -33175,7 +34181,7 @@
         </w:tc>
         <w:tc>
           <w:tcPr>
-            <w:tcW w:type="dxa" w:w="2108"/>
+            <w:tcW w:type="dxa" w:w="1317"/>
           </w:tcPr>
           <w:p>
             <w:pPr>
@@ -33192,7 +34198,7 @@
         </w:tc>
         <w:tc>
           <w:tcPr>
-            <w:tcW w:type="dxa" w:w="2108"/>
+            <w:tcW w:type="dxa" w:w="1317"/>
           </w:tcPr>
           <w:p>
             <w:pPr>
@@ -33209,7 +34215,7 @@
         </w:tc>
         <w:tc>
           <w:tcPr>
-            <w:tcW w:type="dxa" w:w="2108"/>
+            <w:tcW w:type="dxa" w:w="1317"/>
           </w:tcPr>
           <w:p>
             <w:pPr>
@@ -33226,7 +34232,7 @@
         </w:tc>
         <w:tc>
           <w:tcPr>
-            <w:tcW w:type="dxa" w:w="2108"/>
+            <w:tcW w:type="dxa" w:w="1317"/>
           </w:tcPr>
           <w:p>
             <w:pPr>
@@ -33238,6 +34244,57 @@
                 <w:sz w:val="16"/>
               </w:rPr>
               <w:t>185</w:t>
+            </w:r>
+          </w:p>
+        </w:tc>
+        <w:tc>
+          <w:tcPr>
+            <w:tcW w:type="dxa" w:w="1317"/>
+          </w:tcPr>
+          <w:p>
+            <w:pPr>
+              <w:keepNext/>
+              <w:keepLines/>
+            </w:pPr>
+            <w:r>
+              <w:rPr>
+                <w:sz w:val="16"/>
+              </w:rPr>
+              <w:t>182</w:t>
+            </w:r>
+          </w:p>
+        </w:tc>
+        <w:tc>
+          <w:tcPr>
+            <w:tcW w:type="dxa" w:w="1317"/>
+          </w:tcPr>
+          <w:p>
+            <w:pPr>
+              <w:keepNext/>
+              <w:keepLines/>
+            </w:pPr>
+            <w:r>
+              <w:rPr>
+                <w:sz w:val="16"/>
+              </w:rPr>
+              <w:t>180</w:t>
+            </w:r>
+          </w:p>
+        </w:tc>
+        <w:tc>
+          <w:tcPr>
+            <w:tcW w:type="dxa" w:w="1317"/>
+          </w:tcPr>
+          <w:p>
+            <w:pPr>
+              <w:keepNext/>
+              <w:keepLines/>
+            </w:pPr>
+            <w:r>
+              <w:rPr>
+                <w:sz w:val="16"/>
+              </w:rPr>
+              <w:t>191</w:t>
             </w:r>
           </w:p>
         </w:tc>
@@ -33248,7 +34305,7 @@
         </w:trPr>
         <w:tc>
           <w:tcPr>
-            <w:tcW w:type="dxa" w:w="2108"/>
+            <w:tcW w:type="dxa" w:w="1317"/>
           </w:tcPr>
           <w:p>
             <w:pPr>
@@ -33265,7 +34322,7 @@
         </w:tc>
         <w:tc>
           <w:tcPr>
-            <w:tcW w:type="dxa" w:w="2108"/>
+            <w:tcW w:type="dxa" w:w="1317"/>
           </w:tcPr>
           <w:p>
             <w:pPr>
@@ -33282,7 +34339,7 @@
         </w:tc>
         <w:tc>
           <w:tcPr>
-            <w:tcW w:type="dxa" w:w="2108"/>
+            <w:tcW w:type="dxa" w:w="1317"/>
           </w:tcPr>
           <w:p>
             <w:pPr>
@@ -33299,7 +34356,7 @@
         </w:tc>
         <w:tc>
           <w:tcPr>
-            <w:tcW w:type="dxa" w:w="2108"/>
+            <w:tcW w:type="dxa" w:w="1317"/>
           </w:tcPr>
           <w:p>
             <w:pPr>
@@ -33316,7 +34373,7 @@
         </w:tc>
         <w:tc>
           <w:tcPr>
-            <w:tcW w:type="dxa" w:w="2108"/>
+            <w:tcW w:type="dxa" w:w="1317"/>
           </w:tcPr>
           <w:p>
             <w:pPr>
@@ -33328,6 +34385,57 @@
                 <w:sz w:val="16"/>
               </w:rPr>
               <w:t>26</w:t>
+            </w:r>
+          </w:p>
+        </w:tc>
+        <w:tc>
+          <w:tcPr>
+            <w:tcW w:type="dxa" w:w="1317"/>
+          </w:tcPr>
+          <w:p>
+            <w:pPr>
+              <w:keepNext/>
+              <w:keepLines/>
+            </w:pPr>
+            <w:r>
+              <w:rPr>
+                <w:sz w:val="16"/>
+              </w:rPr>
+              <w:t>26</w:t>
+            </w:r>
+          </w:p>
+        </w:tc>
+        <w:tc>
+          <w:tcPr>
+            <w:tcW w:type="dxa" w:w="1317"/>
+          </w:tcPr>
+          <w:p>
+            <w:pPr>
+              <w:keepNext/>
+              <w:keepLines/>
+            </w:pPr>
+            <w:r>
+              <w:rPr>
+                <w:sz w:val="16"/>
+              </w:rPr>
+              <w:t>29</w:t>
+            </w:r>
+          </w:p>
+        </w:tc>
+        <w:tc>
+          <w:tcPr>
+            <w:tcW w:type="dxa" w:w="1317"/>
+          </w:tcPr>
+          <w:p>
+            <w:pPr>
+              <w:keepNext/>
+              <w:keepLines/>
+            </w:pPr>
+            <w:r>
+              <w:rPr>
+                <w:sz w:val="16"/>
+              </w:rPr>
+              <w:t>33</w:t>
             </w:r>
           </w:p>
         </w:tc>
@@ -33338,7 +34446,7 @@
         </w:trPr>
         <w:tc>
           <w:tcPr>
-            <w:tcW w:type="dxa" w:w="2108"/>
+            <w:tcW w:type="dxa" w:w="1317"/>
           </w:tcPr>
           <w:p>
             <w:pPr>
@@ -33355,7 +34463,7 @@
         </w:tc>
         <w:tc>
           <w:tcPr>
-            <w:tcW w:type="dxa" w:w="2108"/>
+            <w:tcW w:type="dxa" w:w="1317"/>
           </w:tcPr>
           <w:p>
             <w:pPr>
@@ -33372,7 +34480,7 @@
         </w:tc>
         <w:tc>
           <w:tcPr>
-            <w:tcW w:type="dxa" w:w="2108"/>
+            <w:tcW w:type="dxa" w:w="1317"/>
           </w:tcPr>
           <w:p>
             <w:pPr>
@@ -33389,7 +34497,7 @@
         </w:tc>
         <w:tc>
           <w:tcPr>
-            <w:tcW w:type="dxa" w:w="2108"/>
+            <w:tcW w:type="dxa" w:w="1317"/>
           </w:tcPr>
           <w:p>
             <w:pPr>
@@ -33406,7 +34514,7 @@
         </w:tc>
         <w:tc>
           <w:tcPr>
-            <w:tcW w:type="dxa" w:w="2108"/>
+            <w:tcW w:type="dxa" w:w="1317"/>
           </w:tcPr>
           <w:p>
             <w:pPr>
@@ -33418,6 +34526,57 @@
                 <w:sz w:val="16"/>
               </w:rPr>
               <w:t>11.1</w:t>
+            </w:r>
+          </w:p>
+        </w:tc>
+        <w:tc>
+          <w:tcPr>
+            <w:tcW w:type="dxa" w:w="1317"/>
+          </w:tcPr>
+          <w:p>
+            <w:pPr>
+              <w:keepNext/>
+              <w:keepLines/>
+            </w:pPr>
+            <w:r>
+              <w:rPr>
+                <w:sz w:val="16"/>
+              </w:rPr>
+              <w:t>10.9</w:t>
+            </w:r>
+          </w:p>
+        </w:tc>
+        <w:tc>
+          <w:tcPr>
+            <w:tcW w:type="dxa" w:w="1317"/>
+          </w:tcPr>
+          <w:p>
+            <w:pPr>
+              <w:keepNext/>
+              <w:keepLines/>
+            </w:pPr>
+            <w:r>
+              <w:rPr>
+                <w:sz w:val="16"/>
+              </w:rPr>
+              <w:t>10.8</w:t>
+            </w:r>
+          </w:p>
+        </w:tc>
+        <w:tc>
+          <w:tcPr>
+            <w:tcW w:type="dxa" w:w="1317"/>
+          </w:tcPr>
+          <w:p>
+            <w:pPr>
+              <w:keepNext/>
+              <w:keepLines/>
+            </w:pPr>
+            <w:r>
+              <w:rPr>
+                <w:sz w:val="16"/>
+              </w:rPr>
+              <w:t>11.5</w:t>
             </w:r>
           </w:p>
         </w:tc>
@@ -33428,7 +34587,7 @@
         </w:trPr>
         <w:tc>
           <w:tcPr>
-            <w:tcW w:type="dxa" w:w="2108"/>
+            <w:tcW w:type="dxa" w:w="1317"/>
           </w:tcPr>
           <w:p>
             <w:pPr>
@@ -33445,7 +34604,7 @@
         </w:tc>
         <w:tc>
           <w:tcPr>
-            <w:tcW w:type="dxa" w:w="2108"/>
+            <w:tcW w:type="dxa" w:w="1317"/>
           </w:tcPr>
           <w:p>
             <w:pPr>
@@ -33462,7 +34621,7 @@
         </w:tc>
         <w:tc>
           <w:tcPr>
-            <w:tcW w:type="dxa" w:w="2108"/>
+            <w:tcW w:type="dxa" w:w="1317"/>
           </w:tcPr>
           <w:p>
             <w:pPr>
@@ -33479,7 +34638,7 @@
         </w:tc>
         <w:tc>
           <w:tcPr>
-            <w:tcW w:type="dxa" w:w="2108"/>
+            <w:tcW w:type="dxa" w:w="1317"/>
           </w:tcPr>
           <w:p>
             <w:pPr>
@@ -33496,7 +34655,7 @@
         </w:tc>
         <w:tc>
           <w:tcPr>
-            <w:tcW w:type="dxa" w:w="2108"/>
+            <w:tcW w:type="dxa" w:w="1317"/>
           </w:tcPr>
           <w:p>
             <w:pPr>
@@ -33508,6 +34667,57 @@
                 <w:sz w:val="16"/>
               </w:rPr>
               <w:t>0.43</w:t>
+            </w:r>
+          </w:p>
+        </w:tc>
+        <w:tc>
+          <w:tcPr>
+            <w:tcW w:type="dxa" w:w="1317"/>
+          </w:tcPr>
+          <w:p>
+            <w:pPr>
+              <w:keepNext/>
+              <w:keepLines/>
+            </w:pPr>
+            <w:r>
+              <w:rPr>
+                <w:sz w:val="16"/>
+              </w:rPr>
+              <w:t>0.41</w:t>
+            </w:r>
+          </w:p>
+        </w:tc>
+        <w:tc>
+          <w:tcPr>
+            <w:tcW w:type="dxa" w:w="1317"/>
+          </w:tcPr>
+          <w:p>
+            <w:pPr>
+              <w:keepNext/>
+              <w:keepLines/>
+            </w:pPr>
+            <w:r>
+              <w:rPr>
+                <w:sz w:val="16"/>
+              </w:rPr>
+              <w:t>0.37</w:t>
+            </w:r>
+          </w:p>
+        </w:tc>
+        <w:tc>
+          <w:tcPr>
+            <w:tcW w:type="dxa" w:w="1317"/>
+          </w:tcPr>
+          <w:p>
+            <w:pPr>
+              <w:keepNext/>
+              <w:keepLines/>
+            </w:pPr>
+            <w:r>
+              <w:rPr>
+                <w:sz w:val="16"/>
+              </w:rPr>
+              <w:t>0.34</w:t>
             </w:r>
           </w:p>
         </w:tc>
@@ -33518,7 +34728,7 @@
         </w:trPr>
         <w:tc>
           <w:tcPr>
-            <w:tcW w:type="dxa" w:w="2108"/>
+            <w:tcW w:type="dxa" w:w="1317"/>
           </w:tcPr>
           <w:p>
             <w:r>
@@ -33531,7 +34741,7 @@
         </w:tc>
         <w:tc>
           <w:tcPr>
-            <w:tcW w:type="dxa" w:w="2108"/>
+            <w:tcW w:type="dxa" w:w="1317"/>
           </w:tcPr>
           <w:p>
             <w:r>
@@ -33544,7 +34754,7 @@
         </w:tc>
         <w:tc>
           <w:tcPr>
-            <w:tcW w:type="dxa" w:w="2108"/>
+            <w:tcW w:type="dxa" w:w="1317"/>
           </w:tcPr>
           <w:p>
             <w:r>
@@ -33557,7 +34767,7 @@
         </w:tc>
         <w:tc>
           <w:tcPr>
-            <w:tcW w:type="dxa" w:w="2108"/>
+            <w:tcW w:type="dxa" w:w="1317"/>
           </w:tcPr>
           <w:p>
             <w:r>
@@ -33570,7 +34780,46 @@
         </w:tc>
         <w:tc>
           <w:tcPr>
-            <w:tcW w:type="dxa" w:w="2108"/>
+            <w:tcW w:type="dxa" w:w="1317"/>
+          </w:tcPr>
+          <w:p>
+            <w:r>
+              <w:rPr>
+                <w:sz w:val="16"/>
+              </w:rPr>
+              <w:t>4.0</w:t>
+            </w:r>
+          </w:p>
+        </w:tc>
+        <w:tc>
+          <w:tcPr>
+            <w:tcW w:type="dxa" w:w="1317"/>
+          </w:tcPr>
+          <w:p>
+            <w:r>
+              <w:rPr>
+                <w:sz w:val="16"/>
+              </w:rPr>
+              <w:t>4.0</w:t>
+            </w:r>
+          </w:p>
+        </w:tc>
+        <w:tc>
+          <w:tcPr>
+            <w:tcW w:type="dxa" w:w="1317"/>
+          </w:tcPr>
+          <w:p>
+            <w:r>
+              <w:rPr>
+                <w:sz w:val="16"/>
+              </w:rPr>
+              <w:t>4.0</w:t>
+            </w:r>
+          </w:p>
+        </w:tc>
+        <w:tc>
+          <w:tcPr>
+            <w:tcW w:type="dxa" w:w="1317"/>
           </w:tcPr>
           <w:p>
             <w:r>
@@ -33637,7 +34886,7 @@
         <w:rPr>
           <w:i/>
         </w:rPr>
-        <w:t>Figure C3 – Eligible pool, one-time therapy class demand and class volume (three-year ramp), FY2026E–FY2031E, base case. DBS (3,990 a year) is shown for context and is not deducted. Source: C40–C45.</w:t>
+        <w:t>Figure C3 – Eligible pool, one-time therapy class demand and class volume (three-year ramp), FY2026E–FY2040E, base case. After FY2031E the chart is demand and pool context; the revenue forecast ends at FY2031E. DBS (3,990 a year) is shown for context and is not deducted. Source: C40–C45.</w:t>
       </w:r>
     </w:p>
     <w:p>
@@ -33648,7 +34897,7 @@
         <w:t>Reading the results.</w:t>
       </w:r>
       <w:r>
-        <w:t xml:space="preserve"> One-time treatment starts at about 11,800 in the launch year; the high first year comes from the backlog built up before launch [C40]. The pool then shrinks, to about 185,000 at the start of FY2031E, as the backlog is drawn down. In the long run class demand would settle at a constant share of entrants, 0.06 / (0.095 + 0.06 + 0.029) ≈ 33% (derived, a property of the model rather than a forecast) [C45]. That is a different quantity from the share of any single group of entrants who are eventually treated, 0.06 / (0.095 + 0.06) ≈ 39% (derived), because each year's entrants outnumber the previous year's. There is no second wave. As a plausibility check, a judgment funnel of referral (55%) × willingness (60%) × coverage (90%) gives about 30% treated [S45]; willingness is anchored to published consent and implant rates [A14][A40]. A 6% treatment rate therefore implies somewhat more uptake than that funnel. At $20,000 a patient, FY2031E class demand is worth about $223M (derived) [C40][P2].</w:t>
+        <w:t xml:space="preserve"> One-time treatment starts at about 11,800 in the launch year; the high first year comes from the backlog built up before launch [C40]. The pool then shrinks by about 8% over five years and grows again with entrants. Class demand settles at a constant share of entrants, 0.06 / (0.095 + 0.06 + 0.029) ≈ 33% (derived) [C45]. That is a different quantity from the share of any single group of entrants who are eventually treated, 0.06 / (0.095 + 0.06) ≈ 39% (derived), because each year's entrants outnumber the previous year's. There is no second wave. As a plausibility check, a judgment funnel of referral (55%) × willingness (60%) × coverage (90%) gives about 30% treated [S45]; willingness is anchored to published consent and implant rates [A14][A40]. A 6% treatment rate therefore implies somewhat more uptake than that funnel. At $20,000 a patient, FY2031E class demand is worth about $223M (derived) [C40][P2]; FY2040E demand (about 11,500) is context only, not a revenue forecast.</w:t>
       </w:r>
     </w:p>
     <w:p>
@@ -33659,7 +34908,7 @@
         <w:t>Weak points.</w:t>
       </w:r>
       <w:r>
-        <w:t xml:space="preserve"> (1) The motor-complication share and medical fitness are judgments, and together they move the pool more than any published input [S46][S47]. (2) The diagnosis factor is a proxy for levodopa response [A35]. (3) The dementia midpoint, and the assumption that dementia sits almost entirely in patients diagnosed four or more years ago, are simplifications [A32]. (4) The 5% death rate comes from all PD patients; patients without dementia probably die less often, which would lengthen time in the pool [A31]. (5) The pool includes patients who have had DBS, on the assumption that they are eligible for one-time therapy [S44]; every trial so far excludes them [A41], and if labels did too the pool would be about 138,000, as in the bear [C55]. (6) The 3,990 counts inpatient procedures only [A10]. (7) Prevalence is a published minimum, so the pool is more likely too low than too high [A30]. (8) The 6% treatment rate and the FY2029E launch are assumptions [S45]. The 6% rests on the judgment that a one-time therapy would draw about 2.7 times DBS's take-up, which no published willingness study supports [C49]. The often-quoted 2.9% DBS rate is measured against a pool that excludes prior-DBS patients (138,000), not the 180,000 used here [C49]. The bull uses 8% (Figure 4c) [S59]. The model treats the whole class as launching in FY2029E, while other one-time therapies are likely to launch after FY2031E (Appendix D). (9) DBS and one-time therapy are modelled independently; a patient who has both (for example DBS after a graft for residual symptoms) is not counted as an extra ClearPoint procedure, which is on the low side [A42].</w:t>
+        <w:t xml:space="preserve"> (1) The motor-complication share and medical fitness are judgments, and together they move the pool more than any published input [S46][S47]. (2) The diagnosis factor is a proxy for levodopa response [A35]. (3) The dementia midpoint, and the assumption that dementia sits almost entirely in patients diagnosed four or more years ago, are simplifications [A32]. (4) The 5% death rate comes from all PD patients; patients without dementia probably die less often, which would lengthen time in the pool [A31]. (5) The pool includes patients who have had DBS, on the assumption that they are eligible for one-time therapy [S44]; every trial so far excludes them [A41], and if labels did too the pool would be about 138,000, as in the bear [C55]. (6) The 3,990 counts inpatient procedures only [A10]. (7) Prevalence is a published minimum, so the pool is more likely too low than too high [A30]. (8) The 6% treatment rate and the FY2029E launch are assumptions [S45]. The 6% rests on the judgment that a one-time therapy would draw about 2.7 times DBS's take-up, which no published willingness study supports [C49]. The often-quoted 2.9% DBS rate is measured against a pool that excludes prior-DBS patients (138,000), not the 180,000 used here [C49]. The bull uses 8% (Figure 4c) [S59]. The model treats the whole class as launching in FY2029E, while other one-time therapies are likely to launch from FY2033E (Appendix D). (9) DBS and one-time therapy are modelled independently; a patient who has both (for example DBS after a graft for residual symptoms) is not counted as an extra ClearPoint procedure, which is on the low side [A42].</w:t>
       </w:r>
     </w:p>
     <w:p>
@@ -36440,7 +37689,7 @@
               <w:rPr>
                 <w:sz w:val="16"/>
               </w:rPr>
-              <w:t>FY2029 ~11,800; FY2030 ~11,400; FY2031 ~11,100</w:t>
+              <w:t>FY2029 ~11,800; FY2031 ~11,100; FY2035 ~10,800; FY2040 ~11,500</w:t>
             </w:r>
           </w:p>
         </w:tc>

</xml_diff>

<commit_message>
CLPT v11 report: add Figure 5b, bull case by line (David, 2026-10-26)
</commit_message>
<xml_diff>
--- a/forecasts/CLPT/report.docx
+++ b/forecasts/CLPT/report.docx
@@ -92,7 +92,7 @@
         <w:t>One-time Parkinson's cell/gene therapy procedures (the class, all on ClearPoint's platform) ramp over three years from the FY2029E launch to class demand: about 3,900 in FY2029E, 7,600 in FY2030E and 11,100 in FY2031E [S31][S62][S63][S64][C40] ★.</w:t>
       </w:r>
       <w:r>
-        <w:t xml:space="preserve"> We size demand for the whole class of one-time Parkinson's cell and gene therapies from published prevalence, label-style eligibility (levodopa-responsive, at least four years since diagnosis, motor complications, no dementia, fit for surgery) and a stock-and-flow pool (Appendix C) [A30][C42]. About 180,000 US patients are medically eligible in FY2026E, 16% of PD [C42]. DBS and one-time therapy are not treated as mutually exclusive: trials exclude patients who have had DBS, but that is an entry rule and we found no biological or safety reason for it, so these patients stay in the pool [S44][A41]–[A43] ★. About 3,990 eligible patients receive DBS each year, 2.2% of the pool [A10][C49]. We assume 6% of the pool a year would receive a one-time, potentially disease-modifying therapy from FY2029E, about 2.7 times the DBS rate. DBS continues alongside and is not deducted [S45] ★. Class demand is about 11,800 in the launch year, eases to about 10,800 in FY2033E–35E as the backlog is drawn down, then rises with the pool to 11,500 in FY2040E [C40]; the post-FY2031E path is demand context only, as the valuation fades revenue growth from FY2032E [P3]. Volume reaches demand in FY2031E. The three-year ramp is David's judgment that it also gives time for other Parkinson's therapies to be approved [S64] ★. Running 11,100 Parkinson's procedures a year needs about 74 centres at 3 cases a week, far beyond the 20–30 centres management talks about, an aggressive judgment [S43][G7] ★. We treat all one-time PD cell/gene procedures as one class on ClearPoint's platform (100% share, David's view) [S62][S63] ★. The bull treats 8% of the pool a year on the same ramp, giving 14,300 procedures in FY2031E [S59][C46] ★. The bear excludes patients who have had DBS, as trials do (pool about 138,000), and is limited by a capacity ramp after a 2030 approval, reaching 2,500 procedures in FY2031E [S22][S43][C55]. AMT-130 is unchanged at 3,000 a year from FY2030E [S30].</w:t>
+        <w:t xml:space="preserve"> We size demand for the whole class of one-time Parkinson's cell and gene therapies from published prevalence, label-style eligibility (levodopa-responsive, at least four years since diagnosis, motor complications, no dementia, fit for surgery) and a stock-and-flow pool (Appendix C) [A30][C42]. About 180,000 US patients are medically eligible in FY2026E, 16% of PD [C42]. DBS and one-time therapy are not treated as mutually exclusive: trials exclude patients who have had DBS, but that is an entry rule and we found no biological or safety reason for it, so these patients stay in the pool [S44][A41]–[A43] ★. About 3,990 eligible patients receive DBS each year, 2.2% of the pool [A10][C49]. We assume 6% of the pool a year would receive a one-time, potentially disease-modifying therapy from FY2029E, about 2.7 times the DBS rate. DBS continues alongside and is not deducted [S45] ★. Class demand is about 11,800 in the launch year, eases to about 10,800 in FY2033E–35E as the backlog is drawn down, then rises with the pool to 11,500 in FY2040E [C40]; the post-FY2031E path is demand context only, as the valuation fades revenue growth from FY2032E [P3]. Volume reaches demand in FY2031E. The three-year ramp is David's judgment that it also gives time for other Parkinson's therapies to be approved [S64] ★. Running 11,100 Parkinson's procedures a year needs about 74 centres at 3 cases a week, far beyond the 20–30 centres management talks about, an aggressive judgment [S43][G7] ★. We treat all one-time PD cell/gene procedures as one class on ClearPoint's platform (100% share, David's view) [S62][S63] ★. The bull treats 8% of the pool a year on the same ramp, giving 14,300 procedures in FY2031E [S59][C46] ★; bull revenue by line is in Figure 5b. The bear excludes patients who have had DBS, as trials do (pool about 138,000), and is limited by a capacity ramp after a 2030 approval, reaching 2,500 procedures in FY2031E [S22][S43][C55]. AMT-130 is unchanged at 3,000 a year from FY2030E [S30].</w:t>
       </w:r>
     </w:p>
     <w:p>
@@ -6098,7 +6098,7 @@
     </w:p>
     <w:p>
       <w:r>
-        <w:t>Figure 5 shows the procedure line reaching 61% of revenue in FY2029E and 69% in FY2031E, with CAL at 7% (derived). Growth peaks in FY2028E–29E as AMT-130 and then the Parkinson's class launch, then slows to 28.3% in FY2031E as the Parkinson's ramp completes. The explicit forecast ends at FY2031E. The underlying line model (forecast.json) also carries an FY2032E year, which is not presented; the valuation uses Finagle's fade from FY2032E instead.</w:t>
+        <w:t>Figure 5 shows the procedure line reaching 61% of revenue in FY2029E and 69% in FY2031E, with CAL at 7% (derived). Growth peaks in FY2028E–29E as AMT-130 and then the Parkinson's class launch, then slows to 28.3% in FY2031E as the Parkinson's ramp completes. The explicit forecast ends at FY2031E. The underlying line model (forecast.json) also carries an FY2032E year, which is not presented; the valuation uses Finagle's fade from FY2032E instead. Figure 5b shows the same view for the bull case.</w:t>
       </w:r>
     </w:p>
     <w:p>
@@ -7865,11 +7865,1797 @@
     </w:tbl>
     <w:p/>
     <w:p>
+      <w:pPr>
+        <w:keepNext/>
+        <w:keepLines/>
+      </w:pPr>
       <w:r>
         <w:rPr>
           <w:i/>
         </w:rPr>
         <w:t>Source: A1–A4, C2, C5, C7, C9, C10, S1–S7, S15, S20–S26, S30–S32, S37, S38, P2. CAL revenue is reported inside biologics and drug delivery; it is shown separately here. May not sum due to rounding.</w:t>
+      </w:r>
+    </w:p>
+    <w:p>
+      <w:pPr>
+        <w:keepNext/>
+        <w:keepLines/>
+      </w:pPr>
+      <w:r>
+        <w:rPr>
+          <w:b/>
+        </w:rPr>
+        <w:t>Figure 5b – Bull case by line</w:t>
+      </w:r>
+    </w:p>
+    <w:tbl>
+      <w:tblPr>
+        <w:tblStyle w:val="TableGrid"/>
+        <w:tblW w:type="auto" w:w="0"/>
+        <w:tblLook w:firstColumn="1" w:firstRow="1" w:lastColumn="0" w:lastRow="0" w:noHBand="0" w:noVBand="1" w:val="04A0"/>
+      </w:tblPr>
+      <w:tblGrid>
+        <w:gridCol w:w="1054"/>
+        <w:gridCol w:w="1054"/>
+        <w:gridCol w:w="1054"/>
+        <w:gridCol w:w="1054"/>
+        <w:gridCol w:w="1054"/>
+        <w:gridCol w:w="1054"/>
+        <w:gridCol w:w="1054"/>
+        <w:gridCol w:w="1054"/>
+        <w:gridCol w:w="1054"/>
+        <w:gridCol w:w="1054"/>
+      </w:tblGrid>
+      <w:tr>
+        <w:trPr>
+          <w:cantSplit/>
+          <w:tblHeader/>
+        </w:trPr>
+        <w:tc>
+          <w:tcPr>
+            <w:tcW w:type="dxa" w:w="1054"/>
+          </w:tcPr>
+          <w:p>
+            <w:pPr>
+              <w:keepNext/>
+              <w:keepLines/>
+            </w:pPr>
+            <w:r>
+              <w:rPr>
+                <w:b/>
+                <w:sz w:val="14"/>
+              </w:rPr>
+              <w:t>US$M</w:t>
+            </w:r>
+          </w:p>
+        </w:tc>
+        <w:tc>
+          <w:tcPr>
+            <w:tcW w:type="dxa" w:w="1054"/>
+          </w:tcPr>
+          <w:p>
+            <w:pPr>
+              <w:keepNext/>
+              <w:keepLines/>
+            </w:pPr>
+            <w:r>
+              <w:rPr>
+                <w:b/>
+                <w:sz w:val="14"/>
+              </w:rPr>
+              <w:t>FY2024A</w:t>
+            </w:r>
+          </w:p>
+        </w:tc>
+        <w:tc>
+          <w:tcPr>
+            <w:tcW w:type="dxa" w:w="1054"/>
+          </w:tcPr>
+          <w:p>
+            <w:pPr>
+              <w:keepNext/>
+              <w:keepLines/>
+            </w:pPr>
+            <w:r>
+              <w:rPr>
+                <w:b/>
+                <w:sz w:val="14"/>
+              </w:rPr>
+              <w:t>FY2025A</w:t>
+            </w:r>
+          </w:p>
+        </w:tc>
+        <w:tc>
+          <w:tcPr>
+            <w:tcW w:type="dxa" w:w="1054"/>
+          </w:tcPr>
+          <w:p>
+            <w:pPr>
+              <w:keepNext/>
+              <w:keepLines/>
+            </w:pPr>
+            <w:r>
+              <w:rPr>
+                <w:b/>
+                <w:sz w:val="14"/>
+              </w:rPr>
+              <w:t>H1 2026A</w:t>
+            </w:r>
+          </w:p>
+        </w:tc>
+        <w:tc>
+          <w:tcPr>
+            <w:tcW w:type="dxa" w:w="1054"/>
+          </w:tcPr>
+          <w:p>
+            <w:pPr>
+              <w:keepNext/>
+              <w:keepLines/>
+            </w:pPr>
+            <w:r>
+              <w:rPr>
+                <w:b/>
+                <w:sz w:val="14"/>
+              </w:rPr>
+              <w:t>FY2026E</w:t>
+            </w:r>
+          </w:p>
+        </w:tc>
+        <w:tc>
+          <w:tcPr>
+            <w:tcW w:type="dxa" w:w="1054"/>
+          </w:tcPr>
+          <w:p>
+            <w:pPr>
+              <w:keepNext/>
+              <w:keepLines/>
+            </w:pPr>
+            <w:r>
+              <w:rPr>
+                <w:b/>
+                <w:sz w:val="14"/>
+              </w:rPr>
+              <w:t>FY2027E</w:t>
+            </w:r>
+          </w:p>
+        </w:tc>
+        <w:tc>
+          <w:tcPr>
+            <w:tcW w:type="dxa" w:w="1054"/>
+          </w:tcPr>
+          <w:p>
+            <w:pPr>
+              <w:keepNext/>
+              <w:keepLines/>
+            </w:pPr>
+            <w:r>
+              <w:rPr>
+                <w:b/>
+                <w:sz w:val="14"/>
+              </w:rPr>
+              <w:t>FY2028E</w:t>
+            </w:r>
+          </w:p>
+        </w:tc>
+        <w:tc>
+          <w:tcPr>
+            <w:tcW w:type="dxa" w:w="1054"/>
+          </w:tcPr>
+          <w:p>
+            <w:pPr>
+              <w:keepNext/>
+              <w:keepLines/>
+            </w:pPr>
+            <w:r>
+              <w:rPr>
+                <w:b/>
+                <w:sz w:val="14"/>
+              </w:rPr>
+              <w:t>FY2029E</w:t>
+            </w:r>
+          </w:p>
+        </w:tc>
+        <w:tc>
+          <w:tcPr>
+            <w:tcW w:type="dxa" w:w="1054"/>
+          </w:tcPr>
+          <w:p>
+            <w:pPr>
+              <w:keepNext/>
+              <w:keepLines/>
+            </w:pPr>
+            <w:r>
+              <w:rPr>
+                <w:b/>
+                <w:sz w:val="14"/>
+              </w:rPr>
+              <w:t>FY2030E</w:t>
+            </w:r>
+          </w:p>
+        </w:tc>
+        <w:tc>
+          <w:tcPr>
+            <w:tcW w:type="dxa" w:w="1054"/>
+          </w:tcPr>
+          <w:p>
+            <w:pPr>
+              <w:keepNext/>
+              <w:keepLines/>
+            </w:pPr>
+            <w:r>
+              <w:rPr>
+                <w:b/>
+                <w:sz w:val="14"/>
+              </w:rPr>
+              <w:t>FY2031E</w:t>
+            </w:r>
+          </w:p>
+        </w:tc>
+      </w:tr>
+      <w:tr>
+        <w:trPr>
+          <w:cantSplit/>
+        </w:trPr>
+        <w:tc>
+          <w:tcPr>
+            <w:tcW w:type="dxa" w:w="1054"/>
+          </w:tcPr>
+          <w:p>
+            <w:pPr>
+              <w:keepNext/>
+              <w:keepLines/>
+            </w:pPr>
+            <w:r>
+              <w:rPr>
+                <w:sz w:val="14"/>
+              </w:rPr>
+              <w:t>Biologics and drug delivery</w:t>
+            </w:r>
+          </w:p>
+        </w:tc>
+        <w:tc>
+          <w:tcPr>
+            <w:tcW w:type="dxa" w:w="1054"/>
+          </w:tcPr>
+          <w:p>
+            <w:pPr>
+              <w:keepNext/>
+              <w:keepLines/>
+            </w:pPr>
+            <w:r>
+              <w:rPr>
+                <w:sz w:val="14"/>
+              </w:rPr>
+              <w:t>17.3</w:t>
+            </w:r>
+          </w:p>
+        </w:tc>
+        <w:tc>
+          <w:tcPr>
+            <w:tcW w:type="dxa" w:w="1054"/>
+          </w:tcPr>
+          <w:p>
+            <w:pPr>
+              <w:keepNext/>
+              <w:keepLines/>
+            </w:pPr>
+            <w:r>
+              <w:rPr>
+                <w:sz w:val="14"/>
+              </w:rPr>
+              <w:t>19.0</w:t>
+            </w:r>
+          </w:p>
+        </w:tc>
+        <w:tc>
+          <w:tcPr>
+            <w:tcW w:type="dxa" w:w="1054"/>
+          </w:tcPr>
+          <w:p>
+            <w:pPr>
+              <w:keepNext/>
+              <w:keepLines/>
+            </w:pPr>
+            <w:r>
+              <w:rPr>
+                <w:sz w:val="14"/>
+              </w:rPr>
+              <w:t>8.8</w:t>
+            </w:r>
+          </w:p>
+        </w:tc>
+        <w:tc>
+          <w:tcPr>
+            <w:tcW w:type="dxa" w:w="1054"/>
+          </w:tcPr>
+          <w:p>
+            <w:pPr>
+              <w:keepNext/>
+              <w:keepLines/>
+            </w:pPr>
+            <w:r>
+              <w:rPr>
+                <w:sz w:val="14"/>
+              </w:rPr>
+              <w:t>20.1</w:t>
+            </w:r>
+          </w:p>
+        </w:tc>
+        <w:tc>
+          <w:tcPr>
+            <w:tcW w:type="dxa" w:w="1054"/>
+          </w:tcPr>
+          <w:p>
+            <w:pPr>
+              <w:keepNext/>
+              <w:keepLines/>
+            </w:pPr>
+            <w:r>
+              <w:rPr>
+                <w:sz w:val="14"/>
+              </w:rPr>
+              <w:t>23.1</w:t>
+            </w:r>
+          </w:p>
+        </w:tc>
+        <w:tc>
+          <w:tcPr>
+            <w:tcW w:type="dxa" w:w="1054"/>
+          </w:tcPr>
+          <w:p>
+            <w:pPr>
+              <w:keepNext/>
+              <w:keepLines/>
+            </w:pPr>
+            <w:r>
+              <w:rPr>
+                <w:sz w:val="14"/>
+              </w:rPr>
+              <w:t>27.2</w:t>
+            </w:r>
+          </w:p>
+        </w:tc>
+        <w:tc>
+          <w:tcPr>
+            <w:tcW w:type="dxa" w:w="1054"/>
+          </w:tcPr>
+          <w:p>
+            <w:pPr>
+              <w:keepNext/>
+              <w:keepLines/>
+            </w:pPr>
+            <w:r>
+              <w:rPr>
+                <w:sz w:val="14"/>
+              </w:rPr>
+              <w:t>32.1</w:t>
+            </w:r>
+          </w:p>
+        </w:tc>
+        <w:tc>
+          <w:tcPr>
+            <w:tcW w:type="dxa" w:w="1054"/>
+          </w:tcPr>
+          <w:p>
+            <w:pPr>
+              <w:keepNext/>
+              <w:keepLines/>
+            </w:pPr>
+            <w:r>
+              <w:rPr>
+                <w:sz w:val="14"/>
+              </w:rPr>
+              <w:t>37.9</w:t>
+            </w:r>
+          </w:p>
+        </w:tc>
+        <w:tc>
+          <w:tcPr>
+            <w:tcW w:type="dxa" w:w="1054"/>
+          </w:tcPr>
+          <w:p>
+            <w:pPr>
+              <w:keepNext/>
+              <w:keepLines/>
+            </w:pPr>
+            <w:r>
+              <w:rPr>
+                <w:sz w:val="14"/>
+              </w:rPr>
+              <w:t>44.8</w:t>
+            </w:r>
+          </w:p>
+        </w:tc>
+      </w:tr>
+      <w:tr>
+        <w:trPr>
+          <w:cantSplit/>
+        </w:trPr>
+        <w:tc>
+          <w:tcPr>
+            <w:tcW w:type="dxa" w:w="1054"/>
+          </w:tcPr>
+          <w:p>
+            <w:pPr>
+              <w:keepNext/>
+              <w:keepLines/>
+            </w:pPr>
+            <w:r>
+              <w:rPr>
+                <w:sz w:val="14"/>
+              </w:rPr>
+              <w:t>Neurosurgery navigation and therapy</w:t>
+            </w:r>
+          </w:p>
+        </w:tc>
+        <w:tc>
+          <w:tcPr>
+            <w:tcW w:type="dxa" w:w="1054"/>
+          </w:tcPr>
+          <w:p>
+            <w:pPr>
+              <w:keepNext/>
+              <w:keepLines/>
+            </w:pPr>
+            <w:r>
+              <w:rPr>
+                <w:sz w:val="14"/>
+              </w:rPr>
+              <w:t>10.3</w:t>
+            </w:r>
+          </w:p>
+        </w:tc>
+        <w:tc>
+          <w:tcPr>
+            <w:tcW w:type="dxa" w:w="1054"/>
+          </w:tcPr>
+          <w:p>
+            <w:pPr>
+              <w:keepNext/>
+              <w:keepLines/>
+            </w:pPr>
+            <w:r>
+              <w:rPr>
+                <w:sz w:val="14"/>
+              </w:rPr>
+              <w:t>14.8</w:t>
+            </w:r>
+          </w:p>
+        </w:tc>
+        <w:tc>
+          <w:tcPr>
+            <w:tcW w:type="dxa" w:w="1054"/>
+          </w:tcPr>
+          <w:p>
+            <w:pPr>
+              <w:keepNext/>
+              <w:keepLines/>
+            </w:pPr>
+            <w:r>
+              <w:rPr>
+                <w:sz w:val="14"/>
+              </w:rPr>
+              <w:t>11.4</w:t>
+            </w:r>
+          </w:p>
+        </w:tc>
+        <w:tc>
+          <w:tcPr>
+            <w:tcW w:type="dxa" w:w="1054"/>
+          </w:tcPr>
+          <w:p>
+            <w:pPr>
+              <w:keepNext/>
+              <w:keepLines/>
+            </w:pPr>
+            <w:r>
+              <w:rPr>
+                <w:sz w:val="14"/>
+              </w:rPr>
+              <w:t>24.2</w:t>
+            </w:r>
+          </w:p>
+        </w:tc>
+        <w:tc>
+          <w:tcPr>
+            <w:tcW w:type="dxa" w:w="1054"/>
+          </w:tcPr>
+          <w:p>
+            <w:pPr>
+              <w:keepNext/>
+              <w:keepLines/>
+            </w:pPr>
+            <w:r>
+              <w:rPr>
+                <w:sz w:val="14"/>
+              </w:rPr>
+              <w:t>27.8</w:t>
+            </w:r>
+          </w:p>
+        </w:tc>
+        <w:tc>
+          <w:tcPr>
+            <w:tcW w:type="dxa" w:w="1054"/>
+          </w:tcPr>
+          <w:p>
+            <w:pPr>
+              <w:keepNext/>
+              <w:keepLines/>
+            </w:pPr>
+            <w:r>
+              <w:rPr>
+                <w:sz w:val="14"/>
+              </w:rPr>
+              <w:t>32.8</w:t>
+            </w:r>
+          </w:p>
+        </w:tc>
+        <w:tc>
+          <w:tcPr>
+            <w:tcW w:type="dxa" w:w="1054"/>
+          </w:tcPr>
+          <w:p>
+            <w:pPr>
+              <w:keepNext/>
+              <w:keepLines/>
+            </w:pPr>
+            <w:r>
+              <w:rPr>
+                <w:sz w:val="14"/>
+              </w:rPr>
+              <w:t>38.7</w:t>
+            </w:r>
+          </w:p>
+        </w:tc>
+        <w:tc>
+          <w:tcPr>
+            <w:tcW w:type="dxa" w:w="1054"/>
+          </w:tcPr>
+          <w:p>
+            <w:pPr>
+              <w:keepNext/>
+              <w:keepLines/>
+            </w:pPr>
+            <w:r>
+              <w:rPr>
+                <w:sz w:val="14"/>
+              </w:rPr>
+              <w:t>45.7</w:t>
+            </w:r>
+          </w:p>
+        </w:tc>
+        <w:tc>
+          <w:tcPr>
+            <w:tcW w:type="dxa" w:w="1054"/>
+          </w:tcPr>
+          <w:p>
+            <w:pPr>
+              <w:keepNext/>
+              <w:keepLines/>
+            </w:pPr>
+            <w:r>
+              <w:rPr>
+                <w:sz w:val="14"/>
+              </w:rPr>
+              <w:t>53.9</w:t>
+            </w:r>
+          </w:p>
+        </w:tc>
+      </w:tr>
+      <w:tr>
+        <w:trPr>
+          <w:cantSplit/>
+        </w:trPr>
+        <w:tc>
+          <w:tcPr>
+            <w:tcW w:type="dxa" w:w="1054"/>
+          </w:tcPr>
+          <w:p>
+            <w:pPr>
+              <w:keepNext/>
+              <w:keepLines/>
+            </w:pPr>
+            <w:r>
+              <w:rPr>
+                <w:sz w:val="14"/>
+              </w:rPr>
+              <w:t>Capital equipment and software</w:t>
+            </w:r>
+          </w:p>
+        </w:tc>
+        <w:tc>
+          <w:tcPr>
+            <w:tcW w:type="dxa" w:w="1054"/>
+          </w:tcPr>
+          <w:p>
+            <w:pPr>
+              <w:keepNext/>
+              <w:keepLines/>
+            </w:pPr>
+            <w:r>
+              <w:rPr>
+                <w:sz w:val="14"/>
+              </w:rPr>
+              <w:t>3.8</w:t>
+            </w:r>
+          </w:p>
+        </w:tc>
+        <w:tc>
+          <w:tcPr>
+            <w:tcW w:type="dxa" w:w="1054"/>
+          </w:tcPr>
+          <w:p>
+            <w:pPr>
+              <w:keepNext/>
+              <w:keepLines/>
+            </w:pPr>
+            <w:r>
+              <w:rPr>
+                <w:sz w:val="14"/>
+              </w:rPr>
+              <w:t>3.1</w:t>
+            </w:r>
+          </w:p>
+        </w:tc>
+        <w:tc>
+          <w:tcPr>
+            <w:tcW w:type="dxa" w:w="1054"/>
+          </w:tcPr>
+          <w:p>
+            <w:pPr>
+              <w:keepNext/>
+              <w:keepLines/>
+            </w:pPr>
+            <w:r>
+              <w:rPr>
+                <w:sz w:val="14"/>
+              </w:rPr>
+              <w:t>2.7</w:t>
+            </w:r>
+          </w:p>
+        </w:tc>
+        <w:tc>
+          <w:tcPr>
+            <w:tcW w:type="dxa" w:w="1054"/>
+          </w:tcPr>
+          <w:p>
+            <w:pPr>
+              <w:keepNext/>
+              <w:keepLines/>
+            </w:pPr>
+            <w:r>
+              <w:rPr>
+                <w:sz w:val="14"/>
+              </w:rPr>
+              <w:t>5.8</w:t>
+            </w:r>
+          </w:p>
+        </w:tc>
+        <w:tc>
+          <w:tcPr>
+            <w:tcW w:type="dxa" w:w="1054"/>
+          </w:tcPr>
+          <w:p>
+            <w:pPr>
+              <w:keepNext/>
+              <w:keepLines/>
+            </w:pPr>
+            <w:r>
+              <w:rPr>
+                <w:sz w:val="14"/>
+              </w:rPr>
+              <w:t>6.2</w:t>
+            </w:r>
+          </w:p>
+        </w:tc>
+        <w:tc>
+          <w:tcPr>
+            <w:tcW w:type="dxa" w:w="1054"/>
+          </w:tcPr>
+          <w:p>
+            <w:pPr>
+              <w:keepNext/>
+              <w:keepLines/>
+            </w:pPr>
+            <w:r>
+              <w:rPr>
+                <w:sz w:val="14"/>
+              </w:rPr>
+              <w:t>7.3</w:t>
+            </w:r>
+          </w:p>
+        </w:tc>
+        <w:tc>
+          <w:tcPr>
+            <w:tcW w:type="dxa" w:w="1054"/>
+          </w:tcPr>
+          <w:p>
+            <w:pPr>
+              <w:keepNext/>
+              <w:keepLines/>
+            </w:pPr>
+            <w:r>
+              <w:rPr>
+                <w:sz w:val="14"/>
+              </w:rPr>
+              <w:t>8.7</w:t>
+            </w:r>
+          </w:p>
+        </w:tc>
+        <w:tc>
+          <w:tcPr>
+            <w:tcW w:type="dxa" w:w="1054"/>
+          </w:tcPr>
+          <w:p>
+            <w:pPr>
+              <w:keepNext/>
+              <w:keepLines/>
+            </w:pPr>
+            <w:r>
+              <w:rPr>
+                <w:sz w:val="14"/>
+              </w:rPr>
+              <w:t>10.2</w:t>
+            </w:r>
+          </w:p>
+        </w:tc>
+        <w:tc>
+          <w:tcPr>
+            <w:tcW w:type="dxa" w:w="1054"/>
+          </w:tcPr>
+          <w:p>
+            <w:pPr>
+              <w:keepNext/>
+              <w:keepLines/>
+            </w:pPr>
+            <w:r>
+              <w:rPr>
+                <w:sz w:val="14"/>
+              </w:rPr>
+              <w:t>12.1</w:t>
+            </w:r>
+          </w:p>
+        </w:tc>
+      </w:tr>
+      <w:tr>
+        <w:trPr>
+          <w:cantSplit/>
+        </w:trPr>
+        <w:tc>
+          <w:tcPr>
+            <w:tcW w:type="dxa" w:w="1054"/>
+          </w:tcPr>
+          <w:p>
+            <w:pPr>
+              <w:keepNext/>
+              <w:keepLines/>
+            </w:pPr>
+            <w:r>
+              <w:rPr>
+                <w:sz w:val="14"/>
+              </w:rPr>
+              <w:t>Commercial drug delivery (AMT-130, Parkinson's class) [scenario]</w:t>
+            </w:r>
+          </w:p>
+        </w:tc>
+        <w:tc>
+          <w:tcPr>
+            <w:tcW w:type="dxa" w:w="1054"/>
+          </w:tcPr>
+          <w:p>
+            <w:pPr>
+              <w:keepNext/>
+              <w:keepLines/>
+            </w:pPr>
+            <w:r>
+              <w:rPr>
+                <w:sz w:val="14"/>
+              </w:rPr>
+              <w:t>–</w:t>
+            </w:r>
+          </w:p>
+        </w:tc>
+        <w:tc>
+          <w:tcPr>
+            <w:tcW w:type="dxa" w:w="1054"/>
+          </w:tcPr>
+          <w:p>
+            <w:pPr>
+              <w:keepNext/>
+              <w:keepLines/>
+            </w:pPr>
+            <w:r>
+              <w:rPr>
+                <w:sz w:val="14"/>
+              </w:rPr>
+              <w:t>–</w:t>
+            </w:r>
+          </w:p>
+        </w:tc>
+        <w:tc>
+          <w:tcPr>
+            <w:tcW w:type="dxa" w:w="1054"/>
+          </w:tcPr>
+          <w:p>
+            <w:pPr>
+              <w:keepNext/>
+              <w:keepLines/>
+            </w:pPr>
+            <w:r>
+              <w:rPr>
+                <w:sz w:val="14"/>
+              </w:rPr>
+              <w:t>–</w:t>
+            </w:r>
+          </w:p>
+        </w:tc>
+        <w:tc>
+          <w:tcPr>
+            <w:tcW w:type="dxa" w:w="1054"/>
+          </w:tcPr>
+          <w:p>
+            <w:pPr>
+              <w:keepNext/>
+              <w:keepLines/>
+            </w:pPr>
+            <w:r>
+              <w:rPr>
+                <w:sz w:val="14"/>
+              </w:rPr>
+              <w:t>–</w:t>
+            </w:r>
+          </w:p>
+        </w:tc>
+        <w:tc>
+          <w:tcPr>
+            <w:tcW w:type="dxa" w:w="1054"/>
+          </w:tcPr>
+          <w:p>
+            <w:pPr>
+              <w:keepNext/>
+              <w:keepLines/>
+            </w:pPr>
+            <w:r>
+              <w:rPr>
+                <w:sz w:val="14"/>
+              </w:rPr>
+              <w:t>17.6</w:t>
+            </w:r>
+          </w:p>
+        </w:tc>
+        <w:tc>
+          <w:tcPr>
+            <w:tcW w:type="dxa" w:w="1054"/>
+          </w:tcPr>
+          <w:p>
+            <w:pPr>
+              <w:keepNext/>
+              <w:keepLines/>
+            </w:pPr>
+            <w:r>
+              <w:rPr>
+                <w:sz w:val="14"/>
+              </w:rPr>
+              <w:t>90.0</w:t>
+            </w:r>
+          </w:p>
+        </w:tc>
+        <w:tc>
+          <w:tcPr>
+            <w:tcW w:type="dxa" w:w="1054"/>
+          </w:tcPr>
+          <w:p>
+            <w:pPr>
+              <w:keepNext/>
+              <w:keepLines/>
+            </w:pPr>
+            <w:r>
+              <w:rPr>
+                <w:sz w:val="14"/>
+              </w:rPr>
+              <w:t>186.9</w:t>
+            </w:r>
+          </w:p>
+        </w:tc>
+        <w:tc>
+          <w:tcPr>
+            <w:tcW w:type="dxa" w:w="1054"/>
+          </w:tcPr>
+          <w:p>
+            <w:pPr>
+              <w:keepNext/>
+              <w:keepLines/>
+            </w:pPr>
+            <w:r>
+              <w:rPr>
+                <w:sz w:val="14"/>
+              </w:rPr>
+              <w:t>268.3</w:t>
+            </w:r>
+          </w:p>
+        </w:tc>
+        <w:tc>
+          <w:tcPr>
+            <w:tcW w:type="dxa" w:w="1054"/>
+          </w:tcPr>
+          <w:p>
+            <w:pPr>
+              <w:keepNext/>
+              <w:keepLines/>
+            </w:pPr>
+            <w:r>
+              <w:rPr>
+                <w:sz w:val="14"/>
+              </w:rPr>
+              <w:t>355.4</w:t>
+            </w:r>
+          </w:p>
+        </w:tc>
+      </w:tr>
+      <w:tr>
+        <w:trPr>
+          <w:cantSplit/>
+        </w:trPr>
+        <w:tc>
+          <w:tcPr>
+            <w:tcW w:type="dxa" w:w="1054"/>
+          </w:tcPr>
+          <w:p>
+            <w:pPr>
+              <w:keepNext/>
+              <w:keepLines/>
+            </w:pPr>
+            <w:r>
+              <w:rPr>
+                <w:sz w:val="14"/>
+              </w:rPr>
+              <w:t>Preclinical services uplift, CAL GLP facility [scenario]</w:t>
+            </w:r>
+          </w:p>
+        </w:tc>
+        <w:tc>
+          <w:tcPr>
+            <w:tcW w:type="dxa" w:w="1054"/>
+          </w:tcPr>
+          <w:p>
+            <w:pPr>
+              <w:keepNext/>
+              <w:keepLines/>
+            </w:pPr>
+            <w:r>
+              <w:rPr>
+                <w:sz w:val="14"/>
+              </w:rPr>
+              <w:t>–</w:t>
+            </w:r>
+          </w:p>
+        </w:tc>
+        <w:tc>
+          <w:tcPr>
+            <w:tcW w:type="dxa" w:w="1054"/>
+          </w:tcPr>
+          <w:p>
+            <w:pPr>
+              <w:keepNext/>
+              <w:keepLines/>
+            </w:pPr>
+            <w:r>
+              <w:rPr>
+                <w:sz w:val="14"/>
+              </w:rPr>
+              <w:t>–</w:t>
+            </w:r>
+          </w:p>
+        </w:tc>
+        <w:tc>
+          <w:tcPr>
+            <w:tcW w:type="dxa" w:w="1054"/>
+          </w:tcPr>
+          <w:p>
+            <w:pPr>
+              <w:keepNext/>
+              <w:keepLines/>
+            </w:pPr>
+            <w:r>
+              <w:rPr>
+                <w:sz w:val="14"/>
+              </w:rPr>
+              <w:t>–</w:t>
+            </w:r>
+          </w:p>
+        </w:tc>
+        <w:tc>
+          <w:tcPr>
+            <w:tcW w:type="dxa" w:w="1054"/>
+          </w:tcPr>
+          <w:p>
+            <w:pPr>
+              <w:keepNext/>
+              <w:keepLines/>
+            </w:pPr>
+            <w:r>
+              <w:rPr>
+                <w:sz w:val="14"/>
+              </w:rPr>
+              <w:t>–</w:t>
+            </w:r>
+          </w:p>
+        </w:tc>
+        <w:tc>
+          <w:tcPr>
+            <w:tcW w:type="dxa" w:w="1054"/>
+          </w:tcPr>
+          <w:p>
+            <w:pPr>
+              <w:keepNext/>
+              <w:keepLines/>
+            </w:pPr>
+            <w:r>
+              <w:rPr>
+                <w:sz w:val="14"/>
+              </w:rPr>
+              <w:t>3.0</w:t>
+            </w:r>
+          </w:p>
+        </w:tc>
+        <w:tc>
+          <w:tcPr>
+            <w:tcW w:type="dxa" w:w="1054"/>
+          </w:tcPr>
+          <w:p>
+            <w:pPr>
+              <w:keepNext/>
+              <w:keepLines/>
+            </w:pPr>
+            <w:r>
+              <w:rPr>
+                <w:sz w:val="14"/>
+              </w:rPr>
+              <w:t>10.0</w:t>
+            </w:r>
+          </w:p>
+        </w:tc>
+        <w:tc>
+          <w:tcPr>
+            <w:tcW w:type="dxa" w:w="1054"/>
+          </w:tcPr>
+          <w:p>
+            <w:pPr>
+              <w:keepNext/>
+              <w:keepLines/>
+            </w:pPr>
+            <w:r>
+              <w:rPr>
+                <w:sz w:val="14"/>
+              </w:rPr>
+              <w:t>18.0</w:t>
+            </w:r>
+          </w:p>
+        </w:tc>
+        <w:tc>
+          <w:tcPr>
+            <w:tcW w:type="dxa" w:w="1054"/>
+          </w:tcPr>
+          <w:p>
+            <w:pPr>
+              <w:keepNext/>
+              <w:keepLines/>
+            </w:pPr>
+            <w:r>
+              <w:rPr>
+                <w:sz w:val="14"/>
+              </w:rPr>
+              <w:t>27.0</w:t>
+            </w:r>
+          </w:p>
+        </w:tc>
+        <w:tc>
+          <w:tcPr>
+            <w:tcW w:type="dxa" w:w="1054"/>
+          </w:tcPr>
+          <w:p>
+            <w:pPr>
+              <w:keepNext/>
+              <w:keepLines/>
+            </w:pPr>
+            <w:r>
+              <w:rPr>
+                <w:sz w:val="14"/>
+              </w:rPr>
+              <w:t>36.0</w:t>
+            </w:r>
+          </w:p>
+        </w:tc>
+      </w:tr>
+      <w:tr>
+        <w:trPr>
+          <w:cantSplit/>
+        </w:trPr>
+        <w:tc>
+          <w:tcPr>
+            <w:tcW w:type="dxa" w:w="1054"/>
+          </w:tcPr>
+          <w:p>
+            <w:pPr>
+              <w:keepNext/>
+              <w:keepLines/>
+            </w:pPr>
+            <w:r>
+              <w:rPr>
+                <w:b/>
+                <w:sz w:val="14"/>
+              </w:rPr>
+              <w:t>Total revenue</w:t>
+            </w:r>
+          </w:p>
+        </w:tc>
+        <w:tc>
+          <w:tcPr>
+            <w:tcW w:type="dxa" w:w="1054"/>
+          </w:tcPr>
+          <w:p>
+            <w:pPr>
+              <w:keepNext/>
+              <w:keepLines/>
+            </w:pPr>
+            <w:r>
+              <w:rPr>
+                <w:b/>
+                <w:sz w:val="14"/>
+              </w:rPr>
+              <w:t>31.4</w:t>
+            </w:r>
+          </w:p>
+        </w:tc>
+        <w:tc>
+          <w:tcPr>
+            <w:tcW w:type="dxa" w:w="1054"/>
+          </w:tcPr>
+          <w:p>
+            <w:pPr>
+              <w:keepNext/>
+              <w:keepLines/>
+            </w:pPr>
+            <w:r>
+              <w:rPr>
+                <w:b/>
+                <w:sz w:val="14"/>
+              </w:rPr>
+              <w:t>37.0</w:t>
+            </w:r>
+          </w:p>
+        </w:tc>
+        <w:tc>
+          <w:tcPr>
+            <w:tcW w:type="dxa" w:w="1054"/>
+          </w:tcPr>
+          <w:p>
+            <w:pPr>
+              <w:keepNext/>
+              <w:keepLines/>
+            </w:pPr>
+            <w:r>
+              <w:rPr>
+                <w:b/>
+                <w:sz w:val="14"/>
+              </w:rPr>
+              <w:t>23.0</w:t>
+            </w:r>
+          </w:p>
+        </w:tc>
+        <w:tc>
+          <w:tcPr>
+            <w:tcW w:type="dxa" w:w="1054"/>
+          </w:tcPr>
+          <w:p>
+            <w:pPr>
+              <w:keepNext/>
+              <w:keepLines/>
+            </w:pPr>
+            <w:r>
+              <w:rPr>
+                <w:b/>
+                <w:sz w:val="14"/>
+              </w:rPr>
+              <w:t>50.0</w:t>
+            </w:r>
+          </w:p>
+        </w:tc>
+        <w:tc>
+          <w:tcPr>
+            <w:tcW w:type="dxa" w:w="1054"/>
+          </w:tcPr>
+          <w:p>
+            <w:pPr>
+              <w:keepNext/>
+              <w:keepLines/>
+            </w:pPr>
+            <w:r>
+              <w:rPr>
+                <w:b/>
+                <w:sz w:val="14"/>
+              </w:rPr>
+              <w:t>77.7</w:t>
+            </w:r>
+          </w:p>
+        </w:tc>
+        <w:tc>
+          <w:tcPr>
+            <w:tcW w:type="dxa" w:w="1054"/>
+          </w:tcPr>
+          <w:p>
+            <w:pPr>
+              <w:keepNext/>
+              <w:keepLines/>
+            </w:pPr>
+            <w:r>
+              <w:rPr>
+                <w:b/>
+                <w:sz w:val="14"/>
+              </w:rPr>
+              <w:t>167.4</w:t>
+            </w:r>
+          </w:p>
+        </w:tc>
+        <w:tc>
+          <w:tcPr>
+            <w:tcW w:type="dxa" w:w="1054"/>
+          </w:tcPr>
+          <w:p>
+            <w:pPr>
+              <w:keepNext/>
+              <w:keepLines/>
+            </w:pPr>
+            <w:r>
+              <w:rPr>
+                <w:b/>
+                <w:sz w:val="14"/>
+              </w:rPr>
+              <w:t>284.4</w:t>
+            </w:r>
+          </w:p>
+        </w:tc>
+        <w:tc>
+          <w:tcPr>
+            <w:tcW w:type="dxa" w:w="1054"/>
+          </w:tcPr>
+          <w:p>
+            <w:pPr>
+              <w:keepNext/>
+              <w:keepLines/>
+            </w:pPr>
+            <w:r>
+              <w:rPr>
+                <w:b/>
+                <w:sz w:val="14"/>
+              </w:rPr>
+              <w:t>389.2</w:t>
+            </w:r>
+          </w:p>
+        </w:tc>
+        <w:tc>
+          <w:tcPr>
+            <w:tcW w:type="dxa" w:w="1054"/>
+          </w:tcPr>
+          <w:p>
+            <w:pPr>
+              <w:keepNext/>
+              <w:keepLines/>
+            </w:pPr>
+            <w:r>
+              <w:rPr>
+                <w:b/>
+                <w:sz w:val="14"/>
+              </w:rPr>
+              <w:t>502.1</w:t>
+            </w:r>
+          </w:p>
+        </w:tc>
+      </w:tr>
+      <w:tr>
+        <w:trPr>
+          <w:cantSplit/>
+        </w:trPr>
+        <w:tc>
+          <w:tcPr>
+            <w:tcW w:type="dxa" w:w="1054"/>
+          </w:tcPr>
+          <w:p>
+            <w:pPr>
+              <w:keepNext/>
+              <w:keepLines/>
+            </w:pPr>
+            <w:r>
+              <w:rPr>
+                <w:sz w:val="14"/>
+              </w:rPr>
+              <w:t>Growth</w:t>
+            </w:r>
+          </w:p>
+        </w:tc>
+        <w:tc>
+          <w:tcPr>
+            <w:tcW w:type="dxa" w:w="1054"/>
+          </w:tcPr>
+          <w:p>
+            <w:pPr>
+              <w:keepNext/>
+              <w:keepLines/>
+            </w:pPr>
+            <w:r>
+              <w:rPr>
+                <w:sz w:val="14"/>
+              </w:rPr>
+              <w:t>–</w:t>
+            </w:r>
+          </w:p>
+        </w:tc>
+        <w:tc>
+          <w:tcPr>
+            <w:tcW w:type="dxa" w:w="1054"/>
+          </w:tcPr>
+          <w:p>
+            <w:pPr>
+              <w:keepNext/>
+              <w:keepLines/>
+            </w:pPr>
+            <w:r>
+              <w:rPr>
+                <w:sz w:val="14"/>
+              </w:rPr>
+              <w:t>17.8%</w:t>
+            </w:r>
+          </w:p>
+        </w:tc>
+        <w:tc>
+          <w:tcPr>
+            <w:tcW w:type="dxa" w:w="1054"/>
+          </w:tcPr>
+          <w:p>
+            <w:pPr>
+              <w:keepNext/>
+              <w:keepLines/>
+            </w:pPr>
+            <w:r>
+              <w:rPr>
+                <w:sz w:val="14"/>
+              </w:rPr>
+              <w:t>30.0%</w:t>
+            </w:r>
+          </w:p>
+        </w:tc>
+        <w:tc>
+          <w:tcPr>
+            <w:tcW w:type="dxa" w:w="1054"/>
+          </w:tcPr>
+          <w:p>
+            <w:pPr>
+              <w:keepNext/>
+              <w:keepLines/>
+            </w:pPr>
+            <w:r>
+              <w:rPr>
+                <w:sz w:val="14"/>
+              </w:rPr>
+              <w:t>35.2%</w:t>
+            </w:r>
+          </w:p>
+        </w:tc>
+        <w:tc>
+          <w:tcPr>
+            <w:tcW w:type="dxa" w:w="1054"/>
+          </w:tcPr>
+          <w:p>
+            <w:pPr>
+              <w:keepNext/>
+              <w:keepLines/>
+            </w:pPr>
+            <w:r>
+              <w:rPr>
+                <w:sz w:val="14"/>
+              </w:rPr>
+              <w:t>55.4%</w:t>
+            </w:r>
+          </w:p>
+        </w:tc>
+        <w:tc>
+          <w:tcPr>
+            <w:tcW w:type="dxa" w:w="1054"/>
+          </w:tcPr>
+          <w:p>
+            <w:pPr>
+              <w:keepNext/>
+              <w:keepLines/>
+            </w:pPr>
+            <w:r>
+              <w:rPr>
+                <w:sz w:val="14"/>
+              </w:rPr>
+              <w:t>115.4%</w:t>
+            </w:r>
+          </w:p>
+        </w:tc>
+        <w:tc>
+          <w:tcPr>
+            <w:tcW w:type="dxa" w:w="1054"/>
+          </w:tcPr>
+          <w:p>
+            <w:pPr>
+              <w:keepNext/>
+              <w:keepLines/>
+            </w:pPr>
+            <w:r>
+              <w:rPr>
+                <w:sz w:val="14"/>
+              </w:rPr>
+              <w:t>69.9%</w:t>
+            </w:r>
+          </w:p>
+        </w:tc>
+        <w:tc>
+          <w:tcPr>
+            <w:tcW w:type="dxa" w:w="1054"/>
+          </w:tcPr>
+          <w:p>
+            <w:pPr>
+              <w:keepNext/>
+              <w:keepLines/>
+            </w:pPr>
+            <w:r>
+              <w:rPr>
+                <w:sz w:val="14"/>
+              </w:rPr>
+              <w:t>36.8%</w:t>
+            </w:r>
+          </w:p>
+        </w:tc>
+        <w:tc>
+          <w:tcPr>
+            <w:tcW w:type="dxa" w:w="1054"/>
+          </w:tcPr>
+          <w:p>
+            <w:pPr>
+              <w:keepNext/>
+              <w:keepLines/>
+            </w:pPr>
+            <w:r>
+              <w:rPr>
+                <w:sz w:val="14"/>
+              </w:rPr>
+              <w:t>29.0%</w:t>
+            </w:r>
+          </w:p>
+        </w:tc>
+      </w:tr>
+      <w:tr>
+        <w:trPr>
+          <w:cantSplit/>
+        </w:trPr>
+        <w:tc>
+          <w:tcPr>
+            <w:tcW w:type="dxa" w:w="1054"/>
+          </w:tcPr>
+          <w:p>
+            <w:pPr>
+              <w:keepNext/>
+              <w:keepLines/>
+            </w:pPr>
+            <w:r>
+              <w:rPr>
+                <w:sz w:val="14"/>
+              </w:rPr>
+              <w:t>EBITDA (before SBC)</w:t>
+            </w:r>
+          </w:p>
+        </w:tc>
+        <w:tc>
+          <w:tcPr>
+            <w:tcW w:type="dxa" w:w="1054"/>
+          </w:tcPr>
+          <w:p>
+            <w:pPr>
+              <w:keepNext/>
+              <w:keepLines/>
+            </w:pPr>
+            <w:r>
+              <w:rPr>
+                <w:sz w:val="14"/>
+              </w:rPr>
+              <w:t>–</w:t>
+            </w:r>
+          </w:p>
+        </w:tc>
+        <w:tc>
+          <w:tcPr>
+            <w:tcW w:type="dxa" w:w="1054"/>
+          </w:tcPr>
+          <w:p>
+            <w:pPr>
+              <w:keepNext/>
+              <w:keepLines/>
+            </w:pPr>
+            <w:r>
+              <w:rPr>
+                <w:sz w:val="14"/>
+              </w:rPr>
+              <w:t>−15.2</w:t>
+            </w:r>
+          </w:p>
+        </w:tc>
+        <w:tc>
+          <w:tcPr>
+            <w:tcW w:type="dxa" w:w="1054"/>
+          </w:tcPr>
+          <w:p>
+            <w:pPr>
+              <w:keepNext/>
+              <w:keepLines/>
+            </w:pPr>
+            <w:r>
+              <w:rPr>
+                <w:sz w:val="14"/>
+              </w:rPr>
+              <w:t>−13.0</w:t>
+            </w:r>
+          </w:p>
+        </w:tc>
+        <w:tc>
+          <w:tcPr>
+            <w:tcW w:type="dxa" w:w="1054"/>
+          </w:tcPr>
+          <w:p>
+            <w:pPr>
+              <w:keepNext/>
+              <w:keepLines/>
+            </w:pPr>
+            <w:r>
+              <w:rPr>
+                <w:sz w:val="14"/>
+              </w:rPr>
+              <w:t>−22.9</w:t>
+            </w:r>
+          </w:p>
+        </w:tc>
+        <w:tc>
+          <w:tcPr>
+            <w:tcW w:type="dxa" w:w="1054"/>
+          </w:tcPr>
+          <w:p>
+            <w:pPr>
+              <w:keepNext/>
+              <w:keepLines/>
+            </w:pPr>
+            <w:r>
+              <w:rPr>
+                <w:sz w:val="14"/>
+              </w:rPr>
+              <w:t>−11.3</w:t>
+            </w:r>
+          </w:p>
+        </w:tc>
+        <w:tc>
+          <w:tcPr>
+            <w:tcW w:type="dxa" w:w="1054"/>
+          </w:tcPr>
+          <w:p>
+            <w:pPr>
+              <w:keepNext/>
+              <w:keepLines/>
+            </w:pPr>
+            <w:r>
+              <w:rPr>
+                <w:sz w:val="14"/>
+              </w:rPr>
+              <w:t>38.8</w:t>
+            </w:r>
+          </w:p>
+        </w:tc>
+        <w:tc>
+          <w:tcPr>
+            <w:tcW w:type="dxa" w:w="1054"/>
+          </w:tcPr>
+          <w:p>
+            <w:pPr>
+              <w:keepNext/>
+              <w:keepLines/>
+            </w:pPr>
+            <w:r>
+              <w:rPr>
+                <w:sz w:val="14"/>
+              </w:rPr>
+              <w:t>103.0</w:t>
+            </w:r>
+          </w:p>
+        </w:tc>
+        <w:tc>
+          <w:tcPr>
+            <w:tcW w:type="dxa" w:w="1054"/>
+          </w:tcPr>
+          <w:p>
+            <w:pPr>
+              <w:keepNext/>
+              <w:keepLines/>
+            </w:pPr>
+            <w:r>
+              <w:rPr>
+                <w:sz w:val="14"/>
+              </w:rPr>
+              <w:t>161.5</w:t>
+            </w:r>
+          </w:p>
+        </w:tc>
+        <w:tc>
+          <w:tcPr>
+            <w:tcW w:type="dxa" w:w="1054"/>
+          </w:tcPr>
+          <w:p>
+            <w:pPr>
+              <w:keepNext/>
+              <w:keepLines/>
+            </w:pPr>
+            <w:r>
+              <w:rPr>
+                <w:sz w:val="14"/>
+              </w:rPr>
+              <w:t>225.0</w:t>
+            </w:r>
+          </w:p>
+        </w:tc>
+      </w:tr>
+      <w:tr>
+        <w:trPr>
+          <w:cantSplit/>
+        </w:trPr>
+        <w:tc>
+          <w:tcPr>
+            <w:tcW w:type="dxa" w:w="1054"/>
+          </w:tcPr>
+          <w:p>
+            <w:r>
+              <w:rPr>
+                <w:sz w:val="14"/>
+              </w:rPr>
+              <w:t>EBITDA margin</w:t>
+            </w:r>
+          </w:p>
+        </w:tc>
+        <w:tc>
+          <w:tcPr>
+            <w:tcW w:type="dxa" w:w="1054"/>
+          </w:tcPr>
+          <w:p>
+            <w:r>
+              <w:rPr>
+                <w:sz w:val="14"/>
+              </w:rPr>
+              <w:t>–</w:t>
+            </w:r>
+          </w:p>
+        </w:tc>
+        <w:tc>
+          <w:tcPr>
+            <w:tcW w:type="dxa" w:w="1054"/>
+          </w:tcPr>
+          <w:p>
+            <w:r>
+              <w:rPr>
+                <w:sz w:val="14"/>
+              </w:rPr>
+              <w:t>−41.0%</w:t>
+            </w:r>
+          </w:p>
+        </w:tc>
+        <w:tc>
+          <w:tcPr>
+            <w:tcW w:type="dxa" w:w="1054"/>
+          </w:tcPr>
+          <w:p>
+            <w:r>
+              <w:rPr>
+                <w:sz w:val="14"/>
+              </w:rPr>
+              <w:t>−56.5%</w:t>
+            </w:r>
+          </w:p>
+        </w:tc>
+        <w:tc>
+          <w:tcPr>
+            <w:tcW w:type="dxa" w:w="1054"/>
+          </w:tcPr>
+          <w:p>
+            <w:r>
+              <w:rPr>
+                <w:sz w:val="14"/>
+              </w:rPr>
+              <w:t>−45.9%</w:t>
+            </w:r>
+          </w:p>
+        </w:tc>
+        <w:tc>
+          <w:tcPr>
+            <w:tcW w:type="dxa" w:w="1054"/>
+          </w:tcPr>
+          <w:p>
+            <w:r>
+              <w:rPr>
+                <w:sz w:val="14"/>
+              </w:rPr>
+              <w:t>−14.5%</w:t>
+            </w:r>
+          </w:p>
+        </w:tc>
+        <w:tc>
+          <w:tcPr>
+            <w:tcW w:type="dxa" w:w="1054"/>
+          </w:tcPr>
+          <w:p>
+            <w:r>
+              <w:rPr>
+                <w:sz w:val="14"/>
+              </w:rPr>
+              <w:t>23.2%</w:t>
+            </w:r>
+          </w:p>
+        </w:tc>
+        <w:tc>
+          <w:tcPr>
+            <w:tcW w:type="dxa" w:w="1054"/>
+          </w:tcPr>
+          <w:p>
+            <w:r>
+              <w:rPr>
+                <w:sz w:val="14"/>
+              </w:rPr>
+              <w:t>36.2%</w:t>
+            </w:r>
+          </w:p>
+        </w:tc>
+        <w:tc>
+          <w:tcPr>
+            <w:tcW w:type="dxa" w:w="1054"/>
+          </w:tcPr>
+          <w:p>
+            <w:r>
+              <w:rPr>
+                <w:sz w:val="14"/>
+              </w:rPr>
+              <w:t>41.5%</w:t>
+            </w:r>
+          </w:p>
+        </w:tc>
+        <w:tc>
+          <w:tcPr>
+            <w:tcW w:type="dxa" w:w="1054"/>
+          </w:tcPr>
+          <w:p>
+            <w:r>
+              <w:rPr>
+                <w:sz w:val="14"/>
+              </w:rPr>
+              <w:t>44.8%</w:t>
+            </w:r>
+          </w:p>
+        </w:tc>
+      </w:tr>
+    </w:tbl>
+    <w:p/>
+    <w:p>
+      <w:r>
+        <w:rPr>
+          <w:i/>
+        </w:rPr>
+        <w:t>Source: forecast.json bull scenario: A1–A4, C2, C7, C9, C10, E1 (bull FY2026E consensus), S1–S7, S15, S20, S21, S26, S30–S32, S37, S38, S59, C46, P2. Growth derived. H1 2026A growth as in Figure 5. CAL revenue is reported inside biologics and drug delivery; it is shown separately here. May not sum due to rounding.</w:t>
+      </w:r>
+    </w:p>
+    <w:p>
+      <w:r>
+        <w:rPr>
+          <w:i/>
+        </w:rPr>
+        <w:t>What differs from the base.</w:t>
+      </w:r>
+      <w:r>
+        <w:t xml:space="preserve"> The bull adds about $92M of revenue and $54M of EBITDA in FY2031E (derived), mostly from procedures: AMT-130 settles at 3,500 a year instead of 3,000, and 8% of the Parkinson's pool is treated each year instead of 6%, giving 17,772 procedures against 14,126 [S21][S59][C46]. Core lines grow faster and the CAL reaches $36M instead of $29M, and because extra procedure revenue carries a high margin, the FY2031E EBITDA margin is 44.8% against 41.6% (derived from C10) [S26][S37].</w:t>
       </w:r>
     </w:p>
     <w:p>

</xml_diff>

<commit_message>
CLPT report: Appendix B sources in numeric order within each prefix group (David, 2026-10-26)
</commit_message>
<xml_diff>
--- a/forecasts/CLPT/report.docx
+++ b/forecasts/CLPT/report.docx
@@ -32014,10 +32014,10 @@
         <w:rPr>
           <w:b/>
         </w:rPr>
-        <w:t>D17</w:t>
-      </w:r>
-      <w:r>
-        <w:t xml:space="preserve"> uniQure, AMT-130 Pivotal Update (commercial slides), Sept 2025: https://cdn.craft.cloud/fe68e1a2-b284-4f69-ba29-921f065edf17/assets/uploads/AMT-130-Pivotal-Sept-2025_final_09.24.25.pdf (PDF, p.25)</w:t>
+        <w:t>D16</w:t>
+      </w:r>
+      <w:r>
+        <w:t xml:space="preserve"> Finagle discounted-cash-flow valuation runs of the base, bull and bear cases and of add-on cases, Oct 25, 2026 (model output, not published; superseded; not used)</w:t>
       </w:r>
     </w:p>
     <w:p>
@@ -32028,10 +32028,10 @@
         <w:rPr>
           <w:b/>
         </w:rPr>
-        <w:t>D18</w:t>
-      </w:r>
-      <w:r>
-        <w:t xml:space="preserve"> Bruzelius et al., "Huntington's Disease in the United States: Variation by demographic and socioeconomic factors", 2019: https://pmc.ncbi.nlm.nih.gov/articles/PMC6579693/ (HTML)</w:t>
+        <w:t>D17</w:t>
+      </w:r>
+      <w:r>
+        <w:t xml:space="preserve"> uniQure, AMT-130 Pivotal Update (commercial slides), Sept 2025: https://cdn.craft.cloud/fe68e1a2-b284-4f69-ba29-921f065edf17/assets/uploads/AMT-130-Pivotal-Sept-2025_final_09.24.25.pdf (PDF, p.25)</w:t>
       </w:r>
     </w:p>
     <w:p>
@@ -32042,10 +32042,10 @@
         <w:rPr>
           <w:b/>
         </w:rPr>
-        <w:t>D19</w:t>
-      </w:r>
-      <w:r>
-        <w:t xml:space="preserve"> Reuters, "Parkinson's disease at forefront of Bayer bet on cell and gene therapies", Sep 25, 2025: https://www.reuters.com/business/healthcare-pharmaceuticals/parkinsons-disease-forefront-bayer-bet-cell-gene-therapies-2025-09-25/ (paywalled; read via search snippet only)</w:t>
+        <w:t>D18</w:t>
+      </w:r>
+      <w:r>
+        <w:t xml:space="preserve"> Bruzelius et al., "Huntington's Disease in the United States: Variation by demographic and socioeconomic factors", 2019: https://pmc.ncbi.nlm.nih.gov/articles/PMC6579693/ (HTML)</w:t>
       </w:r>
     </w:p>
     <w:p>
@@ -32056,10 +32056,10 @@
         <w:rPr>
           <w:b/>
         </w:rPr>
-        <w:t>D20</w:t>
-      </w:r>
-      <w:r>
-        <w:t xml:space="preserve"> Parkinson's Foundation, Statistics: https://www.parkinson.org/understanding-parkinsons/statistics (HTML)</w:t>
+        <w:t>D19</w:t>
+      </w:r>
+      <w:r>
+        <w:t xml:space="preserve"> Reuters, "Parkinson's disease at forefront of Bayer bet on cell and gene therapies", Sep 25, 2025: https://www.reuters.com/business/healthcare-pharmaceuticals/parkinsons-disease-forefront-bayer-bet-cell-gene-therapies-2025-09-25/ (paywalled; read via search snippet only)</w:t>
       </w:r>
     </w:p>
     <w:p>
@@ -32070,10 +32070,10 @@
         <w:rPr>
           <w:b/>
         </w:rPr>
-        <w:t>D21</w:t>
-      </w:r>
-      <w:r>
-        <w:t xml:space="preserve"> Neurology (2021 abstract 4377), "Incidence and Prevalence of Motor Fluctuations and Deep Brain Stimulation in Parkinson's disease": https://www.neurology.org/doi/10.1212/WNL.96.15_supplement.4377 (HTML)</w:t>
+        <w:t>D20</w:t>
+      </w:r>
+      <w:r>
+        <w:t xml:space="preserve"> Parkinson's Foundation, Statistics: https://www.parkinson.org/understanding-parkinsons/statistics (HTML)</w:t>
       </w:r>
     </w:p>
     <w:p>
@@ -32084,10 +32084,10 @@
         <w:rPr>
           <w:b/>
         </w:rPr>
-        <w:t>D22</w:t>
-      </w:r>
-      <w:r>
-        <w:t xml:space="preserve"> ASGCT 2026 abstract via Larvol, reflections on approved gene therapies: https://delta.larvol.com/Products/?ProductId=d32f5525-efb7-4110-a0a8-4eab2ca91fe6 (secondary source)</w:t>
+        <w:t>D21</w:t>
+      </w:r>
+      <w:r>
+        <w:t xml:space="preserve"> Neurology (2021 abstract 4377), "Incidence and Prevalence of Motor Fluctuations and Deep Brain Stimulation in Parkinson's disease": https://www.neurology.org/doi/10.1212/WNL.96.15_supplement.4377 (HTML)</w:t>
       </w:r>
     </w:p>
     <w:p>
@@ -32098,10 +32098,10 @@
         <w:rPr>
           <w:b/>
         </w:rPr>
-        <w:t>D23</w:t>
-      </w:r>
-      <w:r>
-        <w:t xml:space="preserve"> BioPharma Dive, "BioMarin preaches patience amid slow sales for hemophilia gene therapy": https://www.biopharmadive.com/news/biomarin-roctavian-sales-hemophilia-gene-therapy/708321/ (HTML)</w:t>
+        <w:t>D22</w:t>
+      </w:r>
+      <w:r>
+        <w:t xml:space="preserve"> ASGCT 2026 abstract via Larvol, reflections on approved gene therapies: https://delta.larvol.com/Products/?ProductId=d32f5525-efb7-4110-a0a8-4eab2ca91fe6 (secondary source)</w:t>
       </w:r>
     </w:p>
     <w:p>
@@ -32112,10 +32112,10 @@
         <w:rPr>
           <w:b/>
         </w:rPr>
-        <w:t>D27</w:t>
-      </w:r>
-      <w:r>
-        <w:t xml:space="preserve"> Clinical survey abstract, "Reasons for underutilisation of Deep Brain Stimulation (DBS) for Parkinson's Disease (PD): a clinical survey", German Society of Neurosurgery 2012 (GMS): https://doi.org/10.3205/12dgnc047 (HTML; abstract only)</w:t>
+        <w:t>D23</w:t>
+      </w:r>
+      <w:r>
+        <w:t xml:space="preserve"> BioPharma Dive, "BioMarin preaches patience amid slow sales for hemophilia gene therapy": https://www.biopharmadive.com/news/biomarin-roctavian-sales-hemophilia-gene-therapy/708321/ (HTML)</w:t>
       </w:r>
     </w:p>
     <w:p>
@@ -32126,10 +32126,10 @@
         <w:rPr>
           <w:b/>
         </w:rPr>
-        <w:t>D29</w:t>
-      </w:r>
-      <w:r>
-        <w:t xml:space="preserve"> "How to improve patient education on deep brain stimulation in Parkinson's disease: the CARE Monitor study", BMC Neurology 2017: https://doi.org/10.1186/s12883-017-0820-7 (HTML)</w:t>
+        <w:t>D24</w:t>
+      </w:r>
+      <w:r>
+        <w:t xml:space="preserve"> Systematic review and meta-analysis of Huntington's disease incidence (regional rates; UK studies incl. Wexler 2016): https://pmc.ncbi.nlm.nih.gov/articles/PMC10086981/ (HTML)</w:t>
       </w:r>
     </w:p>
     <w:p>
@@ -32140,10 +32140,10 @@
         <w:rPr>
           <w:b/>
         </w:rPr>
-        <w:t>D31</w:t>
-      </w:r>
-      <w:r>
-        <w:t xml:space="preserve"> AskBio, "AskBio's Viralgen to Supply Commercial-Scale Drug Product for REGENERATE-PD…", Apr 20, 2026: https://www.askbio.com/viralgen-to-supply-commercial-scale-drug-product-for-regenerate-pd-investigational-gene-therapy-trial-parkinsons-disease/ (HTML)</w:t>
+        <w:t>D25</w:t>
+      </w:r>
+      <w:r>
+        <w:t xml:space="preserve"> Parkinson's Foundation, Prevalence &amp; Incidence: https://www.parkinson.org/understanding-parkinsons/statistics/prevalence-incidence (HTML); Willis et al., npj Parkinson's Disease 2022: https://www.nature.com/articles/s41531-022-00410-y (HTML)</w:t>
       </w:r>
     </w:p>
     <w:p>
@@ -32154,10 +32154,10 @@
         <w:rPr>
           <w:b/>
         </w:rPr>
-        <w:t>D32</w:t>
-      </w:r>
-      <w:r>
-        <w:t xml:space="preserve"> ClinicalTrials.gov, NCT06285643 (REGENERATE-PD, AAV2-GDNF): https://clinicaltrials.gov/study/NCT06285643 (HTML)</w:t>
+        <w:t>D26</w:t>
+      </w:r>
+      <w:r>
+        <w:t xml:space="preserve"> Venkatraman et al., J Neurosurg 2024, "Disparities in the treatment of movement disorders using deep brain stimulation" (NIS 2012–19, Table 4): https://pmc.ncbi.nlm.nih.gov/articles/PMC10898494/ (HTML)</w:t>
       </w:r>
     </w:p>
     <w:p>
@@ -32168,10 +32168,10 @@
         <w:rPr>
           <w:b/>
         </w:rPr>
-        <w:t>D33</w:t>
-      </w:r>
-      <w:r>
-        <w:t xml:space="preserve"> Marras et al., "Prevalence of Parkinson's disease across North America", npj Parkinson's Disease, 2018: https://doi.org/10.1038/s41531-018-0058-0 (HTML)</w:t>
+        <w:t>D27</w:t>
+      </w:r>
+      <w:r>
+        <w:t xml:space="preserve"> Clinical survey abstract, "Reasons for underutilisation of Deep Brain Stimulation (DBS) for Parkinson's Disease (PD): a clinical survey", German Society of Neurosurgery 2012 (GMS): https://doi.org/10.3205/12dgnc047 (HTML; abstract only)</w:t>
       </w:r>
     </w:p>
     <w:p>
@@ -32182,10 +32182,10 @@
         <w:rPr>
           <w:b/>
         </w:rPr>
-        <w:t>D34</w:t>
-      </w:r>
-      <w:r>
-        <w:t xml:space="preserve"> Macleod et al., "Mortality in Parkinson's disease: a systematic review and meta-analysis", Movement Disorders, 2014: https://doi.org/10.1002/mds.25898 (HTML; abstract)</w:t>
+        <w:t>D29</w:t>
+      </w:r>
+      <w:r>
+        <w:t xml:space="preserve"> "How to improve patient education on deep brain stimulation in Parkinson's disease: the CARE Monitor study", BMC Neurology 2017: https://doi.org/10.1186/s12883-017-0820-7 (HTML)</w:t>
       </w:r>
     </w:p>
     <w:p>
@@ -32196,10 +32196,10 @@
         <w:rPr>
           <w:b/>
         </w:rPr>
-        <w:t>D35</w:t>
-      </w:r>
-      <w:r>
-        <w:t xml:space="preserve"> Aarsland et al., "A systematic review of prevalence studies of dementia in Parkinson's disease", Movement Disorders, 2005: https://doi.org/10.1002/mds.20527 (HTML; abstract)</w:t>
+        <w:t>D31</w:t>
+      </w:r>
+      <w:r>
+        <w:t xml:space="preserve"> AskBio, "AskBio's Viralgen to Supply Commercial-Scale Drug Product for REGENERATE-PD…", Apr 20, 2026: https://www.askbio.com/viralgen-to-supply-commercial-scale-drug-product-for-regenerate-pd-investigational-gene-therapy-trial-parkinsons-disease/ (HTML)</w:t>
       </w:r>
     </w:p>
     <w:p>
@@ -32210,10 +32210,10 @@
         <w:rPr>
           <w:b/>
         </w:rPr>
-        <w:t>D36</w:t>
-      </w:r>
-      <w:r>
-        <w:t xml:space="preserve"> "Motor complications in Parkinson's disease: results from 3,343 patients followed for up to 12 years": https://pmc.ncbi.nlm.nih.gov/articles/PMC11145112/ (HTML)</w:t>
+        <w:t>D32</w:t>
+      </w:r>
+      <w:r>
+        <w:t xml:space="preserve"> ClinicalTrials.gov, NCT06285643 (REGENERATE-PD, AAV2-GDNF): https://clinicaltrials.gov/study/NCT06285643 (HTML)</w:t>
       </w:r>
     </w:p>
     <w:p>
@@ -32224,10 +32224,10 @@
         <w:rPr>
           <w:b/>
         </w:rPr>
-        <w:t>D37</w:t>
-      </w:r>
-      <w:r>
-        <w:t xml:space="preserve"> CamPaIGN cohort, motor complications at 13-year follow-up: https://pmc.ncbi.nlm.nih.gov/articles/PMC7063985/ (HTML)</w:t>
+        <w:t>D33</w:t>
+      </w:r>
+      <w:r>
+        <w:t xml:space="preserve"> Marras et al., "Prevalence of Parkinson's disease across North America", npj Parkinson's Disease, 2018: https://doi.org/10.1038/s41531-018-0058-0 (HTML)</w:t>
       </w:r>
     </w:p>
     <w:p>
@@ -32238,10 +32238,10 @@
         <w:rPr>
           <w:b/>
         </w:rPr>
-        <w:t>D38</w:t>
-      </w:r>
-      <w:r>
-        <w:t xml:space="preserve"> Rizzo et al., "Accuracy of clinical diagnosis of Parkinson disease", Neurology, 2016: https://doi.org/10.1212/WNL.0000000000002350 (HTML; abstract)</w:t>
+        <w:t>D34</w:t>
+      </w:r>
+      <w:r>
+        <w:t xml:space="preserve"> Macleod et al., "Mortality in Parkinson's disease: a systematic review and meta-analysis", Movement Disorders, 2014: https://doi.org/10.1002/mds.25898 (HTML; abstract)</w:t>
       </w:r>
     </w:p>
     <w:p>
@@ -32252,10 +32252,10 @@
         <w:rPr>
           <w:b/>
         </w:rPr>
-        <w:t>D39</w:t>
-      </w:r>
-      <w:r>
-        <w:t xml:space="preserve"> Aspen Neuroscience, Form S-1, Oct 2026: https://www.sec.gov/Archives/edgar/data/2124080/000119312526419104/na-20261009.htm (HTML; no page numbers)</w:t>
+        <w:t>D35</w:t>
+      </w:r>
+      <w:r>
+        <w:t xml:space="preserve"> Aarsland et al., "A systematic review of prevalence studies of dementia in Parkinson's disease", Movement Disorders, 2005: https://doi.org/10.1002/mds.20527 (HTML; abstract)</w:t>
       </w:r>
     </w:p>
     <w:p>
@@ -32266,10 +32266,10 @@
         <w:rPr>
           <w:b/>
         </w:rPr>
-        <w:t>D51</w:t>
-      </w:r>
-      <w:r>
-        <w:t xml:space="preserve"> Morgante et al., Parkinsonism and Related Disorders, 2007 (eligibility for DBS in movement-disorder clinics): https://pubmed.ncbi.nlm.nih.gov/17347021/ (abstract)</w:t>
+        <w:t>D36</w:t>
+      </w:r>
+      <w:r>
+        <w:t xml:space="preserve"> "Motor complications in Parkinson's disease: results from 3,343 patients followed for up to 12 years": https://pmc.ncbi.nlm.nih.gov/articles/PMC11145112/ (HTML)</w:t>
       </w:r>
     </w:p>
     <w:p>
@@ -32280,10 +32280,10 @@
         <w:rPr>
           <w:b/>
         </w:rPr>
-        <w:t>D52</w:t>
-      </w:r>
-      <w:r>
-        <w:t xml:space="preserve"> Moes et al. (D-DATS), Parkinsonism and Related Disorders, 2023 (eligibility for device-aided therapies): https://doi.org/10.1016/j.parkreldis.2023.105359 (HTML; abstract)</w:t>
+        <w:t>D37</w:t>
+      </w:r>
+      <w:r>
+        <w:t xml:space="preserve"> CamPaIGN cohort, motor complications at 13-year follow-up: https://pmc.ncbi.nlm.nih.gov/articles/PMC7063985/ (HTML)</w:t>
       </w:r>
     </w:p>
     <w:p>
@@ -32294,10 +32294,10 @@
         <w:rPr>
           <w:b/>
         </w:rPr>
-        <w:t>D53</w:t>
-      </w:r>
-      <w:r>
-        <w:t xml:space="preserve"> Gibson et al., "Risk of dementia in Parkinson's disease: a systematic review and meta-analysis", Movement Disorders, 2024: https://doi.org/10.1002/mds.29918 (HTML; abstract)</w:t>
+        <w:t>D38</w:t>
+      </w:r>
+      <w:r>
+        <w:t xml:space="preserve"> Rizzo et al., "Accuracy of clinical diagnosis of Parkinson disease", Neurology, 2016: https://doi.org/10.1212/WNL.0000000000002350 (HTML; abstract)</w:t>
       </w:r>
     </w:p>
     <w:p>
@@ -32308,10 +32308,10 @@
         <w:rPr>
           <w:b/>
         </w:rPr>
-        <w:t>D54</w:t>
-      </w:r>
-      <w:r>
-        <w:t xml:space="preserve"> Multidisciplinary DBS screening, Movement Disorders Clinical Practice, 2018: https://pmc.ncbi.nlm.nih.gov/articles/PMC6183455/ (HTML)</w:t>
+        <w:t>D39</w:t>
+      </w:r>
+      <w:r>
+        <w:t xml:space="preserve"> Aspen Neuroscience, Form S-1, Oct 2026: https://www.sec.gov/Archives/edgar/data/2124080/000119312526419104/na-20261009.htm (HTML; no page numbers)</w:t>
       </w:r>
     </w:p>
     <w:p>
@@ -32476,10 +32476,10 @@
         <w:rPr>
           <w:b/>
         </w:rPr>
-        <w:t>D55</w:t>
-      </w:r>
-      <w:r>
-        <w:t xml:space="preserve"> Asadi-Pooya et al., World Neurosurgery, 2017 (drug-resistant mesial temporal lobe epilepsy prevalence and incidence): https://doi.org/10.1016/j.wneu.2016.12.074 (abstract)</w:t>
+        <w:t>D51</w:t>
+      </w:r>
+      <w:r>
+        <w:t xml:space="preserve"> Morgante et al., Parkinsonism and Related Disorders, 2007 (eligibility for DBS in movement-disorder clinics): https://pubmed.ncbi.nlm.nih.gov/17347021/ (abstract)</w:t>
       </w:r>
     </w:p>
     <w:p>
@@ -32490,10 +32490,10 @@
         <w:rPr>
           <w:b/>
         </w:rPr>
-        <w:t>D56</w:t>
-      </w:r>
-      <w:r>
-        <w:t xml:space="preserve"> Knopman and Roberts, 2011 (frontotemporal lobar degeneration incidence and prevalence): https://pmc.ncbi.nlm.nih.gov/articles/PMC3208074/ (HTML)</w:t>
+        <w:t>D52</w:t>
+      </w:r>
+      <w:r>
+        <w:t xml:space="preserve"> Moes et al. (D-DATS), Parkinsonism and Related Disorders, 2023 (eligibility for device-aided therapies): https://doi.org/10.1016/j.parkreldis.2023.105359 (HTML; abstract)</w:t>
       </w:r>
     </w:p>
     <w:p>
@@ -32504,10 +32504,10 @@
         <w:rPr>
           <w:b/>
         </w:rPr>
-        <w:t>D57</w:t>
-      </w:r>
-      <w:r>
-        <w:t xml:space="preserve"> GeneReviews, GRN frontotemporal dementia: https://www.ncbi.nlm.nih.gov/books/NBK1371/ ; Practical Neurology on ASPIRE-FTD (age 30–75): https://practicalneurology.com/news/fda-fast-track-designation-and-ind-clearance-granted-to-novel-gene-therapy-for-grn-related-frontotemporal-dementia/2470333/ (HTML)</w:t>
+        <w:t>D53</w:t>
+      </w:r>
+      <w:r>
+        <w:t xml:space="preserve"> Gibson et al., "Risk of dementia in Parkinson's disease: a systematic review and meta-analysis", Movement Disorders, 2024: https://doi.org/10.1002/mds.29918 (HTML; abstract)</w:t>
       </w:r>
     </w:p>
     <w:p>
@@ -32518,10 +32518,10 @@
         <w:rPr>
           <w:b/>
         </w:rPr>
-        <w:t>D58</w:t>
-      </w:r>
-      <w:r>
-        <w:t xml:space="preserve"> AADC deficiency birth prevalence: https://doi.org/10.1002/cns3.20010 ; screening-based range: https://doi.org/10.1016/j.ymgme.2024.108148 (HTML)</w:t>
+        <w:t>D54</w:t>
+      </w:r>
+      <w:r>
+        <w:t xml:space="preserve"> Multidisciplinary DBS screening, Movement Disorders Clinical Practice, 2018: https://pmc.ncbi.nlm.nih.gov/articles/PMC6183455/ (HTML)</w:t>
       </w:r>
     </w:p>
     <w:p>
@@ -32532,10 +32532,10 @@
         <w:rPr>
           <w:b/>
         </w:rPr>
-        <w:t>D59</w:t>
-      </w:r>
-      <w:r>
-        <w:t xml:space="preserve"> CDC NVSS, US births 2024 (final): https://www.cdc.gov/nchs/nvss/births.htm (HTML)</w:t>
+        <w:t>D55</w:t>
+      </w:r>
+      <w:r>
+        <w:t xml:space="preserve"> Asadi-Pooya et al., World Neurosurgery, 2017 (drug-resistant mesial temporal lobe epilepsy prevalence and incidence): https://doi.org/10.1016/j.wneu.2016.12.074 (abstract)</w:t>
       </w:r>
     </w:p>
     <w:p>
@@ -32546,10 +32546,10 @@
         <w:rPr>
           <w:b/>
         </w:rPr>
-        <w:t>D60</w:t>
-      </w:r>
-      <w:r>
-        <w:t xml:space="preserve"> HRSA, MPS II evidence review, Mar 28, 2022: https://www.hrsa.gov/sites/default/files/hrsa/advisory-committees/heritable-disorders/meetings/mps-ii-final-report-3-28-2022.pdf (PDF)</w:t>
+        <w:t>D56</w:t>
+      </w:r>
+      <w:r>
+        <w:t xml:space="preserve"> Knopman and Roberts, 2011 (frontotemporal lobar degeneration incidence and prevalence): https://pmc.ncbi.nlm.nih.gov/articles/PMC3208074/ (HTML)</w:t>
       </w:r>
     </w:p>
     <w:p>
@@ -32560,10 +32560,10 @@
         <w:rPr>
           <w:b/>
         </w:rPr>
-        <w:t>D61</w:t>
-      </w:r>
-      <w:r>
-        <w:t xml:space="preserve"> CBTRUS Statistical Report, Neuro-Oncology, 2025: https://academic.oup.com/neuro-oncology/article/27/Supplement_4/iv1/8285946 (HTML)</w:t>
+        <w:t>D57</w:t>
+      </w:r>
+      <w:r>
+        <w:t xml:space="preserve"> GeneReviews, GRN frontotemporal dementia: https://www.ncbi.nlm.nih.gov/books/NBK1371/ ; Practical Neurology on ASPIRE-FTD (age 30–75): https://practicalneurology.com/news/fda-fast-track-designation-and-ind-clearance-granted-to-novel-gene-therapy-for-grn-related-frontotemporal-dementia/2470333/ (HTML)</w:t>
       </w:r>
     </w:p>
     <w:p>
@@ -32574,10 +32574,10 @@
         <w:rPr>
           <w:b/>
         </w:rPr>
-        <w:t>D62</w:t>
-      </w:r>
-      <w:r>
-        <w:t xml:space="preserve"> NORD, Friedreich's ataxia: https://rarediseases.org/rare-diseases/friedreichs-ataxia/ (HTML)</w:t>
+        <w:t>D58</w:t>
+      </w:r>
+      <w:r>
+        <w:t xml:space="preserve"> AADC deficiency birth prevalence: https://doi.org/10.1002/cns3.20010 ; screening-based range: https://doi.org/10.1016/j.ymgme.2024.108148 (HTML)</w:t>
       </w:r>
     </w:p>
     <w:p>
@@ -32588,10 +32588,10 @@
         <w:rPr>
           <w:b/>
         </w:rPr>
-        <w:t>D63</w:t>
-      </w:r>
-      <w:r>
-        <w:t xml:space="preserve"> Brainlab, iPlan Flow 510(k) K053164 ("a dedicated tool for planning trajectories of intra-cranial catheters"): https://www.accessdata.fda.gov/cdrh_docs/pdf5/K053164.pdf ; Cranial Navigation K223288: https://www.accessdata.fda.gov/cdrh_docs/pdf22/K223288.pdf (PDF)</w:t>
+        <w:t>D59</w:t>
+      </w:r>
+      <w:r>
+        <w:t xml:space="preserve"> CDC NVSS, US births 2024 (final): https://www.cdc.gov/nchs/nvss/births.htm (HTML)</w:t>
       </w:r>
     </w:p>
     <w:p>
@@ -32602,10 +32602,10 @@
         <w:rPr>
           <w:b/>
         </w:rPr>
-        <w:t>D64</w:t>
-      </w:r>
-      <w:r>
-        <w:t xml:space="preserve"> FDA GUDID, Brainlab Flexible Catheter 19772 (MR Safe; in commercial distribution; premarket submission K123605, MRI Interventions, SmartFlow catheter): https://fda.report/GUDID/04056481006426 ; K123605: https://www.accessdata.fda.gov/cdrh_docs/pdf12/K123605.pdf (HTML/PDF)</w:t>
+        <w:t>D60</w:t>
+      </w:r>
+      <w:r>
+        <w:t xml:space="preserve"> HRSA, MPS II evidence review, Mar 28, 2022: https://www.hrsa.gov/sites/default/files/hrsa/advisory-committees/heritable-disorders/meetings/mps-ii-final-report-3-28-2022.pdf (PDF)</w:t>
       </w:r>
     </w:p>
     <w:p>
@@ -32616,10 +32616,10 @@
         <w:rPr>
           <w:b/>
         </w:rPr>
-        <w:t>D65</w:t>
-      </w:r>
-      <w:r>
-        <w:t xml:space="preserve"> CED in diffuse intrinsic pontine glioma, J Neurosurg Pediatr, 2021: https://thejns.org/pediatrics/view/journals/j-neurosurg-pediatr/28/1/article-p34.xml (HTML)</w:t>
+        <w:t>D61</w:t>
+      </w:r>
+      <w:r>
+        <w:t xml:space="preserve"> CBTRUS Statistical Report, Neuro-Oncology, 2025: https://academic.oup.com/neuro-oncology/article/27/Supplement_4/iv1/8285946 (HTML)</w:t>
       </w:r>
     </w:p>
     <w:p>
@@ -32630,10 +32630,10 @@
         <w:rPr>
           <w:b/>
         </w:rPr>
-        <w:t>D66</w:t>
-      </w:r>
-      <w:r>
-        <w:t xml:space="preserve"> Renishaw, neuroinfuse flyer: https://www.renishaw.com/resourcecentre/download/flyer-neuroinfuse-intraparenchymal-drug-delivery-system--100797 ; CDNF extension study release: https://www.renishaw.com/en/45590.aspx (HTML)</w:t>
+        <w:t>D62</w:t>
+      </w:r>
+      <w:r>
+        <w:t xml:space="preserve"> NORD, Friedreich's ataxia: https://rarediseases.org/rare-diseases/friedreichs-ataxia/ (HTML)</w:t>
       </w:r>
     </w:p>
     <w:p>
@@ -32644,10 +32644,10 @@
         <w:rPr>
           <w:b/>
         </w:rPr>
-        <w:t>D67</w:t>
-      </w:r>
-      <w:r>
-        <w:t xml:space="preserve"> Whone et al., "Randomized trial of intermittent intraputamenal GDNF in Parkinson's disease", Brain, 2019: https://pmc.ncbi.nlm.nih.gov/articles/PMC6391602/ (HTML)</w:t>
+        <w:t>D63</w:t>
+      </w:r>
+      <w:r>
+        <w:t xml:space="preserve"> Brainlab, iPlan Flow 510(k) K053164 ("a dedicated tool for planning trajectories of intra-cranial catheters"): https://www.accessdata.fda.gov/cdrh_docs/pdf5/K053164.pdf ; Cranial Navigation K223288: https://www.accessdata.fda.gov/cdrh_docs/pdf22/K223288.pdf (PDF)</w:t>
       </w:r>
     </w:p>
     <w:p>
@@ -32658,10 +32658,10 @@
         <w:rPr>
           <w:b/>
         </w:rPr>
-        <w:t>D68</w:t>
-      </w:r>
-      <w:r>
-        <w:t xml:space="preserve"> Aspen Neuroscience, ASPIRO uses ClearPoint Navigation System and SmartFlow Cannula, Jun 20, 2024: https://aspenneuroscience.com/parkinsons-disease-clinical-trial-uses-intraoperative-mri-to-guide-precision-implantation-of-patients-own-autologous-replacement-neurons/ (HTML)</w:t>
+        <w:t>D64</w:t>
+      </w:r>
+      <w:r>
+        <w:t xml:space="preserve"> FDA GUDID, Brainlab Flexible Catheter 19772 (MR Safe; in commercial distribution; premarket submission K123605, MRI Interventions, SmartFlow catheter): https://fda.report/GUDID/04056481006426 ; K123605: https://www.accessdata.fda.gov/cdrh_docs/pdf12/K123605.pdf (HTML/PDF)</w:t>
       </w:r>
     </w:p>
     <w:p>
@@ -32672,10 +32672,10 @@
         <w:rPr>
           <w:b/>
         </w:rPr>
-        <w:t>D69</w:t>
-      </w:r>
-      <w:r>
-        <w:t xml:space="preserve"> Neurochase, "Neurochase announces acquisition of strategic Renishaw Neuro Solutions' assets" (agreement announced Nov 20, 2025): https://neurochase.com/Blog/neurochase-announces-acquisition-of-strategic-renishaw-neuro-solutions-assets/ (HTML)</w:t>
+        <w:t>D65</w:t>
+      </w:r>
+      <w:r>
+        <w:t xml:space="preserve"> CED in diffuse intrinsic pontine glioma, J Neurosurg Pediatr, 2021: https://thejns.org/pediatrics/view/journals/j-neurosurg-pediatr/28/1/article-p34.xml (HTML)</w:t>
       </w:r>
     </w:p>
     <w:p>
@@ -32686,10 +32686,10 @@
         <w:rPr>
           <w:b/>
         </w:rPr>
-        <w:t>D71</w:t>
-      </w:r>
-      <w:r>
-        <w:t xml:space="preserve"> ClinicalTrials.gov registry entries, eligibility criteria (API v2, full criteria read Oct 25, 2026): https://clinicaltrials.gov/study/NCT06944522 ; https://clinicaltrials.gov/study/NCT06285643 ; https://clinicaltrials.gov/study/NCT07566429 ; https://clinicaltrials.gov/study/NCT01621581 ; https://clinicaltrials.gov/study/NCT04167540 ; https://clinicaltrials.gov/study/NCT06344026 ; https://clinicaltrials.gov/study/NCT07106021 ; https://clinicaltrials.gov/study/NCT01973543 ; https://clinicaltrials.gov/study/NCT03562494 ; https://clinicaltrials.gov/study/NCT00985517</w:t>
+        <w:t>D66</w:t>
+      </w:r>
+      <w:r>
+        <w:t xml:space="preserve"> Renishaw, neuroinfuse flyer: https://www.renishaw.com/resourcecentre/download/flyer-neuroinfuse-intraparenchymal-drug-delivery-system--100797 ; CDNF extension study release: https://www.renishaw.com/en/45590.aspx (HTML)</w:t>
       </w:r>
     </w:p>
     <w:p>
@@ -32700,10 +32700,10 @@
         <w:rPr>
           <w:b/>
         </w:rPr>
-        <w:t>D72</w:t>
-      </w:r>
-      <w:r>
-        <w:t xml:space="preserve"> Herzog et al., Mov Disord 2008, DBS in fetal-graft patients (abstract): https://pubmed.ncbi.nlm.nih.gov/18536037/</w:t>
+        <w:t>D67</w:t>
+      </w:r>
+      <w:r>
+        <w:t xml:space="preserve"> Whone et al., "Randomized trial of intermittent intraputamenal GDNF in Parkinson's disease", Brain, 2019: https://pmc.ncbi.nlm.nih.gov/articles/PMC6391602/ (HTML)</w:t>
       </w:r>
     </w:p>
     <w:p>
@@ -32714,10 +32714,10 @@
         <w:rPr>
           <w:b/>
         </w:rPr>
-        <w:t>D73</w:t>
-      </w:r>
-      <w:r>
-        <w:t xml:space="preserve"> Graff-Radford et al., Arch Neurol 2006, GPi DBS for dyskinesia 11 years after a graft (abstract): https://jamanetwork.com/journals/jamaneurology/fullarticle/791926</w:t>
+        <w:t>D68</w:t>
+      </w:r>
+      <w:r>
+        <w:t xml:space="preserve"> Aspen Neuroscience, ASPIRO uses ClearPoint Navigation System and SmartFlow Cannula, Jun 20, 2024: https://aspenneuroscience.com/parkinsons-disease-clinical-trial-uses-intraoperative-mri-to-guide-precision-implantation-of-patients-own-autologous-replacement-neurons/ (HTML)</w:t>
       </w:r>
     </w:p>
     <w:p>
@@ -32728,10 +32728,10 @@
         <w:rPr>
           <w:b/>
         </w:rPr>
-        <w:t>D74</w:t>
-      </w:r>
-      <w:r>
-        <w:t xml:space="preserve"> Freed group, npj Parkinson's Dis 2021, pallidal stimulation in graft recipients (abstract): https://www.nature.com/articles/s41531-021-00183-w</w:t>
+        <w:t>D69</w:t>
+      </w:r>
+      <w:r>
+        <w:t xml:space="preserve"> Neurochase, "Neurochase announces acquisition of strategic Renishaw Neuro Solutions' assets" (agreement announced Nov 20, 2025): https://neurochase.com/Blog/neurochase-announces-acquisition-of-strategic-renishaw-neuro-solutions-assets/ (HTML)</w:t>
       </w:r>
     </w:p>
     <w:p>
@@ -32742,10 +32742,10 @@
         <w:rPr>
           <w:b/>
         </w:rPr>
-        <w:t>D75</w:t>
-      </w:r>
-      <w:r>
-        <w:t xml:space="preserve"> MDS abstract, cell-based therapy in patients with an existing DBS system: https://www.mdsabstracts.org/abstract/unilateral-delivery-of-cell-based-therapy-to-the-putamen-and-substantia-nigra-in-patients-with-parkinsons-disease-who-have-an-existing-dbs-system/</w:t>
+        <w:t>D70</w:t>
+      </w:r>
+      <w:r>
+        <w:t xml:space="preserve"> Neurochase home page (nFuse: "Currently For investigational use only. Not approved for clinical use in any geography"): https://neurochase.com/ ; ASGCT 2026 poster post ("designed to be compatible with existing neurosurgical robots and frames"): https://www.linkedin.com/posts/fearsomedesign_asgct2026-asgct2026-genetherapy-activity-7460266710869213184-F5YQ (HTML)</w:t>
       </w:r>
     </w:p>
     <w:p>
@@ -32756,10 +32756,10 @@
         <w:rPr>
           <w:b/>
         </w:rPr>
-        <w:t>D76</w:t>
-      </w:r>
-      <w:r>
-        <w:t xml:space="preserve"> Mov Disord 2015, "Combining cell transplants or gene therapy with DBS" (abstract): https://doi.org/10.1002/mds.26083</w:t>
+        <w:t>D71</w:t>
+      </w:r>
+      <w:r>
+        <w:t xml:space="preserve"> ClinicalTrials.gov registry entries, eligibility criteria (API v2, full criteria read Oct 25, 2026): https://clinicaltrials.gov/study/NCT06944522 ; https://clinicaltrials.gov/study/NCT06285643 ; https://clinicaltrials.gov/study/NCT07566429 ; https://clinicaltrials.gov/study/NCT01621581 ; https://clinicaltrials.gov/study/NCT04167540 ; https://clinicaltrials.gov/study/NCT06344026 ; https://clinicaltrials.gov/study/NCT07106021 ; https://clinicaltrials.gov/study/NCT01973543 ; https://clinicaltrials.gov/study/NCT03562494 ; https://clinicaltrials.gov/study/NCT00985517</w:t>
       </w:r>
     </w:p>
     <w:p>
@@ -32770,10 +32770,10 @@
         <w:rPr>
           <w:b/>
         </w:rPr>
-        <w:t>D70</w:t>
-      </w:r>
-      <w:r>
-        <w:t xml:space="preserve"> Neurochase home page (nFuse: "Currently For investigational use only. Not approved for clinical use in any geography"): https://neurochase.com/ ; ASGCT 2026 poster post ("designed to be compatible with existing neurosurgical robots and frames"): https://www.linkedin.com/posts/fearsomedesign_asgct2026-asgct2026-genetherapy-activity-7460266710869213184-F5YQ (HTML)</w:t>
+        <w:t>D72</w:t>
+      </w:r>
+      <w:r>
+        <w:t xml:space="preserve"> Herzog et al., Mov Disord 2008, DBS in fetal-graft patients (abstract): https://pubmed.ncbi.nlm.nih.gov/18536037/</w:t>
       </w:r>
     </w:p>
     <w:p>
@@ -32784,10 +32784,10 @@
         <w:rPr>
           <w:b/>
         </w:rPr>
-        <w:t>D16</w:t>
-      </w:r>
-      <w:r>
-        <w:t xml:space="preserve"> Finagle discounted-cash-flow valuation runs of the base, bull and bear cases and of add-on cases, Oct 25, 2026 (model output, not published; superseded; not used)</w:t>
+        <w:t>D73</w:t>
+      </w:r>
+      <w:r>
+        <w:t xml:space="preserve"> Graff-Radford et al., Arch Neurol 2006, GPi DBS for dyskinesia 11 years after a graft (abstract): https://jamanetwork.com/journals/jamaneurology/fullarticle/791926</w:t>
       </w:r>
     </w:p>
     <w:p>
@@ -32798,10 +32798,10 @@
         <w:rPr>
           <w:b/>
         </w:rPr>
-        <w:t>D77</w:t>
-      </w:r>
-      <w:r>
-        <w:t xml:space="preserve"> Finagle discounted-cash-flow valuation runs of the base, bull and bear cases and one-at-a-time sensitivity reruns on P3 inputs, Oct 26, 2026 (model output, not published): run_finagle_v11.py, sensitivity_v11.py</w:t>
+        <w:t>D74</w:t>
+      </w:r>
+      <w:r>
+        <w:t xml:space="preserve"> Freed group, npj Parkinson's Dis 2021, pallidal stimulation in graft recipients (abstract): https://www.nature.com/articles/s41531-021-00183-w</w:t>
       </w:r>
     </w:p>
     <w:p>
@@ -32812,10 +32812,10 @@
         <w:rPr>
           <w:b/>
         </w:rPr>
-        <w:t>D24</w:t>
-      </w:r>
-      <w:r>
-        <w:t xml:space="preserve"> Systematic review and meta-analysis of Huntington's disease incidence (regional rates; UK studies incl. Wexler 2016): https://pmc.ncbi.nlm.nih.gov/articles/PMC10086981/ (HTML)</w:t>
+        <w:t>D75</w:t>
+      </w:r>
+      <w:r>
+        <w:t xml:space="preserve"> MDS abstract, cell-based therapy in patients with an existing DBS system: https://www.mdsabstracts.org/abstract/unilateral-delivery-of-cell-based-therapy-to-the-putamen-and-substantia-nigra-in-patients-with-parkinsons-disease-who-have-an-existing-dbs-system/</w:t>
       </w:r>
     </w:p>
     <w:p>
@@ -32826,10 +32826,10 @@
         <w:rPr>
           <w:b/>
         </w:rPr>
-        <w:t>D25</w:t>
-      </w:r>
-      <w:r>
-        <w:t xml:space="preserve"> Parkinson's Foundation, Prevalence &amp; Incidence: https://www.parkinson.org/understanding-parkinsons/statistics/prevalence-incidence (HTML); Willis et al., npj Parkinson's Disease 2022: https://www.nature.com/articles/s41531-022-00410-y (HTML)</w:t>
+        <w:t>D76</w:t>
+      </w:r>
+      <w:r>
+        <w:t xml:space="preserve"> Mov Disord 2015, "Combining cell transplants or gene therapy with DBS" (abstract): https://doi.org/10.1002/mds.26083</w:t>
       </w:r>
     </w:p>
     <w:p>
@@ -32840,10 +32840,10 @@
         <w:rPr>
           <w:b/>
         </w:rPr>
-        <w:t>D26</w:t>
-      </w:r>
-      <w:r>
-        <w:t xml:space="preserve"> Venkatraman et al., J Neurosurg 2024, "Disparities in the treatment of movement disorders using deep brain stimulation" (NIS 2012–19, Table 4): https://pmc.ncbi.nlm.nih.gov/articles/PMC10898494/ (HTML)</w:t>
+        <w:t>D77</w:t>
+      </w:r>
+      <w:r>
+        <w:t xml:space="preserve"> Finagle discounted-cash-flow valuation runs of the base, bull and bear cases and one-at-a-time sensitivity reruns on P3 inputs, Oct 26, 2026 (model output, not published): run_finagle_v11.py, sensitivity_v11.py</w:t>
       </w:r>
     </w:p>
     <w:p>
@@ -32862,10 +32862,10 @@
         <w:rPr>
           <w:b/>
         </w:rPr>
-        <w:t>A12</w:t>
-      </w:r>
-      <w:r>
-        <w:t xml:space="preserve"> "It is estimated that 10–15% of PD-patients are DBS-candidates". D27.</w:t>
+        <w:t>A1</w:t>
+      </w:r>
+      <w:r>
+        <w:t xml:space="preserve"> Total revenue $31.390M (FY2024A) and $36.971M (FY2025A). D1.</w:t>
       </w:r>
     </w:p>
     <w:p>
@@ -32876,10 +32876,10 @@
         <w:rPr>
           <w:b/>
         </w:rPr>
-        <w:t>A14</w:t>
-      </w:r>
-      <w:r>
-        <w:t xml:space="preserve"> "114 (43.2%) patients preselected as eligible for DBS … agreed to show up at a specialized DBS center". D29.</w:t>
+        <w:t>A2</w:t>
+      </w:r>
+      <w:r>
+        <w:t xml:space="preserve"> FY2024A/FY2025A disaggregated revenue: BDD 17.310/19.040; NNT 10.285/14.831; CES 3.795/3.100. D1, Note 2/MD&amp;A.</w:t>
       </w:r>
     </w:p>
     <w:p>
@@ -32890,10 +32890,10 @@
         <w:rPr>
           <w:b/>
         </w:rPr>
-        <w:t>A15</w:t>
-      </w:r>
-      <w:r>
-        <w:t xml:space="preserve"> "By 2030, an estimated 1.2 million people in the U.S. will be living with Parkinson's." D25.</w:t>
+        <w:t>A3</w:t>
+      </w:r>
+      <w:r>
+        <w:t xml:space="preserve"> FY2025A EBITDA (before SBC) −$15.170M = operating loss −24.164 + D&amp;A 0.814 + SBC 8.180. D1 via Finagle's baseline data.</w:t>
       </w:r>
     </w:p>
     <w:p>
@@ -32904,10 +32904,10 @@
         <w:rPr>
           <w:b/>
         </w:rPr>
-        <w:t>A1</w:t>
-      </w:r>
-      <w:r>
-        <w:t xml:space="preserve"> Total revenue $31.390M (FY2024A) and $36.971M (FY2025A). D1.</w:t>
+        <w:t>A4</w:t>
+      </w:r>
+      <w:r>
+        <w:t xml:space="preserve"> H1 2026A revenue $23.008M: BDD 8.839, NNT 11.439, CES 2.730. H1 2025A $17.700M. D2.</w:t>
       </w:r>
     </w:p>
     <w:p>
@@ -32918,10 +32918,10 @@
         <w:rPr>
           <w:b/>
         </w:rPr>
-        <w:t>A2</w:t>
-      </w:r>
-      <w:r>
-        <w:t xml:space="preserve"> FY2024A/FY2025A disaggregated revenue: BDD 17.310/19.040; NNT 10.285/14.831; CES 3.795/3.100. D1, Note 2/MD&amp;A.</w:t>
+        <w:t>A5</w:t>
+      </w:r>
+      <w:r>
+        <w:t xml:space="preserve"> H1 2026A operating loss −18.722, D&amp;A 0.236, intangible amortization 1.007, SBC 4.489. D3.</w:t>
       </w:r>
     </w:p>
     <w:p>
@@ -32932,10 +32932,10 @@
         <w:rPr>
           <w:b/>
         </w:rPr>
-        <w:t>A3</w:t>
-      </w:r>
-      <w:r>
-        <w:t xml:space="preserve"> FY2025A EBITDA (before SBC) −$15.170M = operating loss −24.164 + D&amp;A 0.814 + SBC 8.180. D1 via Finagle's baseline data.</w:t>
+        <w:t>A6</w:t>
+      </w:r>
+      <w:r>
+        <w:t xml:space="preserve"> 2017 revenue $7,379,525. D14.</w:t>
       </w:r>
     </w:p>
     <w:p>
@@ -32946,10 +32946,10 @@
         <w:rPr>
           <w:b/>
         </w:rPr>
-        <w:t>A4</w:t>
-      </w:r>
-      <w:r>
-        <w:t xml:space="preserve"> H1 2026A revenue $23.008M: BDD 8.839, NNT 11.439, CES 2.730. H1 2025A $17.700M. D2.</w:t>
+        <w:t>A7</w:t>
+      </w:r>
+      <w:r>
+        <w:t xml:space="preserve"> "the cumulative incidence was 1.22 per 100,000 person-years" (age-adjusted, US insured cohort 2003–2016). D18.</w:t>
       </w:r>
     </w:p>
     <w:p>
@@ -32960,10 +32960,10 @@
         <w:rPr>
           <w:b/>
         </w:rPr>
-        <w:t>A5</w:t>
-      </w:r>
-      <w:r>
-        <w:t xml:space="preserve"> H1 2026A operating loss −18.722, D&amp;A 0.236, intangible amortization 1.007, SBC 4.489. D3.</w:t>
+        <w:t>A8</w:t>
+      </w:r>
+      <w:r>
+        <w:t xml:space="preserve"> UK HD incidence 0.67 per 100,000 (Wexler 2016, as compiled in D24); Europe pooled 0.38. D24.</w:t>
       </w:r>
     </w:p>
     <w:p>
@@ -32974,10 +32974,10 @@
         <w:rPr>
           <w:b/>
         </w:rPr>
-        <w:t>A6</w:t>
-      </w:r>
-      <w:r>
-        <w:t xml:space="preserve"> 2017 revenue $7,379,525. D14.</w:t>
+        <w:t>A9</w:t>
+      </w:r>
+      <w:r>
+        <w:t xml:space="preserve"> "nearly 90,000 people … diagnosed with Parkinson's disease every year" in the US. D25.</w:t>
       </w:r>
     </w:p>
     <w:p>
@@ -32988,10 +32988,10 @@
         <w:rPr>
           <w:b/>
         </w:rPr>
-        <w:t>A7</w:t>
-      </w:r>
-      <w:r>
-        <w:t xml:space="preserve"> "the cumulative incidence was 1.22 per 100,000 person-years" (age-adjusted, US insured cohort 2003–2016). D18.</w:t>
+        <w:t>A10</w:t>
+      </w:r>
+      <w:r>
+        <w:t xml:space="preserve"> DBS for PD in US inpatient discharges: 3,615–4,025 a year 2016–19; 3,990 (1.10% of PD discharges) in 2019. D26, Table 4.</w:t>
       </w:r>
     </w:p>
     <w:p>
@@ -33002,10 +33002,10 @@
         <w:rPr>
           <w:b/>
         </w:rPr>
-        <w:t>A8</w:t>
-      </w:r>
-      <w:r>
-        <w:t xml:space="preserve"> UK HD incidence 0.67 per 100,000 (Wexler 2016, as compiled in D24); Europe pooled 0.38. D24.</w:t>
+        <w:t>A12</w:t>
+      </w:r>
+      <w:r>
+        <w:t xml:space="preserve"> "It is estimated that 10–15% of PD-patients are DBS-candidates". D27.</w:t>
       </w:r>
     </w:p>
     <w:p>
@@ -33016,10 +33016,10 @@
         <w:rPr>
           <w:b/>
         </w:rPr>
-        <w:t>A9</w:t>
-      </w:r>
-      <w:r>
-        <w:t xml:space="preserve"> "nearly 90,000 people … diagnosed with Parkinson's disease every year" in the US. D25.</w:t>
+        <w:t>A14</w:t>
+      </w:r>
+      <w:r>
+        <w:t xml:space="preserve"> "114 (43.2%) patients preselected as eligible for DBS … agreed to show up at a specialized DBS center". D29.</w:t>
       </w:r>
     </w:p>
     <w:p>
@@ -33030,10 +33030,10 @@
         <w:rPr>
           <w:b/>
         </w:rPr>
-        <w:t>A10</w:t>
-      </w:r>
-      <w:r>
-        <w:t xml:space="preserve"> DBS for PD in US inpatient discharges: 3,615–4,025 a year 2016–19; 3,990 (1.10% of PD discharges) in 2019. D26, Table 4.</w:t>
+        <w:t>A15</w:t>
+      </w:r>
+      <w:r>
+        <w:t xml:space="preserve"> "By 2030, an estimated 1.2 million people in the U.S. will be living with Parkinson's." D25.</w:t>
       </w:r>
     </w:p>
     <w:p>
@@ -33044,10 +33044,10 @@
         <w:rPr>
           <w:b/>
         </w:rPr>
-        <w:t>A30</w:t>
-      </w:r>
-      <w:r>
-        <w:t xml:space="preserve"> At least 930,000 Americans aged 45 or over with PD in 2020 and 1,238,000 in 2030; the authors call these minimum estimates. D33.</w:t>
+        <w:t>A21</w:t>
+      </w:r>
+      <w:r>
+        <w:t xml:space="preserve"> Drug-resistant MTLE (hippocampal sclerosis): US prevalence 143,000–191,000; incidence 3.1–3.4 per 100,000 a year (× 324M ≈ 10,000–11,000). D55 (abstract).</w:t>
       </w:r>
     </w:p>
     <w:p>
@@ -33058,10 +33058,10 @@
         <w:rPr>
           <w:b/>
         </w:rPr>
-        <w:t>A31</w:t>
-      </w:r>
-      <w:r>
-        <w:t xml:space="preserve"> Survival in PD falls by about 5% for each year of follow-up. D34.</w:t>
+        <w:t>A22</w:t>
+      </w:r>
+      <w:r>
+        <w:t xml:space="preserve"> FTLD incidence 2.7–4.1 per 100,000 person-years (age 45–64); US prevalence 20,000–30,000. D56.</w:t>
       </w:r>
     </w:p>
     <w:p>
@@ -33072,10 +33072,10 @@
         <w:rPr>
           <w:b/>
         </w:rPr>
-        <w:t>A32</w:t>
-      </w:r>
-      <w:r>
-        <w:t xml:space="preserve"> Point prevalence of dementia in PD 24.5% across all studies, 31.1% in the highest-quality studies. D35.</w:t>
+        <w:t>A23</w:t>
+      </w:r>
+      <w:r>
+        <w:t xml:space="preserve"> GRN mutations about 5% of FTD; US GRN-FTD prevalence about 1,000–1,500 (derived from A22 × 5%). D57.</w:t>
       </w:r>
     </w:p>
     <w:p>
@@ -33086,10 +33086,10 @@
         <w:rPr>
           <w:b/>
         </w:rPr>
-        <w:t>A33</w:t>
-      </w:r>
-      <w:r>
-        <w:t xml:space="preserve"> Off periods affected 35% of patients at 4–6 years and 59% at 8–10 years (3,343 UK patients). D36.</w:t>
+        <w:t>A24</w:t>
+      </w:r>
+      <w:r>
+        <w:t xml:space="preserve"> ASPIRE-FTD enrols age 30–75. D57 (Practical Neurology).</w:t>
       </w:r>
     </w:p>
     <w:p>
@@ -33100,10 +33100,10 @@
         <w:rPr>
           <w:b/>
         </w:rPr>
-        <w:t>A34</w:t>
-      </w:r>
-      <w:r>
-        <w:t xml:space="preserve"> Motor fluctuations in 54% of a population-based incident cohort by five years. D37.</w:t>
+        <w:t>A25</w:t>
+      </w:r>
+      <w:r>
+        <w:t xml:space="preserve"> AADC deficiency about 1 in 90,000 births (screening-based range 1/64,000–1/766,660). D58.</w:t>
       </w:r>
     </w:p>
     <w:p>
@@ -33114,10 +33114,10 @@
         <w:rPr>
           <w:b/>
         </w:rPr>
-        <w:t>A35</w:t>
-      </w:r>
-      <w:r>
-        <w:t xml:space="preserve"> Pooled accuracy of clinical PD diagnosis against pathology 80.6%. D38.</w:t>
+        <w:t>A26</w:t>
+      </w:r>
+      <w:r>
+        <w:t xml:space="preserve"> US births 2024: 3,628,934. D59.</w:t>
       </w:r>
     </w:p>
     <w:p>
@@ -33128,10 +33128,10 @@
         <w:rPr>
           <w:b/>
         </w:rPr>
-        <w:t>A36</w:t>
-      </w:r>
-      <w:r>
-        <w:t xml:space="preserve"> Roughly half of about 300,000 drug-refractory US patients may be eligible for cell-replacement surgery (about 15% of PD). D39.</w:t>
+        <w:t>A27</w:t>
+      </w:r>
+      <w:r>
+        <w:t xml:space="preserve"> MPS II about 1 in 162,000 male births (range 0.26–1.4 per 100,000 births). D60.</w:t>
       </w:r>
     </w:p>
     <w:p>
@@ -33142,10 +33142,10 @@
         <w:rPr>
           <w:b/>
         </w:rPr>
-        <w:t>A37</w:t>
-      </w:r>
-      <w:r>
-        <w:t xml:space="preserve"> 4.5% of patients eligible for DBS under flexible criteria in Italian movement-disorder clinics. D51.</w:t>
+        <w:t>A28</w:t>
+      </w:r>
+      <w:r>
+        <w:t xml:space="preserve"> Glioblastoma: 67,250 US cases 2018–2022, about 13,450 a year. D61.</w:t>
       </w:r>
     </w:p>
     <w:p>
@@ -33156,10 +33156,10 @@
         <w:rPr>
           <w:b/>
         </w:rPr>
-        <w:t>A38</w:t>
-      </w:r>
-      <w:r>
-        <w:t xml:space="preserve"> 6.6% eligible for referral to any device-aided therapy in a Dutch general hospital. D52.</w:t>
+        <w:t>A29</w:t>
+      </w:r>
+      <w:r>
+        <w:t xml:space="preserve"> Friedreich's ataxia about 1 in 50,000; about 5,000 US patients. D62.</w:t>
       </w:r>
     </w:p>
     <w:p>
@@ -33170,10 +33170,10 @@
         <w:rPr>
           <w:b/>
         </w:rPr>
-        <w:t>A39</w:t>
-      </w:r>
-      <w:r>
-        <w:t xml:space="preserve"> Dementia incidence in PD 4.45 per 100 person-years. D53.</w:t>
+        <w:t>A30</w:t>
+      </w:r>
+      <w:r>
+        <w:t xml:space="preserve"> At least 930,000 Americans aged 45 or over with PD in 2020 and 1,238,000 in 2030; the authors call these minimum estimates. D33.</w:t>
       </w:r>
     </w:p>
     <w:p>
@@ -33184,10 +33184,10 @@
         <w:rPr>
           <w:b/>
         </w:rPr>
-        <w:t>A41</w:t>
-      </w:r>
-      <w:r>
-        <w:t xml:space="preserve"> Every PD cell/gene therapy trial checked excludes prior DBS at entry (bemdaneprocel exPDite-2, AB-1005 REGENERATE-PD and Japan, AAV2-GDNF Ph1 and Ph1b, ANPD001 ASPIRO, RNDP-001, VY-AADC01/02, CERE-120); none states a biological or safety reason; RESTORE-1 cites prior surgery that "could complicate the study procedure or negatively impact study evaluations". D71.</w:t>
+        <w:t>A31</w:t>
+      </w:r>
+      <w:r>
+        <w:t xml:space="preserve"> Survival in PD falls by about 5% for each year of follow-up. D34.</w:t>
       </w:r>
     </w:p>
     <w:p>
@@ -33198,10 +33198,10 @@
         <w:rPr>
           <w:b/>
         </w:rPr>
-        <w:t>A42</w:t>
-      </w:r>
-      <w:r>
-        <w:t xml:space="preserve"> DBS has been added after cell grafts in small series: 2 patients (D72), 1 patient 11 years after a graft (D73), 3 of 34 graft recipients (D74). Abstracts.</w:t>
+        <w:t>A32</w:t>
+      </w:r>
+      <w:r>
+        <w:t xml:space="preserve"> Point prevalence of dementia in PD 24.5% across all studies, 31.1% in the highest-quality studies. D35.</w:t>
       </w:r>
     </w:p>
     <w:p>
@@ -33212,10 +33212,10 @@
         <w:rPr>
           <w:b/>
         </w:rPr>
-        <w:t>A43</w:t>
-      </w:r>
-      <w:r>
-        <w:t xml:space="preserve"> Grafts were placed in 3 patients with an existing DBS lead, with adverse events "comparable to standard DBS surgery" (D75); combining cell or gene therapy with DBS is proposed in an expert review (D76). Abstracts.</w:t>
+        <w:t>A33</w:t>
+      </w:r>
+      <w:r>
+        <w:t xml:space="preserve"> Off periods affected 35% of patients at 4–6 years and 59% at 8–10 years (3,343 UK patients). D36.</w:t>
       </w:r>
     </w:p>
     <w:p>
@@ -33226,10 +33226,10 @@
         <w:rPr>
           <w:b/>
         </w:rPr>
-        <w:t>A40</w:t>
-      </w:r>
-      <w:r>
-        <w:t xml:space="preserve"> 58.7% of patients evaluated in multidisciplinary DBS screening proceeded to implant. D54. 43.2% of preselected eligible patients agreed to referral to a DBS centre (A14).</w:t>
+        <w:t>A34</w:t>
+      </w:r>
+      <w:r>
+        <w:t xml:space="preserve"> Motor fluctuations in 54% of a population-based incident cohort by five years. D37.</w:t>
       </w:r>
     </w:p>
     <w:p>
@@ -33240,10 +33240,10 @@
         <w:rPr>
           <w:b/>
         </w:rPr>
-        <w:t>A21</w:t>
-      </w:r>
-      <w:r>
-        <w:t xml:space="preserve"> Drug-resistant MTLE (hippocampal sclerosis): US prevalence 143,000–191,000; incidence 3.1–3.4 per 100,000 a year (× 324M ≈ 10,000–11,000). D55 (abstract).</w:t>
+        <w:t>A35</w:t>
+      </w:r>
+      <w:r>
+        <w:t xml:space="preserve"> Pooled accuracy of clinical PD diagnosis against pathology 80.6%. D38.</w:t>
       </w:r>
     </w:p>
     <w:p>
@@ -33254,10 +33254,10 @@
         <w:rPr>
           <w:b/>
         </w:rPr>
-        <w:t>A22</w:t>
-      </w:r>
-      <w:r>
-        <w:t xml:space="preserve"> FTLD incidence 2.7–4.1 per 100,000 person-years (age 45–64); US prevalence 20,000–30,000. D56.</w:t>
+        <w:t>A36</w:t>
+      </w:r>
+      <w:r>
+        <w:t xml:space="preserve"> Roughly half of about 300,000 drug-refractory US patients may be eligible for cell-replacement surgery (about 15% of PD). D39.</w:t>
       </w:r>
     </w:p>
     <w:p>
@@ -33268,10 +33268,10 @@
         <w:rPr>
           <w:b/>
         </w:rPr>
-        <w:t>A23</w:t>
-      </w:r>
-      <w:r>
-        <w:t xml:space="preserve"> GRN mutations about 5% of FTD; US GRN-FTD prevalence about 1,000–1,500 (derived from A22 × 5%). D57.</w:t>
+        <w:t>A37</w:t>
+      </w:r>
+      <w:r>
+        <w:t xml:space="preserve"> 4.5% of patients eligible for DBS under flexible criteria in Italian movement-disorder clinics. D51.</w:t>
       </w:r>
     </w:p>
     <w:p>
@@ -33282,10 +33282,10 @@
         <w:rPr>
           <w:b/>
         </w:rPr>
-        <w:t>A24</w:t>
-      </w:r>
-      <w:r>
-        <w:t xml:space="preserve"> ASPIRE-FTD enrols age 30–75. D57 (Practical Neurology).</w:t>
+        <w:t>A38</w:t>
+      </w:r>
+      <w:r>
+        <w:t xml:space="preserve"> 6.6% eligible for referral to any device-aided therapy in a Dutch general hospital. D52.</w:t>
       </w:r>
     </w:p>
     <w:p>
@@ -33296,10 +33296,10 @@
         <w:rPr>
           <w:b/>
         </w:rPr>
-        <w:t>A25</w:t>
-      </w:r>
-      <w:r>
-        <w:t xml:space="preserve"> AADC deficiency about 1 in 90,000 births (screening-based range 1/64,000–1/766,660). D58.</w:t>
+        <w:t>A39</w:t>
+      </w:r>
+      <w:r>
+        <w:t xml:space="preserve"> Dementia incidence in PD 4.45 per 100 person-years. D53.</w:t>
       </w:r>
     </w:p>
     <w:p>
@@ -33310,10 +33310,10 @@
         <w:rPr>
           <w:b/>
         </w:rPr>
-        <w:t>A26</w:t>
-      </w:r>
-      <w:r>
-        <w:t xml:space="preserve"> US births 2024: 3,628,934. D59.</w:t>
+        <w:t>A40</w:t>
+      </w:r>
+      <w:r>
+        <w:t xml:space="preserve"> 58.7% of patients evaluated in multidisciplinary DBS screening proceeded to implant. D54. 43.2% of preselected eligible patients agreed to referral to a DBS centre (A14).</w:t>
       </w:r>
     </w:p>
     <w:p>
@@ -33324,10 +33324,10 @@
         <w:rPr>
           <w:b/>
         </w:rPr>
-        <w:t>A27</w:t>
-      </w:r>
-      <w:r>
-        <w:t xml:space="preserve"> MPS II about 1 in 162,000 male births (range 0.26–1.4 per 100,000 births). D60.</w:t>
+        <w:t>A41</w:t>
+      </w:r>
+      <w:r>
+        <w:t xml:space="preserve"> Every PD cell/gene therapy trial checked excludes prior DBS at entry (bemdaneprocel exPDite-2, AB-1005 REGENERATE-PD and Japan, AAV2-GDNF Ph1 and Ph1b, ANPD001 ASPIRO, RNDP-001, VY-AADC01/02, CERE-120); none states a biological or safety reason; RESTORE-1 cites prior surgery that "could complicate the study procedure or negatively impact study evaluations". D71.</w:t>
       </w:r>
     </w:p>
     <w:p>
@@ -33338,10 +33338,10 @@
         <w:rPr>
           <w:b/>
         </w:rPr>
-        <w:t>A28</w:t>
-      </w:r>
-      <w:r>
-        <w:t xml:space="preserve"> Glioblastoma: 67,250 US cases 2018–2022, about 13,450 a year. D61.</w:t>
+        <w:t>A42</w:t>
+      </w:r>
+      <w:r>
+        <w:t xml:space="preserve"> DBS has been added after cell grafts in small series: 2 patients (D72), 1 patient 11 years after a graft (D73), 3 of 34 graft recipients (D74). Abstracts.</w:t>
       </w:r>
     </w:p>
     <w:p>
@@ -33352,10 +33352,10 @@
         <w:rPr>
           <w:b/>
         </w:rPr>
-        <w:t>A29</w:t>
-      </w:r>
-      <w:r>
-        <w:t xml:space="preserve"> Friedreich's ataxia about 1 in 50,000; about 5,000 US patients. D62.</w:t>
+        <w:t>A43</w:t>
+      </w:r>
+      <w:r>
+        <w:t xml:space="preserve"> Grafts were placed in 3 patients with an existing DBS lead, with adverse events "comparable to standard DBS surgery" (D75); combining cell or gene therapy with DBS is proposed in an expert review (D76). Abstracts.</w:t>
       </w:r>
     </w:p>
     <w:p>
@@ -33374,10 +33374,10 @@
         <w:rPr>
           <w:b/>
         </w:rPr>
-        <w:t>G9</w:t>
-      </w:r>
-      <w:r>
-        <w:t xml:space="preserve"> Burnett: prior preclinical capacity "$8 million a year or something like that"; the CAL "could surpass $60 million or so at this facility"; "our revenue miss in the quarter … was largely attributed to a delayed ramp of these preclinical CAL services"; "accelerated adoption of GLP studies at the CAL could go faster than" high-teens 2027 growth; added people are "built into that cost structure". D6.</w:t>
+        <w:t>G1</w:t>
+      </w:r>
+      <w:r>
+        <w:t xml:space="preserve"> FY2025 revenue guidance $36.0–41.0M. D5.</w:t>
       </w:r>
     </w:p>
     <w:p>
@@ -33388,10 +33388,10 @@
         <w:rPr>
           <w:b/>
         </w:rPr>
-        <w:t>G10</w:t>
-      </w:r>
-      <w:r>
-        <w:t xml:space="preserve"> First GLP statement of work "in the multi-million dollar range", expected to be fully recognised by end of H1 2027; 2026 guidance "does not include the execution of any of these large studies"; larger studies expected to start "in the second half of next year". D6; D3.</w:t>
+        <w:t>G2</w:t>
+      </w:r>
+      <w:r>
+        <w:t xml:space="preserve"> "adjusting our 2026 revenue guidance to between $48.0 - $52.0 million" (original $52.0–56.0M). Also: 10–15 trials enrolling, about 10 readouts in 18 months, CAL, SONOCARE, commercial reorganization. D3.</w:t>
       </w:r>
     </w:p>
     <w:p>
@@ -33402,10 +33402,10 @@
         <w:rPr>
           <w:b/>
         </w:rPr>
-        <w:t>G11</w:t>
-      </w:r>
-      <w:r>
-        <w:t xml:space="preserve"> "a single study could be in that $15,000,000 to $20,000,000 range" once GLP capability is in place. D7.</w:t>
+        <w:t>G3</w:t>
+      </w:r>
+      <w:r>
+        <w:t xml:space="preserve"> 2026 guidance "does not include any meaningful expected revenue from commercial drug delivery". D7.</w:t>
       </w:r>
     </w:p>
     <w:p>
@@ -33416,10 +33416,10 @@
         <w:rPr>
           <w:b/>
         </w:rPr>
-        <w:t>G12</w:t>
-      </w:r>
-      <w:r>
-        <w:t xml:space="preserve"> Burnett: "if we generally can grow in that 15% to 20%, maybe even north of 20% range for the foreseeable future" (D7); 2027 "high teens, I would say if not 20% growth" with CAL as an accelerator (D6).</w:t>
+        <w:t>G4</w:t>
+      </w:r>
+      <w:r>
+        <w:t xml:space="preserve"> "$15,000 to $25,000 per procedure" for a typical uniQure procedure. D6.</w:t>
       </w:r>
     </w:p>
     <w:p>
@@ -33430,10 +33430,10 @@
         <w:rPr>
           <w:b/>
         </w:rPr>
-        <w:t>G1</w:t>
-      </w:r>
-      <w:r>
-        <w:t xml:space="preserve"> FY2025 revenue guidance $36.0–41.0M. D5.</w:t>
+        <w:t>G5</w:t>
+      </w:r>
+      <w:r>
+        <w:t xml:space="preserve"> "$12,000 to $15,000 range per patient" across pharma partners. D6.</w:t>
       </w:r>
     </w:p>
     <w:p>
@@ -33444,10 +33444,10 @@
         <w:rPr>
           <w:b/>
         </w:rPr>
-        <w:t>G2</w:t>
-      </w:r>
-      <w:r>
-        <w:t xml:space="preserve"> "adjusting our 2026 revenue guidance to between $48.0 - $52.0 million" (original $52.0–56.0M). Also: 10–15 trials enrolling, about 10 readouts in 18 months, CAL, SONOCARE, commercial reorganization. D3.</w:t>
+        <w:t>G6</w:t>
+      </w:r>
+      <w:r>
+        <w:t xml:space="preserve"> "operational cash burn to decrease in the second half". D3.</w:t>
       </w:r>
     </w:p>
     <w:p>
@@ -33458,10 +33458,10 @@
         <w:rPr>
           <w:b/>
         </w:rPr>
-        <w:t>G3</w:t>
-      </w:r>
-      <w:r>
-        <w:t xml:space="preserve"> 2026 guidance "does not include any meaningful expected revenue from commercial drug delivery". D7.</w:t>
+        <w:t>G7</w:t>
+      </w:r>
+      <w:r>
+        <w:t xml:space="preserve"> 15 centres "could be ready to do 1, if not 2 of these procedures a week"; 20–30 centres would mean "50 to 100 cases a week". D6.</w:t>
       </w:r>
     </w:p>
     <w:p>
@@ -33472,10 +33472,19 @@
         <w:rPr>
           <w:b/>
         </w:rPr>
-        <w:t>G4</w:t>
-      </w:r>
-      <w:r>
-        <w:t xml:space="preserve"> "$15,000 to $25,000 per procedure" for a typical uniQure procedure. D6.</w:t>
+        <w:t>G8</w:t>
+      </w:r>
+      <w:r>
+        <w:t xml:space="preserve"> "~6,000 patients</w:t>
+      </w:r>
+      <w:r>
+        <w:rPr>
+          <w:i/>
+        </w:rPr>
+        <w:t xml:space="preserve"> Initial Treatable Patients at Launch" (</w:t>
+      </w:r>
+      <w:r>
+        <w:t>management estimate); "~20,000 patients Diagnosed HD". D17, p.25.</w:t>
       </w:r>
     </w:p>
     <w:p>
@@ -33486,10 +33495,10 @@
         <w:rPr>
           <w:b/>
         </w:rPr>
-        <w:t>G5</w:t>
-      </w:r>
-      <w:r>
-        <w:t xml:space="preserve"> "$12,000 to $15,000 range per patient" across pharma partners. D6.</w:t>
+        <w:t>G9</w:t>
+      </w:r>
+      <w:r>
+        <w:t xml:space="preserve"> Burnett: prior preclinical capacity "$8 million a year or something like that"; the CAL "could surpass $60 million or so at this facility"; "our revenue miss in the quarter … was largely attributed to a delayed ramp of these preclinical CAL services"; "accelerated adoption of GLP studies at the CAL could go faster than" high-teens 2027 growth; added people are "built into that cost structure". D6.</w:t>
       </w:r>
     </w:p>
     <w:p>
@@ -33500,10 +33509,10 @@
         <w:rPr>
           <w:b/>
         </w:rPr>
-        <w:t>G6</w:t>
-      </w:r>
-      <w:r>
-        <w:t xml:space="preserve"> "operational cash burn to decrease in the second half". D3.</w:t>
+        <w:t>G10</w:t>
+      </w:r>
+      <w:r>
+        <w:t xml:space="preserve"> First GLP statement of work "in the multi-million dollar range", expected to be fully recognised by end of H1 2027; 2026 guidance "does not include the execution of any of these large studies"; larger studies expected to start "in the second half of next year". D6; D3.</w:t>
       </w:r>
     </w:p>
     <w:p>
@@ -33514,10 +33523,10 @@
         <w:rPr>
           <w:b/>
         </w:rPr>
-        <w:t>G7</w:t>
-      </w:r>
-      <w:r>
-        <w:t xml:space="preserve"> 15 centres "could be ready to do 1, if not 2 of these procedures a week"; 20–30 centres would mean "50 to 100 cases a week". D6.</w:t>
+        <w:t>G11</w:t>
+      </w:r>
+      <w:r>
+        <w:t xml:space="preserve"> "a single study could be in that $15,000,000 to $20,000,000 range" once GLP capability is in place. D7.</w:t>
       </w:r>
     </w:p>
     <w:p>
@@ -33528,19 +33537,10 @@
         <w:rPr>
           <w:b/>
         </w:rPr>
-        <w:t>G8</w:t>
-      </w:r>
-      <w:r>
-        <w:t xml:space="preserve"> "~6,000 patients</w:t>
-      </w:r>
-      <w:r>
-        <w:rPr>
-          <w:i/>
-        </w:rPr>
-        <w:t xml:space="preserve"> Initial Treatable Patients at Launch" (</w:t>
-      </w:r>
-      <w:r>
-        <w:t>management estimate); "~20,000 patients Diagnosed HD". D17, p.25.</w:t>
+        <w:t>G12</w:t>
+      </w:r>
+      <w:r>
+        <w:t xml:space="preserve"> Burnett: "if we generally can grow in that 15% to 20%, maybe even north of 20% range for the foreseeable future" (D7); 2027 "high teens, I would say if not 20% growth" with CAL as an accelerator (D6).</w:t>
       </w:r>
     </w:p>
     <w:p>
@@ -33889,10 +33889,10 @@
         <w:rPr>
           <w:b/>
         </w:rPr>
-        <w:t>S30</w:t>
-      </w:r>
-      <w:r>
-        <w:t xml:space="preserve"> AMT-130 steady state 3,000 a year from FY2030E (David, Oct 23, 2026), as a share of HD incidence (bull 3,500).</w:t>
+        <w:t>S29</w:t>
+      </w:r>
+      <w:r>
+        <w:t xml:space="preserve"> Finagle filled inputs: 15-year horizon (FY2040E; Finagle fades gsnext linearly to its default gt at year 15); cost of debt 9.2% (C63); tax 21%; non-operating assets 0; working-capital change 0; distributions "none" (each year's FCFE treated as paid out), no buybacks; debt in target mode at 2.0× EBITDA after the P3 draw. Terminal growth left at the Finagle default.</w:t>
       </w:r>
     </w:p>
     <w:p>
@@ -33903,10 +33903,10 @@
         <w:rPr>
           <w:b/>
         </w:rPr>
-        <w:t>S31</w:t>
-      </w:r>
-      <w:r>
-        <w:t xml:space="preserve"> PD class volume: base and bull, three-year ramp from the FY2029E launch (S64): 1/3, 2/3, then 100% of class demand (C40, C46), class demand from FY2031E; bear, capacity ramp toward 4,500 (S22, S43).</w:t>
+        <w:t>S30</w:t>
+      </w:r>
+      <w:r>
+        <w:t xml:space="preserve"> AMT-130 steady state 3,000 a year from FY2030E (David, Oct 23, 2026), as a share of HD incidence (bull 3,500).</w:t>
       </w:r>
     </w:p>
     <w:p>
@@ -33917,10 +33917,10 @@
         <w:rPr>
           <w:b/>
         </w:rPr>
-        <w:t>S32</w:t>
-      </w:r>
-      <w:r>
-        <w:t xml:space="preserve"> Explicit window to FY2031E (David, Oct 26, 2026; earlier FY2032E, Oct 23, 2026). Core growth as S26; core opex growth as S16. PD class volume: base and bull see S31 and S64; bear see S22.</w:t>
+        <w:t>S31</w:t>
+      </w:r>
+      <w:r>
+        <w:t xml:space="preserve"> PD class volume: base and bull, three-year ramp from the FY2029E launch (S64): 1/3, 2/3, then 100% of class demand (C40, C46), class demand from FY2031E; bear, capacity ramp toward 4,500 (S22, S43).</w:t>
       </w:r>
     </w:p>
     <w:p>
@@ -33931,10 +33931,10 @@
         <w:rPr>
           <w:b/>
         </w:rPr>
-        <w:t>S37</w:t>
-      </w:r>
-      <w:r>
-        <w:t xml:space="preserve"> CAL uplift above core growth (US$M, FY2027E–31E): base 0 / 7 / 14 / 22 / 29 (toward 60% of capacity); bull 3 / 10 / 18 / 27 / 36; bear 0 / 2 / 4 / 6 / 8 (G9–G11). Judgment.</w:t>
+        <w:t>S32</w:t>
+      </w:r>
+      <w:r>
+        <w:t xml:space="preserve"> Explicit window to FY2031E (David, Oct 26, 2026; earlier FY2032E, Oct 23, 2026). Core growth as S26; core opex growth as S16. PD class volume: base and bull see S31 and S64; bear see S22.</w:t>
       </w:r>
     </w:p>
     <w:p>
@@ -33945,10 +33945,10 @@
         <w:rPr>
           <w:b/>
         </w:rPr>
-        <w:t>S43</w:t>
-      </w:r>
-      <w:r>
-        <w:t xml:space="preserve"> PD platform capacity: base and bull not capped; volume follows class demand (S64), implying about 74 (base) and 95 (bull) centres at 3 cases/wk × 50 wks for Parkinson's alone by FY2031E, against Burnett's 20–30 centres × 50–100 cases/wk (G7). Bear capacity ramp toward 4,500 (2,500 in FY2031E). AMT-130 per-therapy cap 4,500 (S20). Aggressive judgment.</w:t>
+        <w:t>S37</w:t>
+      </w:r>
+      <w:r>
+        <w:t xml:space="preserve"> CAL uplift above core growth (US$M, FY2027E–31E): base 0 / 7 / 14 / 22 / 29 (toward 60% of capacity); bull 3 / 10 / 18 / 27 / 36; bear 0 / 2 / 4 / 6 / 8 (G9–G11). Judgment.</w:t>
       </w:r>
     </w:p>
     <w:p>
@@ -33959,10 +33959,10 @@
         <w:rPr>
           <w:b/>
         </w:rPr>
-        <w:t>S44</w:t>
-      </w:r>
-      <w:r>
-        <w:t xml:space="preserve"> DBS and one-time therapy are not mutually exclusive: patients who have had DBS stay in the eligible pool, and DBS (3,990 a year, A10) continues alongside and is not deducted from one-time class demand. Trial exclusion of prior DBS is treated as a trial-entry rule (A41–A43). David, Oct 25, 2026: "6% applies to one-time therapy and DBS patients are eligible so I think the pool size should be 180k?" Judgment.</w:t>
+        <w:t>S38</w:t>
+      </w:r>
+      <w:r>
+        <w:t xml:space="preserve"> CAL incremental opex 20% of CAL revenue (lease and staff already in core opex, G9); CAL gross margin = core 62.9% (S13). Judgment.</w:t>
       </w:r>
     </w:p>
     <w:p>
@@ -33973,10 +33973,10 @@
         <w:rPr>
           <w:b/>
         </w:rPr>
-        <w:t>S45</w:t>
-      </w:r>
-      <w:r>
-        <w:t xml:space="preserve"> From launch in FY2029E, 6% of the opening eligible pool receives a one-time therapy each year (none before). Judgment anchored on the measured DBS rate: about 2.7 times the 2.2% of the 180,000 pool that receives DBS each year (C49), on the view that many more eligible patients would choose a one-time, potentially disease-modifying therapy than symptomatic DBS hardware surgery. No published willingness study supports the multiple. David, Oct 25, 2026: "So we can make it 6% and underpin it on the basis of that 3% (2.9%) receive DBS and we think many more would favour a gene therapy with a disease modifying effect." The 2.9% is 3,990 measured against a pool with prior-DBS patients excluded (137,813; C49); against the 180,000 pool used here the DBS rate is 2.2%. Lifetime uptake 0.06 / (0.095 + 0.06) = 39%, somewhat above a referral × willingness × coverage funnel of about 30% (A14, A40).</w:t>
+        <w:t>S43</w:t>
+      </w:r>
+      <w:r>
+        <w:t xml:space="preserve"> PD platform capacity: base and bull not capped; volume follows class demand (S64), implying about 74 (base) and 95 (bull) centres at 3 cases/wk × 50 wks for Parkinson's alone by FY2031E, against Burnett's 20–30 centres × 50–100 cases/wk (G7). Bear capacity ramp toward 4,500 (2,500 in FY2031E). AMT-130 per-therapy cap 4,500 (S20). Aggressive judgment.</w:t>
       </w:r>
     </w:p>
     <w:p>
@@ -33987,10 +33987,10 @@
         <w:rPr>
           <w:b/>
         </w:rPr>
-        <w:t>S46</w:t>
-      </w:r>
-      <w:r>
-        <w:t xml:space="preserve"> Half of patients with PD for at least four years and no dementia have motor complications. Judgment anchored to A33 and A34.</w:t>
+        <w:t>S44</w:t>
+      </w:r>
+      <w:r>
+        <w:t xml:space="preserve"> DBS and one-time therapy are not mutually exclusive: patients who have had DBS stay in the eligible pool, and DBS (3,990 a year, A10) continues alongside and is not deducted from one-time class demand. Trial exclusion of prior DBS is treated as a trial-entry rule (A41–A43). David, Oct 25, 2026: "6% applies to one-time therapy and DBS patients are eligible so I think the pool size should be 180k?" Judgment.</w:t>
       </w:r>
     </w:p>
     <w:p>
@@ -34001,10 +34001,10 @@
         <w:rPr>
           <w:b/>
         </w:rPr>
-        <w:t>S47</w:t>
-      </w:r>
-      <w:r>
-        <w:t xml:space="preserve"> 90% of otherwise eligible patients are fit for neurosurgery. Judgment; no population figure found.</w:t>
+        <w:t>S45</w:t>
+      </w:r>
+      <w:r>
+        <w:t xml:space="preserve"> From launch in FY2029E, 6% of the opening eligible pool receives a one-time therapy each year (none before). Judgment anchored on the measured DBS rate: about 2.7 times the 2.2% of the 180,000 pool that receives DBS each year (C49), on the view that many more eligible patients would choose a one-time, potentially disease-modifying therapy than symptomatic DBS hardware surgery. No published willingness study supports the multiple. David, Oct 25, 2026: "So we can make it 6% and underpin it on the basis of that 3% (2.9%) receive DBS and we think many more would favour a gene therapy with a disease modifying effect." The 2.9% is 3,990 measured against a pool with prior-DBS patients excluded (137,813; C49); against the 180,000 pool used here the DBS rate is 2.2%. Lifetime uptake 0.06 / (0.095 + 0.06) = 39%, somewhat above a referral × willingness × coverage funnel of about 30% (A14, A40).</w:t>
       </w:r>
     </w:p>
     <w:p>
@@ -34015,10 +34015,10 @@
         <w:rPr>
           <w:b/>
         </w:rPr>
-        <w:t>S59</w:t>
-      </w:r>
-      <w:r>
-        <w:t xml:space="preserve"> Bull: 8% of the opening eligible pool treated each year from FY2029E (base 6%, S45), on the base three-year ramp; the smallest round change that keeps bull volume above the base in every year. David, Oct 25, 2026, on an earlier bull: "Bull case should show growing to 10k." This bull exceeds 10,000 from FY2030E, to be confirmed by David. Judgment.</w:t>
+        <w:t>S46</w:t>
+      </w:r>
+      <w:r>
+        <w:t xml:space="preserve"> Half of patients with PD for at least four years and no dementia have motor complications. Judgment anchored to A33 and A34.</w:t>
       </w:r>
     </w:p>
     <w:p>
@@ -34029,10 +34029,10 @@
         <w:rPr>
           <w:b/>
         </w:rPr>
-        <w:t>S62</w:t>
-      </w:r>
-      <w:r>
-        <w:t xml:space="preserve"> Class lumping: the PD procedure line is all one-time Parkinson's cell/gene therapy procedures (the class), not one product; volume follows class demand (C40, C46) through the three-year ramp (S64). David, Oct 25, 2026: "And class lumping for the valuation too." Judgment.</w:t>
+        <w:t>S47</w:t>
+      </w:r>
+      <w:r>
+        <w:t xml:space="preserve"> 90% of otherwise eligible patients are fit for neurosurgery. Judgment; no population figure found.</w:t>
       </w:r>
     </w:p>
     <w:p>
@@ -34043,10 +34043,10 @@
         <w:rPr>
           <w:b/>
         </w:rPr>
-        <w:t>S63</w:t>
-      </w:r>
-      <w:r>
-        <w:t xml:space="preserve"> ClearPoint delivers 100% of one-time Parkinson's cell/gene therapy procedures. David's judgment, Oct 25, 2026: "nobody will risk a multi-billion dollar therapy to save a few thousand on a cannula that wasn't used in the trial". The device used in the pivotal trial becomes part of the approved procedure, so the share stays near 100% for each therapy approved with ClearPoint. Consistent evidence: D12, D68. Devices for other programs not confirmed (D10). Competitor findings: D63–D67, D69, D70. Sizing: about $2.69 a share per 1,000 procedures a year from FY2030E (C43).</w:t>
+        <w:t>S48</w:t>
+      </w:r>
+      <w:r>
+        <w:t xml:space="preserve"> Superseded (value add-on for earlier runs; not used).</w:t>
       </w:r>
     </w:p>
     <w:p>
@@ -34057,10 +34057,10 @@
         <w:rPr>
           <w:b/>
         </w:rPr>
-        <w:t>S64</w:t>
-      </w:r>
-      <w:r>
-        <w:t xml:space="preserve"> Three-year ramp to class demand: one-time PD class volume = 1/3 of class demand in FY2029E, 2/3 in FY2030E and 100% from FY2031E (base and bull). David, Oct 25, 2026: "ramp the patient over 3 years up to the demand" and "since that also gives time for other therapies to get approved." The other quantified PD therapies are expected after FY2031E (2033–34, Appendix D), after the ramp ends, so the rationale is a judgment, not a timeline match. Judgment.</w:t>
+        <w:t>S52</w:t>
+      </w:r>
+      <w:r>
+        <w:t xml:space="preserve"> Non-BlueRock PD demand split AB-1005 52% / ANPD001 24% / RNDP-001 24% (Appendix D). Judgment.</w:t>
       </w:r>
     </w:p>
     <w:p>
@@ -34071,10 +34071,10 @@
         <w:rPr>
           <w:b/>
         </w:rPr>
-        <w:t>S48</w:t>
-      </w:r>
-      <w:r>
-        <w:t xml:space="preserve"> Superseded (value add-on for earlier runs; not used).</w:t>
+        <w:t>S53–S57</w:t>
+      </w:r>
+      <w:r>
+        <w:t xml:space="preserve"> Funnel rates for NRTX-1001, AVB-101, KEBILIDI, RGX-121 and SRN-101 in Figure D2. Judgment.</w:t>
       </w:r>
     </w:p>
     <w:p>
@@ -34085,10 +34085,10 @@
         <w:rPr>
           <w:b/>
         </w:rPr>
-        <w:t>S52</w:t>
-      </w:r>
-      <w:r>
-        <w:t xml:space="preserve"> Non-BlueRock PD demand split AB-1005 52% / ANPD001 24% / RNDP-001 24% (Appendix D). Judgment.</w:t>
+        <w:t>S58</w:t>
+      </w:r>
+      <w:r>
+        <w:t xml:space="preserve"> Approval years and ramps for partner programs in Figures D1 and D3: large indications ≈300 → ~1,200 → ~2,200 → steady; one-year ramp for ultra-rare. Judgment.</w:t>
       </w:r>
     </w:p>
     <w:p>
@@ -34099,10 +34099,10 @@
         <w:rPr>
           <w:b/>
         </w:rPr>
-        <w:t>S53–S57</w:t>
-      </w:r>
-      <w:r>
-        <w:t xml:space="preserve"> Funnel rates for NRTX-1001, AVB-101, KEBILIDI, RGX-121 and SRN-101 in Figure D2. Judgment.</w:t>
+        <w:t>S59</w:t>
+      </w:r>
+      <w:r>
+        <w:t xml:space="preserve"> Bull: 8% of the opening eligible pool treated each year from FY2029E (base 6%, S45), on the base three-year ramp; the smallest round change that keeps bull volume above the base in every year. David, Oct 25, 2026, on an earlier bull: "Bull case should show growing to 10k." This bull exceeds 10,000 from FY2030E, to be confirmed by David. Judgment.</w:t>
       </w:r>
     </w:p>
     <w:p>
@@ -34113,10 +34113,10 @@
         <w:rPr>
           <w:b/>
         </w:rPr>
-        <w:t>S58</w:t>
-      </w:r>
-      <w:r>
-        <w:t xml:space="preserve"> Approval years and ramps for partner programs in Figures D1 and D3: large indications ≈300 → ~1,200 → ~2,200 → steady; one-year ramp for ultra-rare. Judgment.</w:t>
+        <w:t>S62</w:t>
+      </w:r>
+      <w:r>
+        <w:t xml:space="preserve"> Class lumping: the PD procedure line is all one-time Parkinson's cell/gene therapy procedures (the class), not one product; volume follows class demand (C40, C46) through the three-year ramp (S64). David, Oct 25, 2026: "And class lumping for the valuation too." Judgment.</w:t>
       </w:r>
     </w:p>
     <w:p>
@@ -34127,10 +34127,10 @@
         <w:rPr>
           <w:b/>
         </w:rPr>
-        <w:t>S38</w:t>
-      </w:r>
-      <w:r>
-        <w:t xml:space="preserve"> CAL incremental opex 20% of CAL revenue (lease and staff already in core opex, G9); CAL gross margin = core 62.9% (S13). Judgment.</w:t>
+        <w:t>S63</w:t>
+      </w:r>
+      <w:r>
+        <w:t xml:space="preserve"> ClearPoint delivers 100% of one-time Parkinson's cell/gene therapy procedures. David's judgment, Oct 25, 2026: "nobody will risk a multi-billion dollar therapy to save a few thousand on a cannula that wasn't used in the trial". The device used in the pivotal trial becomes part of the approved procedure, so the share stays near 100% for each therapy approved with ClearPoint. Consistent evidence: D12, D68. Devices for other programs not confirmed (D10). Competitor findings: D63–D67, D69, D70. Sizing: about $2.69 a share per 1,000 procedures a year from FY2030E (C43).</w:t>
       </w:r>
     </w:p>
     <w:p>
@@ -34141,10 +34141,10 @@
         <w:rPr>
           <w:b/>
         </w:rPr>
-        <w:t>S29</w:t>
-      </w:r>
-      <w:r>
-        <w:t xml:space="preserve"> Finagle filled inputs: 15-year horizon (FY2040E; Finagle fades gsnext linearly to its default gt at year 15); cost of debt 9.2% (C63); tax 21%; non-operating assets 0; working-capital change 0; distributions "none" (each year's FCFE treated as paid out), no buybacks; debt in target mode at 2.0× EBITDA after the P3 draw. Terminal growth left at the Finagle default.</w:t>
+        <w:t>S64</w:t>
+      </w:r>
+      <w:r>
+        <w:t xml:space="preserve"> Three-year ramp to class demand: one-time PD class volume = 1/3 of class demand in FY2029E, 2/3 in FY2030E and 100% from FY2031E (base and bull). David, Oct 25, 2026: "ramp the patient over 3 years up to the demand" and "since that also gives time for other therapies to get approved." The other quantified PD therapies are expected after FY2031E (2033–34, Appendix D), after the ramp ends, so the rationale is a judgment, not a timeline match. Judgment.</w:t>
       </w:r>
     </w:p>
     <w:p>
@@ -34513,10 +34513,10 @@
         <w:rPr>
           <w:b/>
         </w:rPr>
-        <w:t>C33</w:t>
-      </w:r>
-      <w:r>
-        <w:t xml:space="preserve"> Steady state / 90,000 (A9): 4,500 = 5.0%; 10,837 = 12.0%; 13,530 = 15.0%.</w:t>
+        <w:t>C30</w:t>
+      </w:r>
+      <w:r>
+        <w:t xml:space="preserve"> Finagle template table: Finagle's annual output for each case, laid out row for row as in Finagle's standard company template.</w:t>
       </w:r>
     </w:p>
     <w:p>
@@ -34527,10 +34527,10 @@
         <w:rPr>
           <w:b/>
         </w:rPr>
-        <w:t>C34</w:t>
-      </w:r>
-      <w:r>
-        <w:t xml:space="preserve"> Superseded; see C65.</w:t>
+        <w:t>C33</w:t>
+      </w:r>
+      <w:r>
+        <w:t xml:space="preserve"> Steady state / 90,000 (A9): 4,500 = 5.0%; 10,837 = 12.0%; 13,530 = 15.0%.</w:t>
       </w:r>
     </w:p>
     <w:p>
@@ -34541,10 +34541,10 @@
         <w:rPr>
           <w:b/>
         </w:rPr>
-        <w:t>C35</w:t>
-      </w:r>
-      <w:r>
-        <w:t xml:space="preserve"> CAL FY2031E EBITDA = 29.0 × (62.9% − 20%) = 12.4 (S13, S37, S38).</w:t>
+        <w:t>C34</w:t>
+      </w:r>
+      <w:r>
+        <w:t xml:space="preserve"> Superseded; see C65.</w:t>
       </w:r>
     </w:p>
     <w:p>
@@ -34555,10 +34555,10 @@
         <w:rPr>
           <w:b/>
         </w:rPr>
-        <w:t>C40</w:t>
-      </w:r>
-      <w:r>
-        <w:t xml:space="preserve"> One-time PD class demand = one-time treated in the eligible-pool model (6% of the opening pool from FY2029E, S45; DBS not deducted, S44): 11,756 / 11,391 / 11,126 / 10,945 (FY2029E–32E); 10,837 (FY2033E); 10,792 (FY2034E); 10,801 (FY2035E); 11,454 (FY2040E); 12,780 (FY2045E). Growth FY2033E–40E 0.8% a year. Appendix C. FY2032E onward is demand context; the valuation does not use it (P3).</w:t>
+        <w:t>C35</w:t>
+      </w:r>
+      <w:r>
+        <w:t xml:space="preserve"> CAL FY2031E EBITDA = 29.0 × (62.9% − 20%) = 12.4 (S13, S37, S38).</w:t>
       </w:r>
     </w:p>
     <w:p>
@@ -34569,10 +34569,10 @@
         <w:rPr>
           <w:b/>
         </w:rPr>
-        <w:t>C46</w:t>
-      </w:r>
-      <w:r>
-        <w:t xml:space="preserve"> Bull class demand = pool model (C45 inputs) re-run with 8% treated from FY2029E (S59): 15,674 / 14,875 / 14,272 / 13,833 (FY2029E–32E); 13,530 (FY2033E); 13,250 (FY2035E); 13,792 (FY2040E). Steady-state treated share of entrants 0.08 / (0.095 + 0.08 + 0.029) = 39%.</w:t>
+        <w:t>C40</w:t>
+      </w:r>
+      <w:r>
+        <w:t xml:space="preserve"> One-time PD class demand = one-time treated in the eligible-pool model (6% of the opening pool from FY2029E, S45; DBS not deducted, S44): 11,756 / 11,391 / 11,126 / 10,945 (FY2029E–32E); 10,837 (FY2033E); 10,792 (FY2034E); 10,801 (FY2035E); 11,454 (FY2040E); 12,780 (FY2045E). Growth FY2033E–40E 0.8% a year. Appendix C. FY2032E onward is demand context; the valuation does not use it (P3).</w:t>
       </w:r>
     </w:p>
     <w:p>
@@ -34583,10 +34583,10 @@
         <w:rPr>
           <w:b/>
         </w:rPr>
-        <w:t>C48</w:t>
-      </w:r>
-      <w:r>
-        <w:t xml:space="preserve"> Superseded (Oct 25, 2026 value decomposition on earlier inputs; not used).</w:t>
+        <w:t>C41</w:t>
+      </w:r>
+      <w:r>
+        <w:t xml:space="preserve"> FY2026E US PD prevalence = log-linear interpolation of 930,000 (2020) and 1,238,000 (2030) (A30): growth 2.9% a year, 1.104M in FY2026E.</w:t>
       </w:r>
     </w:p>
     <w:p>
@@ -34597,10 +34597,10 @@
         <w:rPr>
           <w:b/>
         </w:rPr>
-        <w:t>C49</w:t>
-      </w:r>
-      <w:r>
-        <w:t xml:space="preserve"> DBS rate = 3,990 DBS a year (A10) ÷ eligible pool: 179,813 at start FY2026E = 2.2%; 190,401 at start FY2028E = 2.1%. 6% ÷ 2.2% = 2.7. Against a pool excluding prior-DBS patients (137,813) the same 3,990 is 2.9%. Pool model.</w:t>
+        <w:t>C42</w:t>
+      </w:r>
+      <w:r>
+        <w:t xml:space="preserve"> Eligible pool FY2026E = 1.104M (C41) × (0.729 − 0.28) (A31, A32, C44) × 0.50 (S46) × 0.806 (A35) × 0.90 (S47) = 179,813, 16.3% of PD; patients who have had DBS included (S44).</w:t>
       </w:r>
     </w:p>
     <w:p>
@@ -34611,10 +34611,10 @@
         <w:rPr>
           <w:b/>
         </w:rPr>
-        <w:t>C41</w:t>
-      </w:r>
-      <w:r>
-        <w:t xml:space="preserve"> FY2026E US PD prevalence = log-linear interpolation of 930,000 (2020) and 1,238,000 (2030) (A30): growth 2.9% a year, 1.104M in FY2026E.</w:t>
+        <w:t>C43</w:t>
+      </w:r>
+      <w:r>
+        <w:t xml:space="preserve"> Superseded (Oct 25, 2026 add-on runs on earlier inputs; not used).</w:t>
       </w:r>
     </w:p>
     <w:p>
@@ -34625,10 +34625,10 @@
         <w:rPr>
           <w:b/>
         </w:rPr>
-        <w:t>C42</w:t>
-      </w:r>
-      <w:r>
-        <w:t xml:space="preserve"> Eligible pool FY2026E = 1.104M (C41) × (0.729 − 0.28) (A31, A32, C44) × 0.50 (S46) × 0.806 (A35) × 0.90 (S47) = 179,813, 16.3% of PD; patients who have had DBS included (S44).</w:t>
+        <w:t>C44</w:t>
+      </w:r>
+      <w:r>
+        <w:t xml:space="preserve"> Share of prevalent patients diagnosed four or more years = exp(−4 × (0.05 + 0.029)) = 0.73, survival loss 5% a year (A31) weighted for 2.9% prevalence growth (C41); cross-check 1.1M prevalent / 90,000 new a year ≈ 12 years lived with diagnosis (A9). Dementia (0.28, midpoint of A32) is subtracted from this group, not multiplied.</w:t>
       </w:r>
     </w:p>
     <w:p>
@@ -34639,10 +34639,10 @@
         <w:rPr>
           <w:b/>
         </w:rPr>
-        <w:t>C43</w:t>
-      </w:r>
-      <w:r>
-        <w:t xml:space="preserve"> Superseded (Oct 25, 2026 add-on runs on earlier inputs; not used).</w:t>
+        <w:t>C45</w:t>
+      </w:r>
+      <w:r>
+        <w:t xml:space="preserve"> Leave rate m = 5% death (A31) + 4.45% new dementia (A39) = 0.095 a year; entrants FY2026E = (m + g) × pool = 0.124 × 179,813 = 22,300, growing 2.9% a year; no one-time therapy before launch, so the pool grows at g to FY2028E; pool end = start + entrants − leavers − treated.</w:t>
       </w:r>
     </w:p>
     <w:p>
@@ -34653,10 +34653,10 @@
         <w:rPr>
           <w:b/>
         </w:rPr>
-        <w:t>C44</w:t>
-      </w:r>
-      <w:r>
-        <w:t xml:space="preserve"> Share of prevalent patients diagnosed four or more years = exp(−4 × (0.05 + 0.029)) = 0.73, survival loss 5% a year (A31) weighted for 2.9% prevalence growth (C41); cross-check 1.1M prevalent / 90,000 new a year ≈ 12 years lived with diagnosis (A9). Dementia (0.28, midpoint of A32) is subtracted from this group, not multiplied.</w:t>
+        <w:t>C46</w:t>
+      </w:r>
+      <w:r>
+        <w:t xml:space="preserve"> Bull class demand = pool model (C45 inputs) re-run with 8% treated from FY2029E (S59): 15,674 / 14,875 / 14,272 / 13,833 (FY2029E–32E); 13,530 (FY2033E); 13,250 (FY2035E); 13,792 (FY2040E). Steady-state treated share of entrants 0.08 / (0.095 + 0.08 + 0.029) = 39%.</w:t>
       </w:r>
     </w:p>
     <w:p>
@@ -34667,10 +34667,10 @@
         <w:rPr>
           <w:b/>
         </w:rPr>
-        <w:t>C45</w:t>
-      </w:r>
-      <w:r>
-        <w:t xml:space="preserve"> Leave rate m = 5% death (A31) + 4.45% new dementia (A39) = 0.095 a year; entrants FY2026E = (m + g) × pool = 0.124 × 179,813 = 22,300, growing 2.9% a year; no one-time therapy before launch, so the pool grows at g to FY2028E; pool end = start + entrants − leavers − treated.</w:t>
+        <w:t>C48</w:t>
+      </w:r>
+      <w:r>
+        <w:t xml:space="preserve"> Superseded (Oct 25, 2026 value decomposition on earlier inputs; not used).</w:t>
       </w:r>
     </w:p>
     <w:p>
@@ -34681,28 +34681,10 @@
         <w:rPr>
           <w:b/>
         </w:rPr>
-        <w:t>C50</w:t>
-      </w:r>
-      <w:r>
-        <w:t xml:space="preserve"> Partner steady states = Figure D2 funnel results, rounded (PD to 100s; AVB-101 to 5s). </w:t>
-      </w:r>
-      <w:r>
-        <w:rPr>
-          <w:b/>
-        </w:rPr>
-        <w:t>C52</w:t>
-      </w:r>
-      <w:r>
-        <w:t xml:space="preserve"> NRTX-1001 = 10,500 × 0.85 × 0.5 × 0.5 × 0.8 × 0.7 = 1,249 + 167,000 (A21 mid) × 11.9% ÷ 10 = 1,987 → 3,200. </w:t>
-      </w:r>
-      <w:r>
-        <w:rPr>
-          <w:b/>
-        </w:rPr>
-        <w:t>C53</w:t>
-      </w:r>
-      <w:r>
-        <w:t xml:space="preserve"> FTD-GRN incidence = ~83M US aged 45–64 (unsourced) × 3.4/100k ≈ 2,800 × 5% = 140.</w:t>
+        <w:t>C49</w:t>
+      </w:r>
+      <w:r>
+        <w:t xml:space="preserve"> DBS rate = 3,990 DBS a year (A10) ÷ eligible pool: 179,813 at start FY2026E = 2.2%; 190,401 at start FY2028E = 2.1%. 6% ÷ 2.2% = 2.7. Against a pool excluding prior-DBS patients (137,813) the same 3,990 is 2.9%. Pool model.</w:t>
       </w:r>
     </w:p>
     <w:p>
@@ -34713,10 +34695,28 @@
         <w:rPr>
           <w:b/>
         </w:rPr>
-        <w:t>C54</w:t>
-      </w:r>
-      <w:r>
-        <w:t xml:space="preserve"> Illustrative non-BlueRock PD rows = min(launch ramp, S52 share of class demand C40 less BRT-DA01) each year; all zero to FY2031E because their launches are after FY2031E. Not used in the valuation, which uses the class (S62).</w:t>
+        <w:t>C50</w:t>
+      </w:r>
+      <w:r>
+        <w:t xml:space="preserve"> Partner steady states = Figure D2 funnel results, rounded (PD to 100s; AVB-101 to 5s). </w:t>
+      </w:r>
+      <w:r>
+        <w:rPr>
+          <w:b/>
+        </w:rPr>
+        <w:t>C52</w:t>
+      </w:r>
+      <w:r>
+        <w:t xml:space="preserve"> NRTX-1001 = 10,500 × 0.85 × 0.5 × 0.5 × 0.8 × 0.7 = 1,249 + 167,000 (A21 mid) × 11.9% ÷ 10 = 1,987 → 3,200. </w:t>
+      </w:r>
+      <w:r>
+        <w:rPr>
+          <w:b/>
+        </w:rPr>
+        <w:t>C53</w:t>
+      </w:r>
+      <w:r>
+        <w:t xml:space="preserve"> FTD-GRN incidence = ~83M US aged 45–64 (unsourced) × 3.4/100k ≈ 2,800 × 5% = 140.</w:t>
       </w:r>
     </w:p>
     <w:p>
@@ -34727,10 +34727,10 @@
         <w:rPr>
           <w:b/>
         </w:rPr>
-        <w:t>C55</w:t>
-      </w:r>
-      <w:r>
-        <w:t xml:space="preserve"> Bear class demand = pool model with patients who have had DBS excluded (3,990 ÷ 0.095 ≈ 42,000; pool 137,813, trial-style, A41), 6% treated: 9,010 / 8,731 / 8,527 / 8,389 (FY2029E–32E); 8,306 (FY2033E). Above bear volume through FY2031E (S43); FY2032E–33E are demand context.</w:t>
+        <w:t>C54</w:t>
+      </w:r>
+      <w:r>
+        <w:t xml:space="preserve"> Illustrative non-BlueRock PD rows = min(launch ramp, S52 share of class demand C40 less BRT-DA01) each year; all zero to FY2031E because their launches are after FY2031E. Not used in the valuation, which uses the class (S62).</w:t>
       </w:r>
     </w:p>
     <w:p>
@@ -34741,10 +34741,10 @@
         <w:rPr>
           <w:b/>
         </w:rPr>
-        <w:t>C56</w:t>
-      </w:r>
-      <w:r>
-        <w:t xml:space="preserve"> Finagle base (D77): value per share $65.20 (65.2013, FCFE and DDM equal); equity $1,942.9M; enterprise value $1,992.0M; terminal FCFE $260.1M; terminal value (FY2040E) $4,728.3M; re 10.453% = 4.953% (^TNX, Oct 23, 2026) + 5.5%; gt 4.953%; rd 9.2%; roict 25%; debt peak $939.0M (FY2040E); min cash $18.7M; flags "negative FCFE after year 1".</w:t>
+        <w:t>C55</w:t>
+      </w:r>
+      <w:r>
+        <w:t xml:space="preserve"> Bear class demand = pool model with patients who have had DBS excluded (3,990 ÷ 0.095 ≈ 42,000; pool 137,813, trial-style, A41), 6% treated: 9,010 / 8,731 / 8,527 / 8,389 (FY2029E–32E); 8,306 (FY2033E). Above bear volume through FY2031E (S43); FY2032E–33E are demand context.</w:t>
       </w:r>
     </w:p>
     <w:p>
@@ -34755,10 +34755,10 @@
         <w:rPr>
           <w:b/>
         </w:rPr>
-        <w:t>C57</w:t>
-      </w:r>
-      <w:r>
-        <w:t xml:space="preserve"> Finagle bull (D77): $88.36 (88.355); equity $2,649.2M; enterprise value $2,698.3M; terminal FCFE $348.9M; debt peak $1,253.9M (FY2040E); flags "negative FCFE after year 1".</w:t>
+        <w:t>C56</w:t>
+      </w:r>
+      <w:r>
+        <w:t xml:space="preserve"> Finagle base (D77): value per share $65.20 (65.2013, FCFE and DDM equal); equity $1,942.9M; enterprise value $1,992.0M; terminal FCFE $260.1M; terminal value (FY2040E) $4,728.3M; re 10.453% = 4.953% (^TNX, Oct 23, 2026) + 5.5%; gt 4.953%; rd 9.2%; roict 25%; debt peak $939.0M (FY2040E); min cash $18.7M; flags "negative FCFE after year 1".</w:t>
       </w:r>
     </w:p>
     <w:p>
@@ -34769,10 +34769,10 @@
         <w:rPr>
           <w:b/>
         </w:rPr>
-        <w:t>C58</w:t>
-      </w:r>
-      <w:r>
-        <w:t xml:space="preserve"> Finagle bear (D77): $14.56 (14.5577); equity $398.1M; enterprise value $447.2M; terminal FCFE $77.7M; debt peak $287.6M (FY2040E); min cash −$98.0M (FY2030E–32E); flags "negative cash", "negative FCFE after year 1".</w:t>
+        <w:t>C57</w:t>
+      </w:r>
+      <w:r>
+        <w:t xml:space="preserve"> Finagle bull (D77): $88.36 (88.355); equity $2,649.2M; enterprise value $2,698.3M; terminal FCFE $348.9M; debt peak $1,253.9M (FY2040E); flags "negative FCFE after year 1".</w:t>
       </w:r>
     </w:p>
     <w:p>
@@ -34783,10 +34783,10 @@
         <w:rPr>
           <w:b/>
         </w:rPr>
-        <w:t>C59</w:t>
-      </w:r>
-      <w:r>
-        <w:t xml:space="preserve"> 65.20 / 9.25 − 1 = 604.9%; 88.36 / 9.25 − 1 = 855.2%; 14.56 / 9.25 − 1 = 57.4%. Price from Finagle's baseline data (Yahoo previous close, Oct 23, 2026).</w:t>
+        <w:t>C58</w:t>
+      </w:r>
+      <w:r>
+        <w:t xml:space="preserve"> Finagle bear (D77): $14.56 (14.5577); equity $398.1M; enterprise value $447.2M; terminal FCFE $77.7M; debt peak $287.6M (FY2040E); min cash −$98.0M (FY2030E–32E); flags "negative cash", "negative FCFE after year 1".</w:t>
       </w:r>
     </w:p>
     <w:p>
@@ -34797,10 +34797,10 @@
         <w:rPr>
           <w:b/>
         </w:rPr>
-        <w:t>C60</w:t>
-      </w:r>
-      <w:r>
-        <w:t xml:space="preserve"> PV split (D77, sensitivity_v11.py): per-share FCFE each year discounted at re to FY2025A; explicit FY2026E–31E = base $7.74 / bull $12.12 / bear −$3.34; fade FY2032E–40E = $21.06 / $27.92 / $5.97; opening cash $45.9M ÷ 30.503M = $1.51; terminal = value − explicit − fade − cash = $34.89 / $46.81 / $10.42 (base check: $4,728.3M ÷ 1.10453^15 ÷ 30.503M ≈ $34.9). Shares: terminal 34.89 / 65.20 = 53.5%, 46.81 / 88.36 = 53.0%, 10.42 / 14.56 = 71.6%; after FY2031E (21.06 + 34.89) / 65.20 = 85.8%, (27.92 + 46.81) / 88.36 = 84.6%, (5.97 + 10.42) / 14.56 = 112.6%.</w:t>
+        <w:t>C59</w:t>
+      </w:r>
+      <w:r>
+        <w:t xml:space="preserve"> 65.20 / 9.25 − 1 = 604.9%; 88.36 / 9.25 − 1 = 855.2%; 14.56 / 9.25 − 1 = 57.4%. Price from Finagle's baseline data (Yahoo previous close, Oct 23, 2026).</w:t>
       </w:r>
     </w:p>
     <w:p>
@@ -34811,10 +34811,10 @@
         <w:rPr>
           <w:b/>
         </w:rPr>
-        <w:t>C61</w:t>
-      </w:r>
-      <w:r>
-        <w:t xml:space="preserve"> Sensitivities: Finagle reruns of each case (D77) with re ±1 pt, mc ±0.10, gsnext ±5 pts and roict 20% / 30%, one at a time; SBC path rebuilt from each rerun's EBITDA; terminal growth unchanged.</w:t>
+        <w:t>C60</w:t>
+      </w:r>
+      <w:r>
+        <w:t xml:space="preserve"> PV split (D77, sensitivity_v11.py): per-share FCFE each year discounted at re to FY2025A; explicit FY2026E–31E = base $7.74 / bull $12.12 / bear −$3.34; fade FY2032E–40E = $21.06 / $27.92 / $5.97; opening cash $45.9M ÷ 30.503M = $1.51; terminal = value − explicit − fade − cash = $34.89 / $46.81 / $10.42 (base check: $4,728.3M ÷ 1.10453^15 ÷ 30.503M ≈ $34.9). Shares: terminal 34.89 / 65.20 = 53.5%, 46.81 / 88.36 = 53.0%, 10.42 / 14.56 = 71.6%; after FY2031E (21.06 + 34.89) / 65.20 = 85.8%, (27.92 + 46.81) / 88.36 = 84.6%, (5.97 + 10.42) / 14.56 = 112.6%.</w:t>
       </w:r>
     </w:p>
     <w:p>
@@ -34825,10 +34825,10 @@
         <w:rPr>
           <w:b/>
         </w:rPr>
-        <w:t>C62</w:t>
-      </w:r>
-      <w:r>
-        <w:t xml:space="preserve"> Dilution estimate (P3): 65.20 × 0.90 = 58.68; 88.36 × 0.90 = 79.52; 14.56 × 0.90 = 13.10; vs. $9.25: +534.4%, +759.7%, +41.6%.</w:t>
+        <w:t>C61</w:t>
+      </w:r>
+      <w:r>
+        <w:t xml:space="preserve"> Sensitivities: Finagle reruns of each case (D77) with re ±1 pt, mc ±0.10, gsnext ±5 pts and roict 20% / 30%, one at a time; SBC path rebuilt from each rerun's EBITDA; terminal growth unchanged.</w:t>
       </w:r>
     </w:p>
     <w:p>
@@ -34839,10 +34839,10 @@
         <w:rPr>
           <w:b/>
         </w:rPr>
-        <w:t>C63</w:t>
-      </w:r>
-      <w:r>
-        <w:t xml:space="preserve"> Cost of debt: 8.25% minimum coupon + ≈0.7% (2% issue discount and costs spread over the term) + ≈0.25% (revenue participation 0.375% + 0.15% of net revenue up to $50M from 2027) ≈ 9.2% (D2; P3). Reported effective rate 11.3% at June 30, 2026 (D2) not used, to avoid double counting.</w:t>
+        <w:t>C62</w:t>
+      </w:r>
+      <w:r>
+        <w:t xml:space="preserve"> Dilution estimate (P3): 65.20 × 0.90 = 58.68; 88.36 × 0.90 = 79.52; 14.56 × 0.90 = 13.10; vs. $9.25: +534.4%, +759.7%, +41.6%.</w:t>
       </w:r>
     </w:p>
     <w:p>
@@ -34853,10 +34853,10 @@
         <w:rPr>
           <w:b/>
         </w:rPr>
-        <w:t>C64</w:t>
-      </w:r>
-      <w:r>
-        <w:t xml:space="preserve"> Return evidence (roic_evidence.md): EBITDA negative in every year FY2015A–25A, so historical returns are undefined; capex 0.1%–3% of revenue; revenue added per $ of capex 12.5–34. Forecast capex is about 10% of revenue. David's 25% (P3) is within the 20%–50%+ range this supports on physical capital.</w:t>
+        <w:t>C63</w:t>
+      </w:r>
+      <w:r>
+        <w:t xml:space="preserve"> Cost of debt: 8.25% minimum coupon + ≈0.7% (2% issue discount and costs spread over the term) + ≈0.25% (revenue participation 0.375% + 0.15% of net revenue up to $50M from 2027) ≈ 9.2% (D2; P3). Reported effective rate 11.3% at June 30, 2026 (D2) not used, to avoid double counting.</w:t>
       </w:r>
     </w:p>
     <w:p>
@@ -34867,10 +34867,10 @@
         <w:rPr>
           <w:b/>
         </w:rPr>
-        <w:t>C65</w:t>
-      </w:r>
-      <w:r>
-        <w:t xml:space="preserve"> Growth path = consecutive Finagle revenue (D77); me = FY2031E EBITDA ÷ revenue: base 170.8 / 410.4 = 41.6%, bull 44.8%, bear 14.3%.</w:t>
+        <w:t>C64</w:t>
+      </w:r>
+      <w:r>
+        <w:t xml:space="preserve"> Return evidence (roic_evidence.md): EBITDA negative in every year FY2015A–25A, so historical returns are undefined; capex 0.1%–3% of revenue; revenue added per $ of capex 12.5–34. Forecast capex is about 10% of revenue. David's 25% (P3) is within the 20%–50%+ range this supports on physical capital.</w:t>
       </w:r>
     </w:p>
     <w:p>
@@ -34881,10 +34881,10 @@
         <w:rPr>
           <w:b/>
         </w:rPr>
-        <w:t>C30</w:t>
-      </w:r>
-      <w:r>
-        <w:t xml:space="preserve"> Finagle template table: Finagle's annual output for each case, laid out row for row as in Finagle's standard company template.</w:t>
+        <w:t>C65</w:t>
+      </w:r>
+      <w:r>
+        <w:t xml:space="preserve"> Growth path = consecutive Finagle revenue (D77); me = FY2031E EBITDA ÷ revenue: base 170.8 / 410.4 = 41.6%, bull 44.8%, bear 14.3%.</w:t>
       </w:r>
     </w:p>
     <w:p>

</xml_diff>